<commit_message>
Modificación de la documentación e instalacion de la libreria spaCy
</commit_message>
<xml_diff>
--- a/docs/Chatbot para DianSistemas.docx
+++ b/docs/Chatbot para DianSistemas.docx
@@ -7,19 +7,15 @@
         <w:pStyle w:val="Ttulo"/>
         <w:jc w:val="center"/>
       </w:pPr>
-      <w:proofErr w:type="spellStart"/>
-      <w:r>
-        <w:t>Chatbot</w:t>
-      </w:r>
-      <w:proofErr w:type="spellEnd"/>
-      <w:r>
-        <w:t xml:space="preserve"> para </w:t>
-      </w:r>
-      <w:proofErr w:type="spellStart"/>
-      <w:r>
-        <w:t>DianSistemas</w:t>
-      </w:r>
-      <w:proofErr w:type="spellEnd"/>
+      <w:r>
+        <w:t>Chatbot para Dian</w:t>
+      </w:r>
+      <w:r>
+        <w:t xml:space="preserve"> </w:t>
+      </w:r>
+      <w:r>
+        <w:t>Sistemas</w:t>
+      </w:r>
     </w:p>
     <w:p>
       <w:pPr>
@@ -93,7 +89,7 @@
           <w:r>
             <w:fldChar w:fldCharType="separate"/>
           </w:r>
-          <w:hyperlink w:anchor="_Toc239850821" w:history="1">
+          <w:hyperlink w:anchor="_Toc239851392" w:history="1">
             <w:r>
               <w:rPr>
                 <w:rStyle w:val="Hipervnculo"/>
@@ -120,7 +116,7 @@
                 <w:noProof/>
                 <w:webHidden/>
               </w:rPr>
-              <w:instrText xml:space="preserve"> PAGEREF _Toc239850821 \h </w:instrText>
+              <w:instrText xml:space="preserve"> PAGEREF _Toc239851392 \h </w:instrText>
             </w:r>
             <w:r>
               <w:rPr>
@@ -163,7 +159,7 @@
               <w:lang w:eastAsia="es-ES"/>
             </w:rPr>
           </w:pPr>
-          <w:hyperlink w:anchor="_Toc239850822" w:history="1">
+          <w:hyperlink w:anchor="_Toc239851393" w:history="1">
             <w:r>
               <w:rPr>
                 <w:rStyle w:val="Hipervnculo"/>
@@ -190,7 +186,7 @@
                 <w:noProof/>
                 <w:webHidden/>
               </w:rPr>
-              <w:instrText xml:space="preserve"> PAGEREF _Toc239850822 \h </w:instrText>
+              <w:instrText xml:space="preserve"> PAGEREF _Toc239851393 \h </w:instrText>
             </w:r>
             <w:r>
               <w:rPr>
@@ -233,7 +229,7 @@
               <w:lang w:eastAsia="es-ES"/>
             </w:rPr>
           </w:pPr>
-          <w:hyperlink w:anchor="_Toc239850823" w:history="1">
+          <w:hyperlink w:anchor="_Toc239851394" w:history="1">
             <w:r>
               <w:rPr>
                 <w:rStyle w:val="Hipervnculo"/>
@@ -260,7 +256,7 @@
                 <w:noProof/>
                 <w:webHidden/>
               </w:rPr>
-              <w:instrText xml:space="preserve"> PAGEREF _Toc239850823 \h </w:instrText>
+              <w:instrText xml:space="preserve"> PAGEREF _Toc239851394 \h </w:instrText>
             </w:r>
             <w:r>
               <w:rPr>
@@ -303,7 +299,7 @@
               <w:lang w:eastAsia="es-ES"/>
             </w:rPr>
           </w:pPr>
-          <w:hyperlink w:anchor="_Toc239850824" w:history="1">
+          <w:hyperlink w:anchor="_Toc239851395" w:history="1">
             <w:r>
               <w:rPr>
                 <w:rStyle w:val="Hipervnculo"/>
@@ -330,7 +326,7 @@
                 <w:noProof/>
                 <w:webHidden/>
               </w:rPr>
-              <w:instrText xml:space="preserve"> PAGEREF _Toc239850824 \h </w:instrText>
+              <w:instrText xml:space="preserve"> PAGEREF _Toc239851395 \h </w:instrText>
             </w:r>
             <w:r>
               <w:rPr>
@@ -373,7 +369,7 @@
               <w:lang w:eastAsia="es-ES"/>
             </w:rPr>
           </w:pPr>
-          <w:hyperlink w:anchor="_Toc239850825" w:history="1">
+          <w:hyperlink w:anchor="_Toc239851396" w:history="1">
             <w:r>
               <w:rPr>
                 <w:rStyle w:val="Hipervnculo"/>
@@ -400,7 +396,7 @@
                 <w:noProof/>
                 <w:webHidden/>
               </w:rPr>
-              <w:instrText xml:space="preserve"> PAGEREF _Toc239850825 \h </w:instrText>
+              <w:instrText xml:space="preserve"> PAGEREF _Toc239851396 \h </w:instrText>
             </w:r>
             <w:r>
               <w:rPr>
@@ -443,7 +439,7 @@
               <w:lang w:eastAsia="es-ES"/>
             </w:rPr>
           </w:pPr>
-          <w:hyperlink w:anchor="_Toc239850826" w:history="1">
+          <w:hyperlink w:anchor="_Toc239851397" w:history="1">
             <w:r>
               <w:rPr>
                 <w:rStyle w:val="Hipervnculo"/>
@@ -470,7 +466,7 @@
                 <w:noProof/>
                 <w:webHidden/>
               </w:rPr>
-              <w:instrText xml:space="preserve"> PAGEREF _Toc239850826 \h </w:instrText>
+              <w:instrText xml:space="preserve"> PAGEREF _Toc239851397 \h </w:instrText>
             </w:r>
             <w:r>
               <w:rPr>
@@ -513,7 +509,7 @@
               <w:lang w:eastAsia="es-ES"/>
             </w:rPr>
           </w:pPr>
-          <w:hyperlink w:anchor="_Toc239850827" w:history="1">
+          <w:hyperlink w:anchor="_Toc239851398" w:history="1">
             <w:r>
               <w:rPr>
                 <w:rStyle w:val="Hipervnculo"/>
@@ -540,7 +536,7 @@
                 <w:noProof/>
                 <w:webHidden/>
               </w:rPr>
-              <w:instrText xml:space="preserve"> PAGEREF _Toc239850827 \h </w:instrText>
+              <w:instrText xml:space="preserve"> PAGEREF _Toc239851398 \h </w:instrText>
             </w:r>
             <w:r>
               <w:rPr>
@@ -583,7 +579,7 @@
               <w:lang w:eastAsia="es-ES"/>
             </w:rPr>
           </w:pPr>
-          <w:hyperlink w:anchor="_Toc239850828" w:history="1">
+          <w:hyperlink w:anchor="_Toc239851399" w:history="1">
             <w:r>
               <w:rPr>
                 <w:rStyle w:val="Hipervnculo"/>
@@ -610,7 +606,7 @@
                 <w:noProof/>
                 <w:webHidden/>
               </w:rPr>
-              <w:instrText xml:space="preserve"> PAGEREF _Toc239850828 \h </w:instrText>
+              <w:instrText xml:space="preserve"> PAGEREF _Toc239851399 \h </w:instrText>
             </w:r>
             <w:r>
               <w:rPr>
@@ -653,7 +649,7 @@
               <w:lang w:eastAsia="es-ES"/>
             </w:rPr>
           </w:pPr>
-          <w:hyperlink w:anchor="_Toc239850829" w:history="1">
+          <w:hyperlink w:anchor="_Toc239851400" w:history="1">
             <w:r>
               <w:rPr>
                 <w:rStyle w:val="Hipervnculo"/>
@@ -680,7 +676,7 @@
                 <w:noProof/>
                 <w:webHidden/>
               </w:rPr>
-              <w:instrText xml:space="preserve"> PAGEREF _Toc239850829 \h </w:instrText>
+              <w:instrText xml:space="preserve"> PAGEREF _Toc239851400 \h </w:instrText>
             </w:r>
             <w:r>
               <w:rPr>
@@ -723,7 +719,7 @@
               <w:lang w:eastAsia="es-ES"/>
             </w:rPr>
           </w:pPr>
-          <w:hyperlink w:anchor="_Toc239850830" w:history="1">
+          <w:hyperlink w:anchor="_Toc239851401" w:history="1">
             <w:r>
               <w:rPr>
                 <w:rStyle w:val="Hipervnculo"/>
@@ -750,7 +746,7 @@
                 <w:noProof/>
                 <w:webHidden/>
               </w:rPr>
-              <w:instrText xml:space="preserve"> PAGEREF _Toc239850830 \h </w:instrText>
+              <w:instrText xml:space="preserve"> PAGEREF _Toc239851401 \h </w:instrText>
             </w:r>
             <w:r>
               <w:rPr>
@@ -793,13 +789,13 @@
               <w:lang w:eastAsia="es-ES"/>
             </w:rPr>
           </w:pPr>
-          <w:hyperlink w:anchor="_Toc239850831" w:history="1">
+          <w:hyperlink w:anchor="_Toc239851402" w:history="1">
             <w:r>
               <w:rPr>
                 <w:rStyle w:val="Hipervnculo"/>
                 <w:noProof/>
               </w:rPr>
-              <w:t>Próximos pasos posibles</w:t>
+              <w:t>Línea de tiempo</w:t>
             </w:r>
             <w:r>
               <w:rPr>
@@ -820,7 +816,7 @@
                 <w:noProof/>
                 <w:webHidden/>
               </w:rPr>
-              <w:instrText xml:space="preserve"> PAGEREF _Toc239850831 \h </w:instrText>
+              <w:instrText xml:space="preserve"> PAGEREF _Toc239851402 \h </w:instrText>
             </w:r>
             <w:r>
               <w:rPr>
@@ -840,7 +836,7 @@
                 <w:noProof/>
                 <w:webHidden/>
               </w:rPr>
-              <w:t>3</w:t>
+              <w:t>4</w:t>
             </w:r>
             <w:r>
               <w:rPr>
@@ -863,12 +859,82 @@
               <w:lang w:eastAsia="es-ES"/>
             </w:rPr>
           </w:pPr>
-          <w:hyperlink w:anchor="_Toc239850832" w:history="1">
+          <w:hyperlink w:anchor="_Toc239851403" w:history="1">
             <w:r>
               <w:rPr>
                 <w:rStyle w:val="Hipervnculo"/>
                 <w:noProof/>
               </w:rPr>
+              <w:t>Próximos pasos posibles</w:t>
+            </w:r>
+            <w:r>
+              <w:rPr>
+                <w:noProof/>
+                <w:webHidden/>
+              </w:rPr>
+              <w:tab/>
+            </w:r>
+            <w:r>
+              <w:rPr>
+                <w:noProof/>
+                <w:webHidden/>
+              </w:rPr>
+              <w:fldChar w:fldCharType="begin"/>
+            </w:r>
+            <w:r>
+              <w:rPr>
+                <w:noProof/>
+                <w:webHidden/>
+              </w:rPr>
+              <w:instrText xml:space="preserve"> PAGEREF _Toc239851403 \h </w:instrText>
+            </w:r>
+            <w:r>
+              <w:rPr>
+                <w:noProof/>
+                <w:webHidden/>
+              </w:rPr>
+            </w:r>
+            <w:r>
+              <w:rPr>
+                <w:noProof/>
+                <w:webHidden/>
+              </w:rPr>
+              <w:fldChar w:fldCharType="separate"/>
+            </w:r>
+            <w:r>
+              <w:rPr>
+                <w:noProof/>
+                <w:webHidden/>
+              </w:rPr>
+              <w:t>4</w:t>
+            </w:r>
+            <w:r>
+              <w:rPr>
+                <w:noProof/>
+                <w:webHidden/>
+              </w:rPr>
+              <w:fldChar w:fldCharType="end"/>
+            </w:r>
+          </w:hyperlink>
+        </w:p>
+        <w:p>
+          <w:pPr>
+            <w:pStyle w:val="TDC1"/>
+            <w:tabs>
+              <w:tab w:val="right" w:leader="dot" w:pos="8494"/>
+            </w:tabs>
+            <w:rPr>
+              <w:rFonts w:eastAsiaTheme="minorEastAsia"/>
+              <w:noProof/>
+              <w:lang w:eastAsia="es-ES"/>
+            </w:rPr>
+          </w:pPr>
+          <w:hyperlink w:anchor="_Toc239851404" w:history="1">
+            <w:r>
+              <w:rPr>
+                <w:rStyle w:val="Hipervnculo"/>
+                <w:noProof/>
+              </w:rPr>
               <w:t>Glosario</w:t>
             </w:r>
             <w:r>
@@ -890,7 +956,7 @@
                 <w:noProof/>
                 <w:webHidden/>
               </w:rPr>
-              <w:instrText xml:space="preserve"> PAGEREF _Toc239850832 \h </w:instrText>
+              <w:instrText xml:space="preserve"> PAGEREF _Toc239851404 \h </w:instrText>
             </w:r>
             <w:r>
               <w:rPr>
@@ -953,7 +1019,7 @@
       <w:pPr>
         <w:pStyle w:val="Ttulo1"/>
       </w:pPr>
-      <w:bookmarkStart w:id="0" w:name="_Toc239850821"/>
+      <w:bookmarkStart w:id="0" w:name="_Toc239851392"/>
       <w:r>
         <w:lastRenderedPageBreak/>
         <w:t>Descripción general</w:t>
@@ -969,7 +1035,7 @@
       <w:pPr>
         <w:pStyle w:val="Ttulo1"/>
       </w:pPr>
-      <w:bookmarkStart w:id="1" w:name="_Toc239850822"/>
+      <w:bookmarkStart w:id="1" w:name="_Toc239851393"/>
       <w:r>
         <w:t>Objetivos básicos</w:t>
       </w:r>
@@ -1029,7 +1095,7 @@
       <w:pPr>
         <w:pStyle w:val="Ttulo1"/>
       </w:pPr>
-      <w:bookmarkStart w:id="2" w:name="_Toc239850823"/>
+      <w:bookmarkStart w:id="2" w:name="_Toc239851394"/>
       <w:r>
         <w:t>Tecnologías</w:t>
       </w:r>
@@ -1039,7 +1105,7 @@
       <w:pPr>
         <w:pStyle w:val="Ttulo2"/>
       </w:pPr>
-      <w:bookmarkStart w:id="3" w:name="_Toc239850824"/>
+      <w:bookmarkStart w:id="3" w:name="_Toc239851395"/>
       <w:r>
         <w:t>Python</w:t>
       </w:r>
@@ -1054,7 +1120,7 @@
       <w:pPr>
         <w:pStyle w:val="Ttulo2"/>
       </w:pPr>
-      <w:bookmarkStart w:id="4" w:name="_Toc239850825"/>
+      <w:bookmarkStart w:id="4" w:name="_Toc239851396"/>
       <w:r>
         <w:t>Django</w:t>
       </w:r>
@@ -1069,7 +1135,7 @@
       <w:pPr>
         <w:pStyle w:val="Ttulo2"/>
       </w:pPr>
-      <w:bookmarkStart w:id="5" w:name="_Toc239850826"/>
+      <w:bookmarkStart w:id="5" w:name="_Toc239851397"/>
       <w:r>
         <w:t>Bootstrap5</w:t>
       </w:r>
@@ -1087,7 +1153,7 @@
       <w:pPr>
         <w:pStyle w:val="Ttulo2"/>
       </w:pPr>
-      <w:bookmarkStart w:id="6" w:name="_Toc239850827"/>
+      <w:bookmarkStart w:id="6" w:name="_Toc239851398"/>
       <w:proofErr w:type="spellStart"/>
       <w:r>
         <w:t>spaCy</w:t>
@@ -1103,22 +1169,14 @@
         <w:t xml:space="preserve"> NLP para</w:t>
       </w:r>
       <w:r>
-        <w:t xml:space="preserve"> el </w:t>
-      </w:r>
-      <w:proofErr w:type="spellStart"/>
-      <w:r>
-        <w:t>chatbot</w:t>
-      </w:r>
-      <w:proofErr w:type="spellEnd"/>
-      <w:r>
-        <w:t>.</w:t>
+        <w:t xml:space="preserve"> el chatbot.</w:t>
       </w:r>
     </w:p>
     <w:p>
       <w:pPr>
         <w:pStyle w:val="Ttulo1"/>
       </w:pPr>
-      <w:bookmarkStart w:id="7" w:name="_Toc239850828"/>
+      <w:bookmarkStart w:id="7" w:name="_Toc239851399"/>
       <w:r>
         <w:t>Almacenaje de datos</w:t>
       </w:r>
@@ -1133,7 +1191,7 @@
       <w:pPr>
         <w:pStyle w:val="Ttulo1"/>
       </w:pPr>
-      <w:bookmarkStart w:id="8" w:name="_Toc239850829"/>
+      <w:bookmarkStart w:id="8" w:name="_Toc239851400"/>
       <w:r>
         <w:t>Arquitectura general</w:t>
       </w:r>
@@ -1193,7 +1251,7 @@
       <w:pPr>
         <w:pStyle w:val="Ttulo1"/>
       </w:pPr>
-      <w:bookmarkStart w:id="9" w:name="_Toc239850830"/>
+      <w:bookmarkStart w:id="9" w:name="_Toc239851401"/>
       <w:r>
         <w:t xml:space="preserve">Clasificación de mensajes con </w:t>
       </w:r>
@@ -1234,12 +1292,18 @@
       </w:r>
     </w:p>
     <w:p>
+      <w:r>
+        <w:br w:type="page"/>
+      </w:r>
+    </w:p>
+    <w:p>
       <w:pPr>
         <w:pStyle w:val="Ttulo1"/>
       </w:pPr>
-      <w:bookmarkStart w:id="10" w:name="_Toc239850831"/>
-      <w:r>
-        <w:t>Próximos pasos posibles</w:t>
+      <w:bookmarkStart w:id="10" w:name="_Toc239851402"/>
+      <w:r>
+        <w:lastRenderedPageBreak/>
+        <w:t>Línea de tiempo</w:t>
       </w:r>
       <w:bookmarkEnd w:id="10"/>
     </w:p>
@@ -1252,7 +1316,7 @@
         </w:numPr>
       </w:pPr>
       <w:r>
-        <w:t>Migración a otro tipo de base de datos</w:t>
+        <w:t>Iframe y configuración básica del proyecto</w:t>
       </w:r>
     </w:p>
     <w:p>
@@ -1264,7 +1328,7 @@
         </w:numPr>
       </w:pPr>
       <w:r>
-        <w:t>Automatización de detección de servicios ofrecidos por Dian Sistemas</w:t>
+        <w:t>Inicializar el chatbot (Introducción de la librería y etiquetas necesarias.)</w:t>
       </w:r>
     </w:p>
     <w:p>
@@ -1276,7 +1340,7 @@
         </w:numPr>
       </w:pPr>
       <w:r>
-        <w:t>Añadir decoradores de mail para notificaciones con la marca de la empresa.</w:t>
+        <w:t>Sistema de resumen del chat</w:t>
       </w:r>
     </w:p>
     <w:p>
@@ -1288,7 +1352,76 @@
         </w:numPr>
       </w:pPr>
       <w:r>
-        <w:lastRenderedPageBreak/>
+        <w:t>Almacenamiento y optimización del chatbot.</w:t>
+      </w:r>
+    </w:p>
+    <w:p>
+      <w:pPr>
+        <w:pStyle w:val="Prrafodelista"/>
+        <w:numPr>
+          <w:ilvl w:val="0"/>
+          <w:numId w:val="2"/>
+        </w:numPr>
+      </w:pPr>
+      <w:r>
+        <w:t>Configuración para mensajería automática.</w:t>
+      </w:r>
+    </w:p>
+    <w:p>
+      <w:pPr>
+        <w:pStyle w:val="Ttulo1"/>
+      </w:pPr>
+      <w:bookmarkStart w:id="11" w:name="_Toc239851403"/>
+      <w:r>
+        <w:t>Próximos pasos posibles</w:t>
+      </w:r>
+      <w:bookmarkEnd w:id="11"/>
+    </w:p>
+    <w:p>
+      <w:pPr>
+        <w:pStyle w:val="Prrafodelista"/>
+        <w:numPr>
+          <w:ilvl w:val="0"/>
+          <w:numId w:val="2"/>
+        </w:numPr>
+      </w:pPr>
+      <w:r>
+        <w:t>Migración a otro tipo de base de datos</w:t>
+      </w:r>
+    </w:p>
+    <w:p>
+      <w:pPr>
+        <w:pStyle w:val="Prrafodelista"/>
+        <w:numPr>
+          <w:ilvl w:val="0"/>
+          <w:numId w:val="2"/>
+        </w:numPr>
+      </w:pPr>
+      <w:r>
+        <w:t>Automatización de detección de servicios ofrecidos por Dian Sistemas</w:t>
+      </w:r>
+    </w:p>
+    <w:p>
+      <w:pPr>
+        <w:pStyle w:val="Prrafodelista"/>
+        <w:numPr>
+          <w:ilvl w:val="0"/>
+          <w:numId w:val="2"/>
+        </w:numPr>
+      </w:pPr>
+      <w:r>
+        <w:t>Añadir decoradores de mail para notificaciones con la marca de la empresa.</w:t>
+      </w:r>
+    </w:p>
+    <w:p>
+      <w:pPr>
+        <w:pStyle w:val="Prrafodelista"/>
+        <w:numPr>
+          <w:ilvl w:val="0"/>
+          <w:numId w:val="2"/>
+        </w:numPr>
+      </w:pPr>
+      <w:r>
         <w:t>Métricas en el panel de administración.</w:t>
       </w:r>
     </w:p>
@@ -1296,11 +1429,11 @@
       <w:pPr>
         <w:pStyle w:val="Ttulo1"/>
       </w:pPr>
-      <w:bookmarkStart w:id="11" w:name="_Toc239850832"/>
+      <w:bookmarkStart w:id="12" w:name="_Toc239851404"/>
       <w:r>
         <w:t>Glosario</w:t>
       </w:r>
-      <w:bookmarkEnd w:id="11"/>
+      <w:bookmarkEnd w:id="12"/>
     </w:p>
     <w:sectPr>
       <w:footerReference w:type="default" r:id="rId9"/>

</xml_diff>

<commit_message>
Cambios realizados en la documentación
</commit_message>
<xml_diff>
--- a/docs/Chatbot para DianSistemas.docx
+++ b/docs/Chatbot para DianSistemas.docx
@@ -20,16 +20,29 @@
     <w:p>
       <w:pPr>
         <w:pStyle w:val="Subttulo"/>
+        <w:spacing w:after="0"/>
         <w:jc w:val="center"/>
       </w:pPr>
       <w:r>
         <w:t>Documento de diseño</w:t>
       </w:r>
+      <w:r>
+        <w:t xml:space="preserve"> </w:t>
+      </w:r>
+    </w:p>
+    <w:p>
+      <w:pPr>
+        <w:pStyle w:val="Subttulo"/>
+        <w:spacing w:after="0"/>
+        <w:jc w:val="center"/>
+      </w:pPr>
+      <w:r>
+        <w:t>Realizado por Víctor Herrero y Adrián Salas</w:t>
+      </w:r>
     </w:p>
     <w:p>
       <w:pPr>
         <w:rPr>
-          <w:rFonts w:eastAsiaTheme="minorEastAsia"/>
           <w:color w:val="5A5A5A" w:themeColor="text1" w:themeTint="A5"/>
           <w:spacing w:val="15"/>
         </w:rPr>
@@ -41,11 +54,8 @@
     <w:sdt>
       <w:sdtPr>
         <w:rPr>
-          <w:rFonts w:asciiTheme="minorHAnsi" w:eastAsiaTheme="minorHAnsi" w:hAnsiTheme="minorHAnsi" w:cstheme="minorBidi"/>
+          <w:rFonts w:eastAsiaTheme="minorHAnsi"/>
           <w:color w:val="auto"/>
-          <w:sz w:val="22"/>
-          <w:szCs w:val="22"/>
-          <w:lang w:eastAsia="en-US"/>
         </w:rPr>
         <w:id w:val="-127783546"/>
         <w:docPartObj>
@@ -55,8 +65,13 @@
       </w:sdtPr>
       <w:sdtEndPr>
         <w:rPr>
+          <w:rFonts w:eastAsiaTheme="minorEastAsia"/>
           <w:b/>
           <w:bCs/>
+          <w:caps w:val="0"/>
+          <w:spacing w:val="0"/>
+          <w:sz w:val="20"/>
+          <w:szCs w:val="20"/>
         </w:rPr>
       </w:sdtEndPr>
       <w:sdtContent>
@@ -75,8 +90,9 @@
               <w:tab w:val="right" w:leader="dot" w:pos="8494"/>
             </w:tabs>
             <w:rPr>
-              <w:rFonts w:eastAsiaTheme="minorEastAsia"/>
               <w:noProof/>
+              <w:sz w:val="22"/>
+              <w:szCs w:val="22"/>
               <w:lang w:eastAsia="es-ES"/>
             </w:rPr>
           </w:pPr>
@@ -89,7 +105,7 @@
           <w:r>
             <w:fldChar w:fldCharType="separate"/>
           </w:r>
-          <w:hyperlink w:anchor="_Toc239851392" w:history="1">
+          <w:hyperlink w:anchor="_Toc239929622" w:history="1">
             <w:r>
               <w:rPr>
                 <w:rStyle w:val="Hipervnculo"/>
@@ -116,7 +132,7 @@
                 <w:noProof/>
                 <w:webHidden/>
               </w:rPr>
-              <w:instrText xml:space="preserve"> PAGEREF _Toc239851392 \h </w:instrText>
+              <w:instrText xml:space="preserve"> PAGEREF _Toc239929622 \h </w:instrText>
             </w:r>
             <w:r>
               <w:rPr>
@@ -154,12 +170,13 @@
               <w:tab w:val="right" w:leader="dot" w:pos="8494"/>
             </w:tabs>
             <w:rPr>
-              <w:rFonts w:eastAsiaTheme="minorEastAsia"/>
               <w:noProof/>
+              <w:sz w:val="22"/>
+              <w:szCs w:val="22"/>
               <w:lang w:eastAsia="es-ES"/>
             </w:rPr>
           </w:pPr>
-          <w:hyperlink w:anchor="_Toc239851393" w:history="1">
+          <w:hyperlink w:anchor="_Toc239929623" w:history="1">
             <w:r>
               <w:rPr>
                 <w:rStyle w:val="Hipervnculo"/>
@@ -186,7 +203,7 @@
                 <w:noProof/>
                 <w:webHidden/>
               </w:rPr>
-              <w:instrText xml:space="preserve"> PAGEREF _Toc239851393 \h </w:instrText>
+              <w:instrText xml:space="preserve"> PAGEREF _Toc239929623 \h </w:instrText>
             </w:r>
             <w:r>
               <w:rPr>
@@ -224,12 +241,13 @@
               <w:tab w:val="right" w:leader="dot" w:pos="8494"/>
             </w:tabs>
             <w:rPr>
-              <w:rFonts w:eastAsiaTheme="minorEastAsia"/>
               <w:noProof/>
+              <w:sz w:val="22"/>
+              <w:szCs w:val="22"/>
               <w:lang w:eastAsia="es-ES"/>
             </w:rPr>
           </w:pPr>
-          <w:hyperlink w:anchor="_Toc239851394" w:history="1">
+          <w:hyperlink w:anchor="_Toc239929624" w:history="1">
             <w:r>
               <w:rPr>
                 <w:rStyle w:val="Hipervnculo"/>
@@ -256,7 +274,7 @@
                 <w:noProof/>
                 <w:webHidden/>
               </w:rPr>
-              <w:instrText xml:space="preserve"> PAGEREF _Toc239851394 \h </w:instrText>
+              <w:instrText xml:space="preserve"> PAGEREF _Toc239929624 \h </w:instrText>
             </w:r>
             <w:r>
               <w:rPr>
@@ -294,12 +312,13 @@
               <w:tab w:val="right" w:leader="dot" w:pos="8494"/>
             </w:tabs>
             <w:rPr>
-              <w:rFonts w:eastAsiaTheme="minorEastAsia"/>
               <w:noProof/>
+              <w:sz w:val="22"/>
+              <w:szCs w:val="22"/>
               <w:lang w:eastAsia="es-ES"/>
             </w:rPr>
           </w:pPr>
-          <w:hyperlink w:anchor="_Toc239851395" w:history="1">
+          <w:hyperlink w:anchor="_Toc239929625" w:history="1">
             <w:r>
               <w:rPr>
                 <w:rStyle w:val="Hipervnculo"/>
@@ -326,7 +345,7 @@
                 <w:noProof/>
                 <w:webHidden/>
               </w:rPr>
-              <w:instrText xml:space="preserve"> PAGEREF _Toc239851395 \h </w:instrText>
+              <w:instrText xml:space="preserve"> PAGEREF _Toc239929625 \h </w:instrText>
             </w:r>
             <w:r>
               <w:rPr>
@@ -364,12 +383,13 @@
               <w:tab w:val="right" w:leader="dot" w:pos="8494"/>
             </w:tabs>
             <w:rPr>
-              <w:rFonts w:eastAsiaTheme="minorEastAsia"/>
               <w:noProof/>
+              <w:sz w:val="22"/>
+              <w:szCs w:val="22"/>
               <w:lang w:eastAsia="es-ES"/>
             </w:rPr>
           </w:pPr>
-          <w:hyperlink w:anchor="_Toc239851396" w:history="1">
+          <w:hyperlink w:anchor="_Toc239929626" w:history="1">
             <w:r>
               <w:rPr>
                 <w:rStyle w:val="Hipervnculo"/>
@@ -396,7 +416,7 @@
                 <w:noProof/>
                 <w:webHidden/>
               </w:rPr>
-              <w:instrText xml:space="preserve"> PAGEREF _Toc239851396 \h </w:instrText>
+              <w:instrText xml:space="preserve"> PAGEREF _Toc239929626 \h </w:instrText>
             </w:r>
             <w:r>
               <w:rPr>
@@ -434,12 +454,13 @@
               <w:tab w:val="right" w:leader="dot" w:pos="8494"/>
             </w:tabs>
             <w:rPr>
-              <w:rFonts w:eastAsiaTheme="minorEastAsia"/>
               <w:noProof/>
+              <w:sz w:val="22"/>
+              <w:szCs w:val="22"/>
               <w:lang w:eastAsia="es-ES"/>
             </w:rPr>
           </w:pPr>
-          <w:hyperlink w:anchor="_Toc239851397" w:history="1">
+          <w:hyperlink w:anchor="_Toc239929627" w:history="1">
             <w:r>
               <w:rPr>
                 <w:rStyle w:val="Hipervnculo"/>
@@ -466,7 +487,7 @@
                 <w:noProof/>
                 <w:webHidden/>
               </w:rPr>
-              <w:instrText xml:space="preserve"> PAGEREF _Toc239851397 \h </w:instrText>
+              <w:instrText xml:space="preserve"> PAGEREF _Toc239929627 \h </w:instrText>
             </w:r>
             <w:r>
               <w:rPr>
@@ -504,12 +525,13 @@
               <w:tab w:val="right" w:leader="dot" w:pos="8494"/>
             </w:tabs>
             <w:rPr>
-              <w:rFonts w:eastAsiaTheme="minorEastAsia"/>
               <w:noProof/>
+              <w:sz w:val="22"/>
+              <w:szCs w:val="22"/>
               <w:lang w:eastAsia="es-ES"/>
             </w:rPr>
           </w:pPr>
-          <w:hyperlink w:anchor="_Toc239851398" w:history="1">
+          <w:hyperlink w:anchor="_Toc239929628" w:history="1">
             <w:r>
               <w:rPr>
                 <w:rStyle w:val="Hipervnculo"/>
@@ -536,7 +558,7 @@
                 <w:noProof/>
                 <w:webHidden/>
               </w:rPr>
-              <w:instrText xml:space="preserve"> PAGEREF _Toc239851398 \h </w:instrText>
+              <w:instrText xml:space="preserve"> PAGEREF _Toc239929628 \h </w:instrText>
             </w:r>
             <w:r>
               <w:rPr>
@@ -556,7 +578,7 @@
                 <w:noProof/>
                 <w:webHidden/>
               </w:rPr>
-              <w:t>3</w:t>
+              <w:t>4</w:t>
             </w:r>
             <w:r>
               <w:rPr>
@@ -574,12 +596,13 @@
               <w:tab w:val="right" w:leader="dot" w:pos="8494"/>
             </w:tabs>
             <w:rPr>
-              <w:rFonts w:eastAsiaTheme="minorEastAsia"/>
               <w:noProof/>
+              <w:sz w:val="22"/>
+              <w:szCs w:val="22"/>
               <w:lang w:eastAsia="es-ES"/>
             </w:rPr>
           </w:pPr>
-          <w:hyperlink w:anchor="_Toc239851399" w:history="1">
+          <w:hyperlink w:anchor="_Toc239929629" w:history="1">
             <w:r>
               <w:rPr>
                 <w:rStyle w:val="Hipervnculo"/>
@@ -606,7 +629,7 @@
                 <w:noProof/>
                 <w:webHidden/>
               </w:rPr>
-              <w:instrText xml:space="preserve"> PAGEREF _Toc239851399 \h </w:instrText>
+              <w:instrText xml:space="preserve"> PAGEREF _Toc239929629 \h </w:instrText>
             </w:r>
             <w:r>
               <w:rPr>
@@ -626,7 +649,7 @@
                 <w:noProof/>
                 <w:webHidden/>
               </w:rPr>
-              <w:t>3</w:t>
+              <w:t>4</w:t>
             </w:r>
             <w:r>
               <w:rPr>
@@ -644,12 +667,13 @@
               <w:tab w:val="right" w:leader="dot" w:pos="8494"/>
             </w:tabs>
             <w:rPr>
-              <w:rFonts w:eastAsiaTheme="minorEastAsia"/>
               <w:noProof/>
+              <w:sz w:val="22"/>
+              <w:szCs w:val="22"/>
               <w:lang w:eastAsia="es-ES"/>
             </w:rPr>
           </w:pPr>
-          <w:hyperlink w:anchor="_Toc239851400" w:history="1">
+          <w:hyperlink w:anchor="_Toc239929630" w:history="1">
             <w:r>
               <w:rPr>
                 <w:rStyle w:val="Hipervnculo"/>
@@ -676,7 +700,7 @@
                 <w:noProof/>
                 <w:webHidden/>
               </w:rPr>
-              <w:instrText xml:space="preserve"> PAGEREF _Toc239851400 \h </w:instrText>
+              <w:instrText xml:space="preserve"> PAGEREF _Toc239929630 \h </w:instrText>
             </w:r>
             <w:r>
               <w:rPr>
@@ -696,7 +720,7 @@
                 <w:noProof/>
                 <w:webHidden/>
               </w:rPr>
-              <w:t>3</w:t>
+              <w:t>4</w:t>
             </w:r>
             <w:r>
               <w:rPr>
@@ -714,18 +738,19 @@
               <w:tab w:val="right" w:leader="dot" w:pos="8494"/>
             </w:tabs>
             <w:rPr>
-              <w:rFonts w:eastAsiaTheme="minorEastAsia"/>
               <w:noProof/>
+              <w:sz w:val="22"/>
+              <w:szCs w:val="22"/>
               <w:lang w:eastAsia="es-ES"/>
             </w:rPr>
           </w:pPr>
-          <w:hyperlink w:anchor="_Toc239851401" w:history="1">
+          <w:hyperlink w:anchor="_Toc239929631" w:history="1">
             <w:r>
               <w:rPr>
                 <w:rStyle w:val="Hipervnculo"/>
                 <w:noProof/>
               </w:rPr>
-              <w:t>Clasificación de mensajes con spaCy</w:t>
+              <w:t>Aplicaciones del proyecto</w:t>
             </w:r>
             <w:r>
               <w:rPr>
@@ -746,7 +771,7 @@
                 <w:noProof/>
                 <w:webHidden/>
               </w:rPr>
-              <w:instrText xml:space="preserve"> PAGEREF _Toc239851401 \h </w:instrText>
+              <w:instrText xml:space="preserve"> PAGEREF _Toc239929631 \h </w:instrText>
             </w:r>
             <w:r>
               <w:rPr>
@@ -766,7 +791,291 @@
                 <w:noProof/>
                 <w:webHidden/>
               </w:rPr>
-              <w:t>3</w:t>
+              <w:t>5</w:t>
+            </w:r>
+            <w:r>
+              <w:rPr>
+                <w:noProof/>
+                <w:webHidden/>
+              </w:rPr>
+              <w:fldChar w:fldCharType="end"/>
+            </w:r>
+          </w:hyperlink>
+        </w:p>
+        <w:p>
+          <w:pPr>
+            <w:pStyle w:val="TDC2"/>
+            <w:tabs>
+              <w:tab w:val="right" w:leader="dot" w:pos="8494"/>
+            </w:tabs>
+            <w:rPr>
+              <w:noProof/>
+              <w:sz w:val="22"/>
+              <w:szCs w:val="22"/>
+              <w:lang w:eastAsia="es-ES"/>
+            </w:rPr>
+          </w:pPr>
+          <w:hyperlink w:anchor="_Toc239929632" w:history="1">
+            <w:r>
+              <w:rPr>
+                <w:rStyle w:val="Hipervnculo"/>
+                <w:noProof/>
+              </w:rPr>
+              <w:t>Core</w:t>
+            </w:r>
+            <w:r>
+              <w:rPr>
+                <w:noProof/>
+                <w:webHidden/>
+              </w:rPr>
+              <w:tab/>
+            </w:r>
+            <w:r>
+              <w:rPr>
+                <w:noProof/>
+                <w:webHidden/>
+              </w:rPr>
+              <w:fldChar w:fldCharType="begin"/>
+            </w:r>
+            <w:r>
+              <w:rPr>
+                <w:noProof/>
+                <w:webHidden/>
+              </w:rPr>
+              <w:instrText xml:space="preserve"> PAGEREF _Toc239929632 \h </w:instrText>
+            </w:r>
+            <w:r>
+              <w:rPr>
+                <w:noProof/>
+                <w:webHidden/>
+              </w:rPr>
+            </w:r>
+            <w:r>
+              <w:rPr>
+                <w:noProof/>
+                <w:webHidden/>
+              </w:rPr>
+              <w:fldChar w:fldCharType="separate"/>
+            </w:r>
+            <w:r>
+              <w:rPr>
+                <w:noProof/>
+                <w:webHidden/>
+              </w:rPr>
+              <w:t>5</w:t>
+            </w:r>
+            <w:r>
+              <w:rPr>
+                <w:noProof/>
+                <w:webHidden/>
+              </w:rPr>
+              <w:fldChar w:fldCharType="end"/>
+            </w:r>
+          </w:hyperlink>
+        </w:p>
+        <w:p>
+          <w:pPr>
+            <w:pStyle w:val="TDC2"/>
+            <w:tabs>
+              <w:tab w:val="right" w:leader="dot" w:pos="8494"/>
+            </w:tabs>
+            <w:rPr>
+              <w:noProof/>
+              <w:sz w:val="22"/>
+              <w:szCs w:val="22"/>
+              <w:lang w:eastAsia="es-ES"/>
+            </w:rPr>
+          </w:pPr>
+          <w:hyperlink w:anchor="_Toc239929633" w:history="1">
+            <w:r>
+              <w:rPr>
+                <w:rStyle w:val="Hipervnculo"/>
+                <w:noProof/>
+              </w:rPr>
+              <w:t>Chat</w:t>
+            </w:r>
+            <w:r>
+              <w:rPr>
+                <w:noProof/>
+                <w:webHidden/>
+              </w:rPr>
+              <w:tab/>
+            </w:r>
+            <w:r>
+              <w:rPr>
+                <w:noProof/>
+                <w:webHidden/>
+              </w:rPr>
+              <w:fldChar w:fldCharType="begin"/>
+            </w:r>
+            <w:r>
+              <w:rPr>
+                <w:noProof/>
+                <w:webHidden/>
+              </w:rPr>
+              <w:instrText xml:space="preserve"> PAGEREF _Toc239929633 \h </w:instrText>
+            </w:r>
+            <w:r>
+              <w:rPr>
+                <w:noProof/>
+                <w:webHidden/>
+              </w:rPr>
+            </w:r>
+            <w:r>
+              <w:rPr>
+                <w:noProof/>
+                <w:webHidden/>
+              </w:rPr>
+              <w:fldChar w:fldCharType="separate"/>
+            </w:r>
+            <w:r>
+              <w:rPr>
+                <w:noProof/>
+                <w:webHidden/>
+              </w:rPr>
+              <w:t>5</w:t>
+            </w:r>
+            <w:r>
+              <w:rPr>
+                <w:noProof/>
+                <w:webHidden/>
+              </w:rPr>
+              <w:fldChar w:fldCharType="end"/>
+            </w:r>
+          </w:hyperlink>
+        </w:p>
+        <w:p>
+          <w:pPr>
+            <w:pStyle w:val="TDC2"/>
+            <w:tabs>
+              <w:tab w:val="right" w:leader="dot" w:pos="8494"/>
+            </w:tabs>
+            <w:rPr>
+              <w:noProof/>
+              <w:sz w:val="22"/>
+              <w:szCs w:val="22"/>
+              <w:lang w:eastAsia="es-ES"/>
+            </w:rPr>
+          </w:pPr>
+          <w:hyperlink w:anchor="_Toc239929634" w:history="1">
+            <w:r>
+              <w:rPr>
+                <w:rStyle w:val="Hipervnculo"/>
+                <w:noProof/>
+              </w:rPr>
+              <w:t>Entrenamiento</w:t>
+            </w:r>
+            <w:r>
+              <w:rPr>
+                <w:noProof/>
+                <w:webHidden/>
+              </w:rPr>
+              <w:tab/>
+            </w:r>
+            <w:r>
+              <w:rPr>
+                <w:noProof/>
+                <w:webHidden/>
+              </w:rPr>
+              <w:fldChar w:fldCharType="begin"/>
+            </w:r>
+            <w:r>
+              <w:rPr>
+                <w:noProof/>
+                <w:webHidden/>
+              </w:rPr>
+              <w:instrText xml:space="preserve"> PAGEREF _Toc239929634 \h </w:instrText>
+            </w:r>
+            <w:r>
+              <w:rPr>
+                <w:noProof/>
+                <w:webHidden/>
+              </w:rPr>
+            </w:r>
+            <w:r>
+              <w:rPr>
+                <w:noProof/>
+                <w:webHidden/>
+              </w:rPr>
+              <w:fldChar w:fldCharType="separate"/>
+            </w:r>
+            <w:r>
+              <w:rPr>
+                <w:noProof/>
+                <w:webHidden/>
+              </w:rPr>
+              <w:t>5</w:t>
+            </w:r>
+            <w:r>
+              <w:rPr>
+                <w:noProof/>
+                <w:webHidden/>
+              </w:rPr>
+              <w:fldChar w:fldCharType="end"/>
+            </w:r>
+          </w:hyperlink>
+        </w:p>
+        <w:p>
+          <w:pPr>
+            <w:pStyle w:val="TDC2"/>
+            <w:tabs>
+              <w:tab w:val="right" w:leader="dot" w:pos="8494"/>
+            </w:tabs>
+            <w:rPr>
+              <w:noProof/>
+              <w:sz w:val="22"/>
+              <w:szCs w:val="22"/>
+              <w:lang w:eastAsia="es-ES"/>
+            </w:rPr>
+          </w:pPr>
+          <w:hyperlink w:anchor="_Toc239929635" w:history="1">
+            <w:r>
+              <w:rPr>
+                <w:rStyle w:val="Hipervnculo"/>
+                <w:noProof/>
+              </w:rPr>
+              <w:t>Notificaciones</w:t>
+            </w:r>
+            <w:r>
+              <w:rPr>
+                <w:noProof/>
+                <w:webHidden/>
+              </w:rPr>
+              <w:tab/>
+            </w:r>
+            <w:r>
+              <w:rPr>
+                <w:noProof/>
+                <w:webHidden/>
+              </w:rPr>
+              <w:fldChar w:fldCharType="begin"/>
+            </w:r>
+            <w:r>
+              <w:rPr>
+                <w:noProof/>
+                <w:webHidden/>
+              </w:rPr>
+              <w:instrText xml:space="preserve"> PAGEREF _Toc239929635 \h </w:instrText>
+            </w:r>
+            <w:r>
+              <w:rPr>
+                <w:noProof/>
+                <w:webHidden/>
+              </w:rPr>
+            </w:r>
+            <w:r>
+              <w:rPr>
+                <w:noProof/>
+                <w:webHidden/>
+              </w:rPr>
+              <w:fldChar w:fldCharType="separate"/>
+            </w:r>
+            <w:r>
+              <w:rPr>
+                <w:noProof/>
+                <w:webHidden/>
+              </w:rPr>
+              <w:t>5</w:t>
             </w:r>
             <w:r>
               <w:rPr>
@@ -784,18 +1093,19 @@
               <w:tab w:val="right" w:leader="dot" w:pos="8494"/>
             </w:tabs>
             <w:rPr>
-              <w:rFonts w:eastAsiaTheme="minorEastAsia"/>
               <w:noProof/>
+              <w:sz w:val="22"/>
+              <w:szCs w:val="22"/>
               <w:lang w:eastAsia="es-ES"/>
             </w:rPr>
           </w:pPr>
-          <w:hyperlink w:anchor="_Toc239851402" w:history="1">
+          <w:hyperlink w:anchor="_Toc239929636" w:history="1">
             <w:r>
               <w:rPr>
                 <w:rStyle w:val="Hipervnculo"/>
                 <w:noProof/>
               </w:rPr>
-              <w:t>Línea de tiempo</w:t>
+              <w:t>Clasificación de mensajes con spaCy</w:t>
             </w:r>
             <w:r>
               <w:rPr>
@@ -816,7 +1126,7 @@
                 <w:noProof/>
                 <w:webHidden/>
               </w:rPr>
-              <w:instrText xml:space="preserve"> PAGEREF _Toc239851402 \h </w:instrText>
+              <w:instrText xml:space="preserve"> PAGEREF _Toc239929636 \h </w:instrText>
             </w:r>
             <w:r>
               <w:rPr>
@@ -836,7 +1146,7 @@
                 <w:noProof/>
                 <w:webHidden/>
               </w:rPr>
-              <w:t>4</w:t>
+              <w:t>5</w:t>
             </w:r>
             <w:r>
               <w:rPr>
@@ -854,18 +1164,19 @@
               <w:tab w:val="right" w:leader="dot" w:pos="8494"/>
             </w:tabs>
             <w:rPr>
-              <w:rFonts w:eastAsiaTheme="minorEastAsia"/>
               <w:noProof/>
+              <w:sz w:val="22"/>
+              <w:szCs w:val="22"/>
               <w:lang w:eastAsia="es-ES"/>
             </w:rPr>
           </w:pPr>
-          <w:hyperlink w:anchor="_Toc239851403" w:history="1">
+          <w:hyperlink w:anchor="_Toc239929637" w:history="1">
             <w:r>
               <w:rPr>
                 <w:rStyle w:val="Hipervnculo"/>
                 <w:noProof/>
               </w:rPr>
-              <w:t>Próximos pasos posibles</w:t>
+              <w:t>Línea de tiempo</w:t>
             </w:r>
             <w:r>
               <w:rPr>
@@ -886,7 +1197,7 @@
                 <w:noProof/>
                 <w:webHidden/>
               </w:rPr>
-              <w:instrText xml:space="preserve"> PAGEREF _Toc239851403 \h </w:instrText>
+              <w:instrText xml:space="preserve"> PAGEREF _Toc239929637 \h </w:instrText>
             </w:r>
             <w:r>
               <w:rPr>
@@ -906,7 +1217,7 @@
                 <w:noProof/>
                 <w:webHidden/>
               </w:rPr>
-              <w:t>4</w:t>
+              <w:t>5</w:t>
             </w:r>
             <w:r>
               <w:rPr>
@@ -924,17 +1235,89 @@
               <w:tab w:val="right" w:leader="dot" w:pos="8494"/>
             </w:tabs>
             <w:rPr>
-              <w:rFonts w:eastAsiaTheme="minorEastAsia"/>
               <w:noProof/>
+              <w:sz w:val="22"/>
+              <w:szCs w:val="22"/>
               <w:lang w:eastAsia="es-ES"/>
             </w:rPr>
           </w:pPr>
-          <w:hyperlink w:anchor="_Toc239851404" w:history="1">
+          <w:hyperlink w:anchor="_Toc239929638" w:history="1">
             <w:r>
               <w:rPr>
                 <w:rStyle w:val="Hipervnculo"/>
                 <w:noProof/>
               </w:rPr>
+              <w:t>Próximos pasos posibles</w:t>
+            </w:r>
+            <w:r>
+              <w:rPr>
+                <w:noProof/>
+                <w:webHidden/>
+              </w:rPr>
+              <w:tab/>
+            </w:r>
+            <w:r>
+              <w:rPr>
+                <w:noProof/>
+                <w:webHidden/>
+              </w:rPr>
+              <w:fldChar w:fldCharType="begin"/>
+            </w:r>
+            <w:r>
+              <w:rPr>
+                <w:noProof/>
+                <w:webHidden/>
+              </w:rPr>
+              <w:instrText xml:space="preserve"> PAGEREF _Toc239929638 \h </w:instrText>
+            </w:r>
+            <w:r>
+              <w:rPr>
+                <w:noProof/>
+                <w:webHidden/>
+              </w:rPr>
+            </w:r>
+            <w:r>
+              <w:rPr>
+                <w:noProof/>
+                <w:webHidden/>
+              </w:rPr>
+              <w:fldChar w:fldCharType="separate"/>
+            </w:r>
+            <w:r>
+              <w:rPr>
+                <w:noProof/>
+                <w:webHidden/>
+              </w:rPr>
+              <w:t>6</w:t>
+            </w:r>
+            <w:r>
+              <w:rPr>
+                <w:noProof/>
+                <w:webHidden/>
+              </w:rPr>
+              <w:fldChar w:fldCharType="end"/>
+            </w:r>
+          </w:hyperlink>
+        </w:p>
+        <w:p>
+          <w:pPr>
+            <w:pStyle w:val="TDC1"/>
+            <w:tabs>
+              <w:tab w:val="right" w:leader="dot" w:pos="8494"/>
+            </w:tabs>
+            <w:rPr>
+              <w:noProof/>
+              <w:sz w:val="22"/>
+              <w:szCs w:val="22"/>
+              <w:lang w:eastAsia="es-ES"/>
+            </w:rPr>
+          </w:pPr>
+          <w:hyperlink w:anchor="_Toc239929639" w:history="1">
+            <w:r>
+              <w:rPr>
+                <w:rStyle w:val="Hipervnculo"/>
+                <w:noProof/>
+              </w:rPr>
               <w:t>Glosario</w:t>
             </w:r>
             <w:r>
@@ -956,7 +1339,7 @@
                 <w:noProof/>
                 <w:webHidden/>
               </w:rPr>
-              <w:instrText xml:space="preserve"> PAGEREF _Toc239851404 \h </w:instrText>
+              <w:instrText xml:space="preserve"> PAGEREF _Toc239929639 \h </w:instrText>
             </w:r>
             <w:r>
               <w:rPr>
@@ -976,7 +1359,7 @@
                 <w:noProof/>
                 <w:webHidden/>
               </w:rPr>
-              <w:t>4</w:t>
+              <w:t>6</w:t>
             </w:r>
             <w:r>
               <w:rPr>
@@ -1006,7 +1389,6 @@
     <w:p>
       <w:pPr>
         <w:rPr>
-          <w:rFonts w:eastAsiaTheme="minorEastAsia"/>
           <w:color w:val="5A5A5A" w:themeColor="text1" w:themeTint="A5"/>
           <w:spacing w:val="15"/>
         </w:rPr>
@@ -1019,7 +1401,7 @@
       <w:pPr>
         <w:pStyle w:val="Ttulo1"/>
       </w:pPr>
-      <w:bookmarkStart w:id="0" w:name="_Toc239851392"/>
+      <w:bookmarkStart w:id="0" w:name="_Toc239929622"/>
       <w:r>
         <w:lastRenderedPageBreak/>
         <w:t>Descripción general</w:t>
@@ -1027,32 +1409,34 @@
       <w:bookmarkEnd w:id="0"/>
     </w:p>
     <w:p>
-      <w:r>
-        <w:t>Este proyecto es una aplicación web en Django que implementa un chatbot en forma de widget reutilizable.</w:t>
+      <w:pPr>
+        <w:spacing w:after="160"/>
+      </w:pPr>
+      <w:r>
+        <w:t>Este proyecto es una aplicación web construida con Django que implementa un chatbot en forma de widget reutilizable. El objetivo es que Dian Sistemas pueda incrustarlo en su propia página web mediante un iframe, de forma que sus visitantes puedan resolver dudas y ser derivados al departamento adecuado sin salir de la web corporativa.</w:t>
+      </w:r>
+    </w:p>
+    <w:p>
+      <w:r>
+        <w:t>El widget aparece como un botón flotante en la esquina inferior derecha de la página; al pulsarlo, se despliega con una animación la ventana de conversación. Todo el procesamiento del lenguaje, el almacenamiento de la conversación y el envío de notificaciones ocurre en nuestro servidor Django, de forma transparente para la web del cliente.</w:t>
       </w:r>
     </w:p>
     <w:p>
       <w:pPr>
         <w:pStyle w:val="Ttulo1"/>
       </w:pPr>
-      <w:bookmarkStart w:id="1" w:name="_Toc239851393"/>
+      <w:bookmarkStart w:id="1" w:name="_Toc239929623"/>
       <w:r>
         <w:t>Objetivos básicos</w:t>
       </w:r>
       <w:bookmarkEnd w:id="1"/>
     </w:p>
     <w:p>
-      <w:r>
-        <w:t xml:space="preserve">Crear un widget reutilizable para que se pueda incrustar sobre la página de </w:t>
-      </w:r>
-      <w:r>
-        <w:t>Dian Sistemas</w:t>
-      </w:r>
-      <w:r>
-        <w:t>.</w:t>
-      </w:r>
-      <w:r>
-        <w:t xml:space="preserve"> Este chatbot debe de ser capaz de:</w:t>
+      <w:pPr>
+        <w:spacing w:after="160"/>
+      </w:pPr>
+      <w:r>
+        <w:t>Crear un widget reutilizable para que se pueda incrustar sobre la página de Dian Sistemas. Este chatbot debe ser capaz de:</w:t>
       </w:r>
     </w:p>
     <w:p>
@@ -1060,11 +1444,13 @@
         <w:pStyle w:val="Prrafodelista"/>
         <w:numPr>
           <w:ilvl w:val="0"/>
-          <w:numId w:val="2"/>
+          <w:numId w:val="3"/>
         </w:numPr>
-      </w:pPr>
-      <w:r>
-        <w:t>Mantener una conversación con el cliente.</w:t>
+        <w:spacing w:after="100" w:line="240" w:lineRule="auto"/>
+        <w:contextualSpacing w:val="0"/>
+      </w:pPr>
+      <w:r>
+        <w:t>Mantener una conversación con el cliente, entendiendo preguntas formuladas en lenguaje natural.</w:t>
       </w:r>
     </w:p>
     <w:p>
@@ -1072,11 +1458,13 @@
         <w:pStyle w:val="Prrafodelista"/>
         <w:numPr>
           <w:ilvl w:val="0"/>
-          <w:numId w:val="2"/>
+          <w:numId w:val="3"/>
         </w:numPr>
-      </w:pPr>
-      <w:r>
-        <w:t>Clasificar la conversación como consulta técnica o compra.</w:t>
+        <w:spacing w:after="100" w:line="240" w:lineRule="auto"/>
+        <w:contextualSpacing w:val="0"/>
+      </w:pPr>
+      <w:r>
+        <w:t>Clasificar la conversación como consulta técnica o compra, para poder priorizarla y enrutarla correctamente.</w:t>
       </w:r>
     </w:p>
     <w:p>
@@ -1084,18 +1472,20 @@
         <w:pStyle w:val="Prrafodelista"/>
         <w:numPr>
           <w:ilvl w:val="0"/>
-          <w:numId w:val="2"/>
+          <w:numId w:val="3"/>
         </w:numPr>
-      </w:pPr>
-      <w:r>
-        <w:t>Generar un resumen del chat para mandar al departamento correspondiente.</w:t>
+        <w:spacing w:after="100" w:line="240" w:lineRule="auto"/>
+        <w:contextualSpacing w:val="0"/>
+      </w:pPr>
+      <w:r>
+        <w:t>Generar un resumen del chat para mandarlo al departamento correspondiente, evitando que el equipo tenga que leer la conversación completa.</w:t>
       </w:r>
     </w:p>
     <w:p>
       <w:pPr>
         <w:pStyle w:val="Ttulo1"/>
       </w:pPr>
-      <w:bookmarkStart w:id="2" w:name="_Toc239851394"/>
+      <w:bookmarkStart w:id="2" w:name="_Toc239929624"/>
       <w:r>
         <w:t>Tecnologías</w:t>
       </w:r>
@@ -1104,98 +1494,149 @@
     <w:p>
       <w:pPr>
         <w:pStyle w:val="Ttulo2"/>
-      </w:pPr>
-      <w:bookmarkStart w:id="3" w:name="_Toc239851395"/>
+        <w:spacing w:before="180" w:after="100"/>
+      </w:pPr>
+      <w:bookmarkStart w:id="3" w:name="_Toc239927601"/>
+      <w:bookmarkStart w:id="4" w:name="_Toc239929625"/>
       <w:r>
         <w:t>Python</w:t>
       </w:r>
       <w:bookmarkEnd w:id="3"/>
-    </w:p>
-    <w:p>
-      <w:r>
-        <w:t>Lenguaje de programación utilizado para este proyecto.</w:t>
+      <w:bookmarkEnd w:id="4"/>
+    </w:p>
+    <w:p>
+      <w:pPr>
+        <w:spacing w:after="160"/>
+        <w:rPr>
+          <w:u w:val="single"/>
+        </w:rPr>
+      </w:pPr>
+      <w:r>
+        <w:t xml:space="preserve">Lenguaje de programación utilizado como base de todo el proyecto. Se ha elegido por su sintaxis legible, por ser el lenguaje nativo tanto de Django </w:t>
+      </w:r>
+      <w:r>
+        <w:t>como de spaCy.</w:t>
       </w:r>
     </w:p>
     <w:p>
       <w:pPr>
         <w:pStyle w:val="Ttulo2"/>
-      </w:pPr>
-      <w:bookmarkStart w:id="4" w:name="_Toc239851396"/>
+        <w:spacing w:before="180" w:after="100"/>
+      </w:pPr>
+      <w:bookmarkStart w:id="5" w:name="_Toc239927602"/>
+      <w:bookmarkStart w:id="6" w:name="_Toc239929626"/>
       <w:r>
         <w:t>Django</w:t>
       </w:r>
-      <w:bookmarkEnd w:id="4"/>
-    </w:p>
-    <w:p>
-      <w:r>
-        <w:t>Framework utilizado en el proyecto.</w:t>
+      <w:bookmarkEnd w:id="5"/>
+      <w:bookmarkEnd w:id="6"/>
+    </w:p>
+    <w:p>
+      <w:pPr>
+        <w:spacing w:after="160"/>
+      </w:pPr>
+      <w:r>
+        <w:t>Framework web de alto nivel escrito en Python, utilizado como base del backend del proyecto. Sigue el patrón Modelo-Vista-Plantilla (MVT), que separa la gestión de datos (modelos), la lógica de negocio (vistas) y la generación del HTML (plantillas).</w:t>
       </w:r>
     </w:p>
     <w:p>
       <w:pPr>
         <w:pStyle w:val="Ttulo2"/>
-      </w:pPr>
-      <w:bookmarkStart w:id="5" w:name="_Toc239851397"/>
+        <w:spacing w:before="180" w:after="100"/>
+      </w:pPr>
+      <w:bookmarkStart w:id="7" w:name="_Toc239927603"/>
+      <w:bookmarkStart w:id="8" w:name="_Toc239929627"/>
       <w:r>
         <w:t>Bootstrap5</w:t>
       </w:r>
-      <w:bookmarkEnd w:id="5"/>
-    </w:p>
-    <w:p>
-      <w:r>
-        <w:t xml:space="preserve">Tecnología que usamos para la </w:t>
-      </w:r>
-      <w:r>
-        <w:t>maquetación web.</w:t>
+      <w:bookmarkEnd w:id="7"/>
+      <w:bookmarkEnd w:id="8"/>
+    </w:p>
+    <w:p>
+      <w:pPr>
+        <w:spacing w:after="160"/>
+      </w:pPr>
+      <w:r>
+        <w:t>Framework CSS utilizado para la maquetación del widget y de las vistas de administración internas.</w:t>
+      </w:r>
+    </w:p>
+    <w:p>
+      <w:pPr>
+        <w:spacing w:after="160"/>
+      </w:pPr>
+      <w:r>
+        <w:t>En este proyecto interesa especialmente porque permite montar rápidamente componentes como el botón flotante, la ventana de chat, los formularios y las burbujas de mensaje con un aspecto responsive y cuidado sin escribir CSS desde cero.</w:t>
+      </w:r>
+    </w:p>
+    <w:p>
+      <w:r>
+        <w:br w:type="page"/>
       </w:r>
     </w:p>
     <w:p>
       <w:pPr>
         <w:pStyle w:val="Ttulo2"/>
-      </w:pPr>
-      <w:bookmarkStart w:id="6" w:name="_Toc239851398"/>
-      <w:proofErr w:type="spellStart"/>
-      <w:r>
+        <w:spacing w:before="180" w:after="100"/>
+      </w:pPr>
+      <w:bookmarkStart w:id="9" w:name="_Toc239927604"/>
+      <w:bookmarkStart w:id="10" w:name="_Toc239929628"/>
+      <w:r>
+        <w:lastRenderedPageBreak/>
         <w:t>spaCy</w:t>
       </w:r>
-      <w:bookmarkEnd w:id="6"/>
-      <w:proofErr w:type="spellEnd"/>
-    </w:p>
-    <w:p>
-      <w:r>
-        <w:t>Librería</w:t>
-      </w:r>
-      <w:r>
-        <w:t xml:space="preserve"> NLP para</w:t>
-      </w:r>
-      <w:r>
-        <w:t xml:space="preserve"> el chatbot.</w:t>
+      <w:bookmarkEnd w:id="9"/>
+      <w:bookmarkEnd w:id="10"/>
+    </w:p>
+    <w:p>
+      <w:pPr>
+        <w:spacing w:after="160"/>
+      </w:pPr>
+      <w:r>
+        <w:t>Librería de procesamiento de lenguaje natural (NLP) en Python, orientada a un uso en producción más que a la investigación. Procesa el texto mediante un pipeline de componentes encadenados (tokenizador, etiquetador gramatical, reconocedor de entidades, clasificador de texto, etc.) y admite modelos preentrenados para varios idiomas, incluido el español.</w:t>
+      </w:r>
+    </w:p>
+    <w:p>
+      <w:r>
+        <w:t>En el chatbot se usan principalmente dos capacidades de spaCy: el componente de clasificación de texto (textcat), para decidir si un mensaje corresponde a una consulta técnica o a una compra, y el reconocimiento de entidades (NER), para detectar en el mensaje elementos relevantes como el nombre de un servicio o producto.</w:t>
       </w:r>
     </w:p>
     <w:p>
       <w:pPr>
         <w:pStyle w:val="Ttulo1"/>
       </w:pPr>
-      <w:bookmarkStart w:id="7" w:name="_Toc239851399"/>
+      <w:bookmarkStart w:id="11" w:name="_Toc239929629"/>
       <w:r>
         <w:t>Almacenaje de datos</w:t>
       </w:r>
-      <w:bookmarkEnd w:id="7"/>
-    </w:p>
-    <w:p>
-      <w:r>
-        <w:t>De momento vamos a utilizar la base de datos por defecto de Django (SQLite)</w:t>
+      <w:bookmarkEnd w:id="11"/>
+    </w:p>
+    <w:p>
+      <w:pPr>
+        <w:spacing w:after="160"/>
+      </w:pPr>
+      <w:r>
+        <w:t>De momento vamos a utilizar la base de datos por defecto de Django (SQLite). Se trata de un motor ligero, basado en un único fichero, que no requiere levantar un servidor de base de datos aparte, lo que la hace muy cómoda durante el desarrollo y las primeras pruebas del widget.</w:t>
+      </w:r>
+    </w:p>
+    <w:p>
+      <w:pPr>
+        <w:rPr>
+          <w:u w:val="single"/>
+        </w:rPr>
+      </w:pPr>
+      <w:r>
+        <w:t>SQLite tiene limitaciones de concurrencia que la hacen poco recomendable para un entorno de producción con varias conversaciones simultáneas, por lo que, como ya se recoge en el apartado de próximos pasos, está prevista una migración a un motor como PostgreSQL antes del despliegue definitivo, apoyándose en el sistema de migraciones de Django para no perder los datos ya almacenados.</w:t>
       </w:r>
     </w:p>
     <w:p>
       <w:pPr>
         <w:pStyle w:val="Ttulo1"/>
       </w:pPr>
-      <w:bookmarkStart w:id="8" w:name="_Toc239851400"/>
+      <w:bookmarkStart w:id="12" w:name="_Toc239929630"/>
       <w:r>
         <w:t>Arquitectura general</w:t>
       </w:r>
-      <w:bookmarkEnd w:id="8"/>
+      <w:bookmarkEnd w:id="12"/>
     </w:p>
     <w:p/>
     <w:p>
@@ -1246,25 +1687,130 @@
         </w:drawing>
       </w:r>
     </w:p>
-    <w:p/>
+    <w:p>
+      <w:r>
+        <w:t>El diagrama resume el flujo de una conversación: el usuario interactúa con el widget incrustado mediante el iframe en la web de Dian Sistemas; las peticiones llegan al backend Django, donde la app Core gestiona la lógica del widget y delega en la app Entrenamiento el procesamiento del mensaje con spaCy; el resultado (intención detectada y respuesta) se guarda a través de la app Chat, y cuando corresponde, la app Notificaciones genera el resumen y lo envía al departamento adecuado.</w:t>
+      </w:r>
+    </w:p>
+    <w:p>
+      <w:r>
+        <w:br w:type="page"/>
+      </w:r>
+    </w:p>
     <w:p>
       <w:pPr>
         <w:pStyle w:val="Ttulo1"/>
       </w:pPr>
-      <w:bookmarkStart w:id="9" w:name="_Toc239851401"/>
-      <w:r>
-        <w:t xml:space="preserve">Clasificación de mensajes con </w:t>
-      </w:r>
-      <w:proofErr w:type="spellStart"/>
-      <w:r>
-        <w:t>spaCy</w:t>
-      </w:r>
-      <w:bookmarkEnd w:id="9"/>
-      <w:proofErr w:type="spellEnd"/>
-    </w:p>
-    <w:p>
-      <w:r>
-        <w:t>Dos categorías principales:</w:t>
+      <w:bookmarkStart w:id="13" w:name="_Toc239929631"/>
+      <w:r>
+        <w:lastRenderedPageBreak/>
+        <w:t>Aplicaciones del proyecto</w:t>
+      </w:r>
+      <w:bookmarkEnd w:id="13"/>
+    </w:p>
+    <w:p>
+      <w:pPr>
+        <w:pStyle w:val="Ttulo2"/>
+        <w:spacing w:before="180" w:after="100"/>
+      </w:pPr>
+      <w:bookmarkStart w:id="14" w:name="_Toc239927608"/>
+      <w:bookmarkStart w:id="15" w:name="_Toc239929632"/>
+      <w:r>
+        <w:t>Core</w:t>
+      </w:r>
+      <w:bookmarkEnd w:id="14"/>
+      <w:bookmarkEnd w:id="15"/>
+    </w:p>
+    <w:p>
+      <w:pPr>
+        <w:spacing w:after="160"/>
+      </w:pPr>
+      <w:r>
+        <w:t>Aplicación donde está ubicada la parte visual del chatbot y la lógica del widget: la vista que se sirve dentro del iframe, el botón flotante, la animación de apertura y cierre, y la configuración de qué dominios pueden incrustar el widget.</w:t>
+      </w:r>
+    </w:p>
+    <w:p>
+      <w:pPr>
+        <w:pStyle w:val="Ttulo2"/>
+        <w:spacing w:before="180" w:after="100"/>
+      </w:pPr>
+      <w:bookmarkStart w:id="16" w:name="_Toc239927609"/>
+      <w:bookmarkStart w:id="17" w:name="_Toc239929633"/>
+      <w:r>
+        <w:t>Chat</w:t>
+      </w:r>
+      <w:bookmarkEnd w:id="16"/>
+      <w:bookmarkEnd w:id="17"/>
+    </w:p>
+    <w:p>
+      <w:pPr>
+        <w:spacing w:after="160"/>
+      </w:pPr>
+      <w:r>
+        <w:t>Aplicación donde se tratan las conversaciones. Contiene los modelos de mensaje y conversación (remitente, contenido, marca de tiempo, conversación a la que pertenece) y las vistas encargadas de recibir cada mensaje nuevo, guardarlo y devolver la respuesta generada.</w:t>
+      </w:r>
+    </w:p>
+    <w:p>
+      <w:pPr>
+        <w:pStyle w:val="Ttulo2"/>
+        <w:spacing w:before="180" w:after="100"/>
+      </w:pPr>
+      <w:bookmarkStart w:id="18" w:name="_Toc239927610"/>
+      <w:bookmarkStart w:id="19" w:name="_Toc239929634"/>
+      <w:r>
+        <w:t>Entrenamiento</w:t>
+      </w:r>
+      <w:bookmarkEnd w:id="18"/>
+      <w:bookmarkEnd w:id="19"/>
+    </w:p>
+    <w:p>
+      <w:pPr>
+        <w:spacing w:after="160"/>
+      </w:pPr>
+      <w:r>
+        <w:t>Contiene los datos y la lógica de entrenamiento para el chatbot: el corpus de frases de ejemplo por intención, la configuración del pipeline de spaCy, los scripts para reentrenar el modelo</w:t>
+      </w:r>
+      <w:r>
+        <w:t xml:space="preserve"> </w:t>
+      </w:r>
+      <w:r>
+        <w:t>cuando se añaden nuevos datos, y el modelo entrenado que usan las demás apps en tiempo real.</w:t>
+      </w:r>
+    </w:p>
+    <w:p>
+      <w:pPr>
+        <w:pStyle w:val="Ttulo2"/>
+        <w:spacing w:before="180" w:after="100"/>
+      </w:pPr>
+      <w:bookmarkStart w:id="20" w:name="_Toc239927611"/>
+      <w:bookmarkStart w:id="21" w:name="_Toc239929635"/>
+      <w:r>
+        <w:t>Notificaciones</w:t>
+      </w:r>
+      <w:bookmarkEnd w:id="20"/>
+      <w:bookmarkEnd w:id="21"/>
+    </w:p>
+    <w:p>
+      <w:r>
+        <w:t>Apartado donde se resume la información de las conversaciones y se gestiona la lógica del envío de notificaciones: genera el resumen del chat cuando se cierra o se deriva una conversación, y lo envía al departamento correspondiente (técnico o comercial) según la clasificación obtenida.</w:t>
+      </w:r>
+    </w:p>
+    <w:p>
+      <w:pPr>
+        <w:pStyle w:val="Ttulo1"/>
+      </w:pPr>
+      <w:bookmarkStart w:id="22" w:name="_Toc239929636"/>
+      <w:r>
+        <w:t>Clasificación de mensajes con spaCy</w:t>
+      </w:r>
+      <w:bookmarkEnd w:id="22"/>
+    </w:p>
+    <w:p>
+      <w:pPr>
+        <w:spacing w:after="160"/>
+      </w:pPr>
+      <w:r>
+        <w:t>Los mensajes se clasifican en dos categorías principales:</w:t>
       </w:r>
     </w:p>
     <w:p>
@@ -1272,8 +1818,10 @@
         <w:pStyle w:val="Prrafodelista"/>
         <w:numPr>
           <w:ilvl w:val="0"/>
-          <w:numId w:val="2"/>
+          <w:numId w:val="3"/>
         </w:numPr>
+        <w:spacing w:after="100" w:line="240" w:lineRule="auto"/>
+        <w:contextualSpacing w:val="0"/>
       </w:pPr>
       <w:r>
         <w:t>Compra</w:t>
@@ -1284,8 +1832,10 @@
         <w:pStyle w:val="Prrafodelista"/>
         <w:numPr>
           <w:ilvl w:val="0"/>
-          <w:numId w:val="2"/>
+          <w:numId w:val="3"/>
         </w:numPr>
+        <w:spacing w:after="100" w:line="240" w:lineRule="auto"/>
+        <w:contextualSpacing w:val="0"/>
       </w:pPr>
       <w:r>
         <w:t>Consulta técnica</w:t>
@@ -1293,30 +1843,39 @@
     </w:p>
     <w:p>
       <w:r>
-        <w:br w:type="page"/>
+        <w:t>Esta clasificación se realiza con el componente textcat del pipeline de spaCy, entrenado con el corpus de la app Entrenamiento. Cada mensaje se evalúa y se le asigna la categoría con mayor probabilidad; cuando la confianza del modelo es baja, la conversación puede marcarse para revisión manual en lugar de clasificarse automáticamente, evitando enrutar mal al cliente. El resultado de la clasificación es el dato principal que usa la app Notificaciones para decidir a qué departamento enviar el resumen de la conversación.</w:t>
       </w:r>
     </w:p>
     <w:p>
       <w:pPr>
         <w:pStyle w:val="Ttulo1"/>
       </w:pPr>
-      <w:bookmarkStart w:id="10" w:name="_Toc239851402"/>
-      <w:r>
-        <w:lastRenderedPageBreak/>
+      <w:bookmarkStart w:id="23" w:name="_Toc239929637"/>
+      <w:r>
         <w:t>Línea de tiempo</w:t>
       </w:r>
-      <w:bookmarkEnd w:id="10"/>
+      <w:bookmarkEnd w:id="23"/>
     </w:p>
     <w:p>
       <w:pPr>
         <w:pStyle w:val="Prrafodelista"/>
         <w:numPr>
           <w:ilvl w:val="0"/>
-          <w:numId w:val="2"/>
+          <w:numId w:val="3"/>
         </w:numPr>
-      </w:pPr>
-      <w:r>
-        <w:t>Iframe y configuración básica del proyecto</w:t>
+        <w:spacing w:after="100" w:line="240" w:lineRule="auto"/>
+        <w:contextualSpacing w:val="0"/>
+      </w:pPr>
+      <w:r>
+        <w:t xml:space="preserve">Iframe y configuración básica del proyecto: estructura del proyecto Django, primera versión del botón flotante y la vista </w:t>
+      </w:r>
+      <w:proofErr w:type="spellStart"/>
+      <w:r>
+        <w:t>incrustable</w:t>
+      </w:r>
+      <w:proofErr w:type="spellEnd"/>
+      <w:r>
+        <w:t>.</w:t>
       </w:r>
     </w:p>
     <w:p>
@@ -1324,11 +1883,13 @@
         <w:pStyle w:val="Prrafodelista"/>
         <w:numPr>
           <w:ilvl w:val="0"/>
-          <w:numId w:val="2"/>
+          <w:numId w:val="3"/>
         </w:numPr>
-      </w:pPr>
-      <w:r>
-        <w:t>Inicializar el chatbot (Introducción de la librería y etiquetas necesarias.)</w:t>
+        <w:spacing w:after="100" w:line="240" w:lineRule="auto"/>
+        <w:contextualSpacing w:val="0"/>
+      </w:pPr>
+      <w:r>
+        <w:t>Inicializar el chatbot (introducción de la librería y etiquetas necesarias): instalación de spaCy, definición inicial de intenciones y entidades.</w:t>
       </w:r>
     </w:p>
     <w:p>
@@ -1336,11 +1897,13 @@
         <w:pStyle w:val="Prrafodelista"/>
         <w:numPr>
           <w:ilvl w:val="0"/>
-          <w:numId w:val="2"/>
+          <w:numId w:val="3"/>
         </w:numPr>
-      </w:pPr>
-      <w:r>
-        <w:t>Sistema de resumen del chat</w:t>
+        <w:spacing w:after="100" w:line="240" w:lineRule="auto"/>
+        <w:contextualSpacing w:val="0"/>
+      </w:pPr>
+      <w:r>
+        <w:t>Sistema de resumen del chat: lógica para condensar una conversación en un resumen legible por el equipo de Dian Sistemas.</w:t>
       </w:r>
     </w:p>
     <w:p>
@@ -1348,11 +1911,13 @@
         <w:pStyle w:val="Prrafodelista"/>
         <w:numPr>
           <w:ilvl w:val="0"/>
-          <w:numId w:val="2"/>
+          <w:numId w:val="3"/>
         </w:numPr>
-      </w:pPr>
-      <w:r>
-        <w:t>Almacenamiento y optimización del chatbot.</w:t>
+        <w:spacing w:after="100" w:line="240" w:lineRule="auto"/>
+        <w:contextualSpacing w:val="0"/>
+      </w:pPr>
+      <w:r>
+        <w:t>Almacenamiento y optimización del chatbot: ajuste de modelos de datos y del rendimiento del pipeline de spaCy.</w:t>
       </w:r>
     </w:p>
     <w:p>
@@ -1360,33 +1925,38 @@
         <w:pStyle w:val="Prrafodelista"/>
         <w:numPr>
           <w:ilvl w:val="0"/>
-          <w:numId w:val="2"/>
+          <w:numId w:val="3"/>
         </w:numPr>
-      </w:pPr>
-      <w:r>
-        <w:t>Configuración para mensajería automática.</w:t>
+        <w:spacing w:after="100" w:line="240" w:lineRule="auto"/>
+        <w:contextualSpacing w:val="0"/>
+      </w:pPr>
+      <w:r>
+        <w:t>Configuración para mensajería automática: envío automático de notificaciones al departamento correspondiente.</w:t>
       </w:r>
     </w:p>
     <w:p>
       <w:pPr>
         <w:pStyle w:val="Ttulo1"/>
       </w:pPr>
-      <w:bookmarkStart w:id="11" w:name="_Toc239851403"/>
-      <w:r>
+      <w:bookmarkStart w:id="24" w:name="_Toc239929638"/>
+      <w:r>
+        <w:lastRenderedPageBreak/>
         <w:t>Próximos pasos posibles</w:t>
       </w:r>
-      <w:bookmarkEnd w:id="11"/>
+      <w:bookmarkEnd w:id="24"/>
     </w:p>
     <w:p>
       <w:pPr>
         <w:pStyle w:val="Prrafodelista"/>
         <w:numPr>
           <w:ilvl w:val="0"/>
-          <w:numId w:val="2"/>
+          <w:numId w:val="3"/>
         </w:numPr>
-      </w:pPr>
-      <w:r>
-        <w:t>Migración a otro tipo de base de datos</w:t>
+        <w:spacing w:after="100" w:line="240" w:lineRule="auto"/>
+        <w:contextualSpacing w:val="0"/>
+      </w:pPr>
+      <w:r>
+        <w:t>Migración a otro tipo de base de datos, sustituyendo SQLite por un motor apto para producción como PostgreSQL.</w:t>
       </w:r>
     </w:p>
     <w:p>
@@ -1394,11 +1964,13 @@
         <w:pStyle w:val="Prrafodelista"/>
         <w:numPr>
           <w:ilvl w:val="0"/>
-          <w:numId w:val="2"/>
+          <w:numId w:val="3"/>
         </w:numPr>
-      </w:pPr>
-      <w:r>
-        <w:t>Automatización de detección de servicios ofrecidos por Dian Sistemas</w:t>
+        <w:spacing w:after="100" w:line="240" w:lineRule="auto"/>
+        <w:contextualSpacing w:val="0"/>
+      </w:pPr>
+      <w:r>
+        <w:t>Automatización de detección de servicios ofrecidos por Dian Sistemas, para mantener actualizado el corpus de entrenamiento sin trabajo manual.</w:t>
       </w:r>
     </w:p>
     <w:p>
@@ -1406,11 +1978,13 @@
         <w:pStyle w:val="Prrafodelista"/>
         <w:numPr>
           <w:ilvl w:val="0"/>
-          <w:numId w:val="2"/>
+          <w:numId w:val="3"/>
         </w:numPr>
-      </w:pPr>
-      <w:r>
-        <w:t>Añadir decoradores de mail para notificaciones con la marca de la empresa.</w:t>
+        <w:spacing w:after="100" w:line="240" w:lineRule="auto"/>
+        <w:contextualSpacing w:val="0"/>
+      </w:pPr>
+      <w:r>
+        <w:t>Añadir decoradores de mail para notificaciones con la marca de la empresa, dando un aspecto corporativo a los avisos enviados.</w:t>
       </w:r>
     </w:p>
     <w:p>
@@ -1418,23 +1992,525 @@
         <w:pStyle w:val="Prrafodelista"/>
         <w:numPr>
           <w:ilvl w:val="0"/>
-          <w:numId w:val="2"/>
+          <w:numId w:val="3"/>
         </w:numPr>
-      </w:pPr>
-      <w:r>
-        <w:t>Métricas en el panel de administración.</w:t>
+        <w:spacing w:after="100" w:line="240" w:lineRule="auto"/>
+        <w:contextualSpacing w:val="0"/>
+      </w:pPr>
+      <w:r>
+        <w:t>Métricas en el panel de administración, para poder ver volumen de conversaciones, tasa de clasificación correcta y tiempos de respuesta.</w:t>
+      </w:r>
+    </w:p>
+    <w:p>
+      <w:pPr>
+        <w:pStyle w:val="Prrafodelista"/>
+        <w:numPr>
+          <w:ilvl w:val="0"/>
+          <w:numId w:val="3"/>
+        </w:numPr>
+        <w:spacing w:after="100" w:line="240" w:lineRule="auto"/>
+        <w:contextualSpacing w:val="0"/>
+      </w:pPr>
+      <w:r>
+        <w:t>Comprobar la legislación pertinente al almacenaje de conversaciones, en particular en materia de protección de datos personales.</w:t>
       </w:r>
     </w:p>
     <w:p>
       <w:pPr>
         <w:pStyle w:val="Ttulo1"/>
       </w:pPr>
-      <w:bookmarkStart w:id="12" w:name="_Toc239851404"/>
+      <w:bookmarkStart w:id="25" w:name="_Toc239929639"/>
       <w:r>
         <w:t>Glosario</w:t>
       </w:r>
-      <w:bookmarkEnd w:id="12"/>
-    </w:p>
+      <w:bookmarkEnd w:id="25"/>
+    </w:p>
+    <w:tbl>
+      <w:tblPr>
+        <w:tblStyle w:val="Tablanormal2"/>
+        <w:tblW w:w="8789" w:type="dxa"/>
+        <w:tblInd w:w="-142" w:type="dxa"/>
+        <w:tblLook w:val="04A0" w:firstRow="1" w:lastRow="0" w:firstColumn="1" w:lastColumn="0" w:noHBand="0" w:noVBand="1"/>
+      </w:tblPr>
+      <w:tblGrid>
+        <w:gridCol w:w="2642"/>
+        <w:gridCol w:w="6147"/>
+      </w:tblGrid>
+      <w:tr>
+        <w:trPr>
+          <w:cnfStyle w:val="100000000000" w:firstRow="1" w:lastRow="0" w:firstColumn="0" w:lastColumn="0" w:oddVBand="0" w:evenVBand="0" w:oddHBand="0" w:evenHBand="0" w:firstRowFirstColumn="0" w:firstRowLastColumn="0" w:lastRowFirstColumn="0" w:lastRowLastColumn="0"/>
+        </w:trPr>
+        <w:tc>
+          <w:tcPr>
+            <w:cnfStyle w:val="001000000000" w:firstRow="0" w:lastRow="0" w:firstColumn="1" w:lastColumn="0" w:oddVBand="0" w:evenVBand="0" w:oddHBand="0" w:evenHBand="0" w:firstRowFirstColumn="0" w:firstRowLastColumn="0" w:lastRowFirstColumn="0" w:lastRowLastColumn="0"/>
+            <w:tcW w:w="2642" w:type="dxa"/>
+            <w:vAlign w:val="center"/>
+          </w:tcPr>
+          <w:p>
+            <w:pPr>
+              <w:jc w:val="center"/>
+            </w:pPr>
+            <w:r>
+              <w:t>Término</w:t>
+            </w:r>
+          </w:p>
+        </w:tc>
+        <w:tc>
+          <w:tcPr>
+            <w:tcW w:w="6147" w:type="dxa"/>
+            <w:vAlign w:val="center"/>
+          </w:tcPr>
+          <w:p>
+            <w:pPr>
+              <w:jc w:val="center"/>
+              <w:cnfStyle w:val="100000000000" w:firstRow="1" w:lastRow="0" w:firstColumn="0" w:lastColumn="0" w:oddVBand="0" w:evenVBand="0" w:oddHBand="0" w:evenHBand="0" w:firstRowFirstColumn="0" w:firstRowLastColumn="0" w:lastRowFirstColumn="0" w:lastRowLastColumn="0"/>
+            </w:pPr>
+            <w:r>
+              <w:t>Definición</w:t>
+            </w:r>
+          </w:p>
+        </w:tc>
+      </w:tr>
+      <w:tr>
+        <w:trPr>
+          <w:cnfStyle w:val="000000100000" w:firstRow="0" w:lastRow="0" w:firstColumn="0" w:lastColumn="0" w:oddVBand="0" w:evenVBand="0" w:oddHBand="1" w:evenHBand="0" w:firstRowFirstColumn="0" w:firstRowLastColumn="0" w:lastRowFirstColumn="0" w:lastRowLastColumn="0"/>
+        </w:trPr>
+        <w:tc>
+          <w:tcPr>
+            <w:cnfStyle w:val="001000000000" w:firstRow="0" w:lastRow="0" w:firstColumn="1" w:lastColumn="0" w:oddVBand="0" w:evenVBand="0" w:oddHBand="0" w:evenHBand="0" w:firstRowFirstColumn="0" w:firstRowLastColumn="0" w:lastRowFirstColumn="0" w:lastRowLastColumn="0"/>
+            <w:tcW w:w="2642" w:type="dxa"/>
+            <w:vAlign w:val="center"/>
+          </w:tcPr>
+          <w:p>
+            <w:pPr>
+              <w:jc w:val="center"/>
+            </w:pPr>
+            <w:r>
+              <w:t>Chatbot</w:t>
+            </w:r>
+          </w:p>
+        </w:tc>
+        <w:tc>
+          <w:tcPr>
+            <w:tcW w:w="6147" w:type="dxa"/>
+          </w:tcPr>
+          <w:p>
+            <w:pPr>
+              <w:cnfStyle w:val="000000100000" w:firstRow="0" w:lastRow="0" w:firstColumn="0" w:lastColumn="0" w:oddVBand="0" w:evenVBand="0" w:oddHBand="1" w:evenHBand="0" w:firstRowFirstColumn="0" w:firstRowLastColumn="0" w:lastRowFirstColumn="0" w:lastRowLastColumn="0"/>
+            </w:pPr>
+            <w:r>
+              <w:t>Programa capaz de mantener una conversación con una persona simulando lenguaje natural, en este caso mediante reglas y modelos entrenados con spaCy.</w:t>
+            </w:r>
+          </w:p>
+        </w:tc>
+      </w:tr>
+      <w:tr>
+        <w:tc>
+          <w:tcPr>
+            <w:cnfStyle w:val="001000000000" w:firstRow="0" w:lastRow="0" w:firstColumn="1" w:lastColumn="0" w:oddVBand="0" w:evenVBand="0" w:oddHBand="0" w:evenHBand="0" w:firstRowFirstColumn="0" w:firstRowLastColumn="0" w:lastRowFirstColumn="0" w:lastRowLastColumn="0"/>
+            <w:tcW w:w="2642" w:type="dxa"/>
+            <w:vAlign w:val="center"/>
+          </w:tcPr>
+          <w:p>
+            <w:pPr>
+              <w:jc w:val="center"/>
+            </w:pPr>
+            <w:r>
+              <w:t>Corpus</w:t>
+            </w:r>
+          </w:p>
+        </w:tc>
+        <w:tc>
+          <w:tcPr>
+            <w:tcW w:w="6147" w:type="dxa"/>
+          </w:tcPr>
+          <w:p>
+            <w:pPr>
+              <w:cnfStyle w:val="000000000000" w:firstRow="0" w:lastRow="0" w:firstColumn="0" w:lastColumn="0" w:oddVBand="0" w:evenVBand="0" w:oddHBand="0" w:evenHBand="0" w:firstRowFirstColumn="0" w:firstRowLastColumn="0" w:lastRowFirstColumn="0" w:lastRowLastColumn="0"/>
+            </w:pPr>
+            <w:r>
+              <w:t>Conjunto de textos de ejemplo (frases de clientes, preguntas frecuentes, etc.) que se usa para entrenar o evaluar el modelo de spaCy.</w:t>
+            </w:r>
+          </w:p>
+        </w:tc>
+      </w:tr>
+      <w:tr>
+        <w:trPr>
+          <w:cnfStyle w:val="000000100000" w:firstRow="0" w:lastRow="0" w:firstColumn="0" w:lastColumn="0" w:oddVBand="0" w:evenVBand="0" w:oddHBand="1" w:evenHBand="0" w:firstRowFirstColumn="0" w:firstRowLastColumn="0" w:lastRowFirstColumn="0" w:lastRowLastColumn="0"/>
+        </w:trPr>
+        <w:tc>
+          <w:tcPr>
+            <w:cnfStyle w:val="001000000000" w:firstRow="0" w:lastRow="0" w:firstColumn="1" w:lastColumn="0" w:oddVBand="0" w:evenVBand="0" w:oddHBand="0" w:evenHBand="0" w:firstRowFirstColumn="0" w:firstRowLastColumn="0" w:lastRowFirstColumn="0" w:lastRowLastColumn="0"/>
+            <w:tcW w:w="2642" w:type="dxa"/>
+            <w:vAlign w:val="center"/>
+          </w:tcPr>
+          <w:p>
+            <w:pPr>
+              <w:jc w:val="center"/>
+            </w:pPr>
+            <w:r>
+              <w:t>Entidad (NER)</w:t>
+            </w:r>
+          </w:p>
+        </w:tc>
+        <w:tc>
+          <w:tcPr>
+            <w:tcW w:w="6147" w:type="dxa"/>
+          </w:tcPr>
+          <w:p>
+            <w:pPr>
+              <w:cnfStyle w:val="000000100000" w:firstRow="0" w:lastRow="0" w:firstColumn="0" w:lastColumn="0" w:oddVBand="0" w:evenVBand="0" w:oddHBand="1" w:evenHBand="0" w:firstRowFirstColumn="0" w:firstRowLastColumn="0" w:lastRowFirstColumn="0" w:lastRowLastColumn="0"/>
+            </w:pPr>
+            <w:r>
+              <w:t>Elemento concreto que se extrae de un texto (un servicio, una fecha, un nombre de producto). El reconocimiento de entidades nombradas (</w:t>
+            </w:r>
+            <w:proofErr w:type="spellStart"/>
+            <w:r>
+              <w:t>Named</w:t>
+            </w:r>
+            <w:proofErr w:type="spellEnd"/>
+            <w:r>
+              <w:t xml:space="preserve"> </w:t>
+            </w:r>
+            <w:proofErr w:type="spellStart"/>
+            <w:r>
+              <w:t>Entity</w:t>
+            </w:r>
+            <w:proofErr w:type="spellEnd"/>
+            <w:r>
+              <w:t xml:space="preserve"> </w:t>
+            </w:r>
+            <w:proofErr w:type="spellStart"/>
+            <w:r>
+              <w:t>Recognition</w:t>
+            </w:r>
+            <w:proofErr w:type="spellEnd"/>
+            <w:r>
+              <w:t>) es la tarea de spaCy que las identifica.</w:t>
+            </w:r>
+          </w:p>
+        </w:tc>
+      </w:tr>
+      <w:tr>
+        <w:tc>
+          <w:tcPr>
+            <w:cnfStyle w:val="001000000000" w:firstRow="0" w:lastRow="0" w:firstColumn="1" w:lastColumn="0" w:oddVBand="0" w:evenVBand="0" w:oddHBand="0" w:evenHBand="0" w:firstRowFirstColumn="0" w:firstRowLastColumn="0" w:lastRowFirstColumn="0" w:lastRowLastColumn="0"/>
+            <w:tcW w:w="2642" w:type="dxa"/>
+            <w:vAlign w:val="center"/>
+          </w:tcPr>
+          <w:p>
+            <w:pPr>
+              <w:jc w:val="center"/>
+            </w:pPr>
+            <w:r>
+              <w:t>Iframe</w:t>
+            </w:r>
+          </w:p>
+        </w:tc>
+        <w:tc>
+          <w:tcPr>
+            <w:tcW w:w="6147" w:type="dxa"/>
+          </w:tcPr>
+          <w:p>
+            <w:pPr>
+              <w:cnfStyle w:val="000000000000" w:firstRow="0" w:lastRow="0" w:firstColumn="0" w:lastColumn="0" w:oddVBand="0" w:evenVBand="0" w:oddHBand="0" w:evenHBand="0" w:firstRowFirstColumn="0" w:firstRowLastColumn="0" w:lastRowFirstColumn="0" w:lastRowLastColumn="0"/>
+            </w:pPr>
+            <w:r>
+              <w:t>Elemento HTML que permite incrustar una página (en este caso, el chat de Django) dentro de otra página web, la del cliente, manteniendo el contenido aislado.</w:t>
+            </w:r>
+          </w:p>
+        </w:tc>
+      </w:tr>
+      <w:tr>
+        <w:trPr>
+          <w:cnfStyle w:val="000000100000" w:firstRow="0" w:lastRow="0" w:firstColumn="0" w:lastColumn="0" w:oddVBand="0" w:evenVBand="0" w:oddHBand="1" w:evenHBand="0" w:firstRowFirstColumn="0" w:firstRowLastColumn="0" w:lastRowFirstColumn="0" w:lastRowLastColumn="0"/>
+        </w:trPr>
+        <w:tc>
+          <w:tcPr>
+            <w:cnfStyle w:val="001000000000" w:firstRow="0" w:lastRow="0" w:firstColumn="1" w:lastColumn="0" w:oddVBand="0" w:evenVBand="0" w:oddHBand="0" w:evenHBand="0" w:firstRowFirstColumn="0" w:firstRowLastColumn="0" w:lastRowFirstColumn="0" w:lastRowLastColumn="0"/>
+            <w:tcW w:w="2642" w:type="dxa"/>
+            <w:vAlign w:val="center"/>
+          </w:tcPr>
+          <w:p>
+            <w:pPr>
+              <w:jc w:val="center"/>
+            </w:pPr>
+            <w:r>
+              <w:t>NLP (Procesamiento del Lenguaje Natural)</w:t>
+            </w:r>
+          </w:p>
+        </w:tc>
+        <w:tc>
+          <w:tcPr>
+            <w:tcW w:w="6147" w:type="dxa"/>
+          </w:tcPr>
+          <w:p>
+            <w:pPr>
+              <w:cnfStyle w:val="000000100000" w:firstRow="0" w:lastRow="0" w:firstColumn="0" w:lastColumn="0" w:oddVBand="0" w:evenVBand="0" w:oddHBand="1" w:evenHBand="0" w:firstRowFirstColumn="0" w:firstRowLastColumn="0" w:lastRowFirstColumn="0" w:lastRowLastColumn="0"/>
+            </w:pPr>
+            <w:r>
+              <w:t>Campo de la inteligencia artificial dedicado a que los ordenadores comprendan, interpreten y generen lenguaje humano.</w:t>
+            </w:r>
+          </w:p>
+        </w:tc>
+      </w:tr>
+      <w:tr>
+        <w:tc>
+          <w:tcPr>
+            <w:cnfStyle w:val="001000000000" w:firstRow="0" w:lastRow="0" w:firstColumn="1" w:lastColumn="0" w:oddVBand="0" w:evenVBand="0" w:oddHBand="0" w:evenHBand="0" w:firstRowFirstColumn="0" w:firstRowLastColumn="0" w:lastRowFirstColumn="0" w:lastRowLastColumn="0"/>
+            <w:tcW w:w="2642" w:type="dxa"/>
+            <w:vAlign w:val="center"/>
+          </w:tcPr>
+          <w:p>
+            <w:pPr>
+              <w:jc w:val="center"/>
+            </w:pPr>
+            <w:r>
+              <w:t>Pipeline (spaCy)</w:t>
+            </w:r>
+          </w:p>
+        </w:tc>
+        <w:tc>
+          <w:tcPr>
+            <w:tcW w:w="6147" w:type="dxa"/>
+          </w:tcPr>
+          <w:p>
+            <w:pPr>
+              <w:cnfStyle w:val="000000000000" w:firstRow="0" w:lastRow="0" w:firstColumn="0" w:lastColumn="0" w:oddVBand="0" w:evenVBand="0" w:oddHBand="0" w:evenHBand="0" w:firstRowFirstColumn="0" w:firstRowLastColumn="0" w:lastRowFirstColumn="0" w:lastRowLastColumn="0"/>
+            </w:pPr>
+            <w:r>
+              <w:t>Secuencia de componentes (tokenizador, etiquetador, NER, clasificador de texto...) por los que pasa un texto al ser procesado por spaCy.</w:t>
+            </w:r>
+          </w:p>
+        </w:tc>
+      </w:tr>
+      <w:tr>
+        <w:trPr>
+          <w:cnfStyle w:val="000000100000" w:firstRow="0" w:lastRow="0" w:firstColumn="0" w:lastColumn="0" w:oddVBand="0" w:evenVBand="0" w:oddHBand="1" w:evenHBand="0" w:firstRowFirstColumn="0" w:firstRowLastColumn="0" w:lastRowFirstColumn="0" w:lastRowLastColumn="0"/>
+        </w:trPr>
+        <w:tc>
+          <w:tcPr>
+            <w:cnfStyle w:val="001000000000" w:firstRow="0" w:lastRow="0" w:firstColumn="1" w:lastColumn="0" w:oddVBand="0" w:evenVBand="0" w:oddHBand="0" w:evenHBand="0" w:firstRowFirstColumn="0" w:firstRowLastColumn="0" w:lastRowFirstColumn="0" w:lastRowLastColumn="0"/>
+            <w:tcW w:w="2642" w:type="dxa"/>
+            <w:vAlign w:val="center"/>
+          </w:tcPr>
+          <w:p>
+            <w:pPr>
+              <w:jc w:val="center"/>
+            </w:pPr>
+            <w:proofErr w:type="spellStart"/>
+            <w:r>
+              <w:t>postMessage</w:t>
+            </w:r>
+            <w:proofErr w:type="spellEnd"/>
+          </w:p>
+        </w:tc>
+        <w:tc>
+          <w:tcPr>
+            <w:tcW w:w="6147" w:type="dxa"/>
+          </w:tcPr>
+          <w:p>
+            <w:pPr>
+              <w:cnfStyle w:val="000000100000" w:firstRow="0" w:lastRow="0" w:firstColumn="0" w:lastColumn="0" w:oddVBand="0" w:evenVBand="0" w:oddHBand="1" w:evenHBand="0" w:firstRowFirstColumn="0" w:firstRowLastColumn="0" w:lastRowFirstColumn="0" w:lastRowLastColumn="0"/>
+            </w:pPr>
+            <w:r>
+              <w:t xml:space="preserve">API de JavaScript que permite que la página del cliente y el contenido del iframe se envíen mensajes entre sí de forma segura, por </w:t>
+            </w:r>
+            <w:proofErr w:type="gramStart"/>
+            <w:r>
+              <w:t>ejemplo</w:t>
+            </w:r>
+            <w:proofErr w:type="gramEnd"/>
+            <w:r>
+              <w:t xml:space="preserve"> para avisar de que el chat se ha abierto o cerrado.</w:t>
+            </w:r>
+          </w:p>
+        </w:tc>
+      </w:tr>
+      <w:tr>
+        <w:tc>
+          <w:tcPr>
+            <w:cnfStyle w:val="001000000000" w:firstRow="0" w:lastRow="0" w:firstColumn="1" w:lastColumn="0" w:oddVBand="0" w:evenVBand="0" w:oddHBand="0" w:evenHBand="0" w:firstRowFirstColumn="0" w:firstRowLastColumn="0" w:lastRowFirstColumn="0" w:lastRowLastColumn="0"/>
+            <w:tcW w:w="2642" w:type="dxa"/>
+            <w:vAlign w:val="center"/>
+          </w:tcPr>
+          <w:p>
+            <w:pPr>
+              <w:jc w:val="center"/>
+            </w:pPr>
+            <w:r>
+              <w:t>SQLite</w:t>
+            </w:r>
+          </w:p>
+        </w:tc>
+        <w:tc>
+          <w:tcPr>
+            <w:tcW w:w="6147" w:type="dxa"/>
+          </w:tcPr>
+          <w:p>
+            <w:pPr>
+              <w:cnfStyle w:val="000000000000" w:firstRow="0" w:lastRow="0" w:firstColumn="0" w:lastColumn="0" w:oddVBand="0" w:evenVBand="0" w:oddHBand="0" w:evenHBand="0" w:firstRowFirstColumn="0" w:firstRowLastColumn="0" w:lastRowFirstColumn="0" w:lastRowLastColumn="0"/>
+            </w:pPr>
+            <w:r>
+              <w:t>Sistema de base de datos ligero basado en un único fichero, usado por defecto en Django durante el desarrollo por no requerir un servidor de base de datos independiente.</w:t>
+            </w:r>
+          </w:p>
+        </w:tc>
+      </w:tr>
+      <w:tr>
+        <w:trPr>
+          <w:cnfStyle w:val="000000100000" w:firstRow="0" w:lastRow="0" w:firstColumn="0" w:lastColumn="0" w:oddVBand="0" w:evenVBand="0" w:oddHBand="1" w:evenHBand="0" w:firstRowFirstColumn="0" w:firstRowLastColumn="0" w:lastRowFirstColumn="0" w:lastRowLastColumn="0"/>
+        </w:trPr>
+        <w:tc>
+          <w:tcPr>
+            <w:cnfStyle w:val="001000000000" w:firstRow="0" w:lastRow="0" w:firstColumn="1" w:lastColumn="0" w:oddVBand="0" w:evenVBand="0" w:oddHBand="0" w:evenHBand="0" w:firstRowFirstColumn="0" w:firstRowLastColumn="0" w:lastRowFirstColumn="0" w:lastRowLastColumn="0"/>
+            <w:tcW w:w="2642" w:type="dxa"/>
+            <w:vAlign w:val="center"/>
+          </w:tcPr>
+          <w:p>
+            <w:pPr>
+              <w:jc w:val="center"/>
+            </w:pPr>
+            <w:r>
+              <w:t>Textcat (clasificador de texto)</w:t>
+            </w:r>
+          </w:p>
+        </w:tc>
+        <w:tc>
+          <w:tcPr>
+            <w:tcW w:w="6147" w:type="dxa"/>
+          </w:tcPr>
+          <w:p>
+            <w:pPr>
+              <w:cnfStyle w:val="000000100000" w:firstRow="0" w:lastRow="0" w:firstColumn="0" w:lastColumn="0" w:oddVBand="0" w:evenVBand="0" w:oddHBand="1" w:evenHBand="0" w:firstRowFirstColumn="0" w:firstRowLastColumn="0" w:lastRowFirstColumn="0" w:lastRowLastColumn="0"/>
+            </w:pPr>
+            <w:r>
+              <w:t>Componente de spaCy que asigna una o varias categorías predefinidas a un texto; en este proyecto se usa para distinguir entre consulta técnica y compra.</w:t>
+            </w:r>
+          </w:p>
+        </w:tc>
+      </w:tr>
+      <w:tr>
+        <w:tc>
+          <w:tcPr>
+            <w:cnfStyle w:val="001000000000" w:firstRow="0" w:lastRow="0" w:firstColumn="1" w:lastColumn="0" w:oddVBand="0" w:evenVBand="0" w:oddHBand="0" w:evenHBand="0" w:firstRowFirstColumn="0" w:firstRowLastColumn="0" w:lastRowFirstColumn="0" w:lastRowLastColumn="0"/>
+            <w:tcW w:w="2642" w:type="dxa"/>
+            <w:vAlign w:val="center"/>
+          </w:tcPr>
+          <w:p>
+            <w:pPr>
+              <w:jc w:val="center"/>
+            </w:pPr>
+            <w:r>
+              <w:t xml:space="preserve">Token / </w:t>
+            </w:r>
+            <w:proofErr w:type="spellStart"/>
+            <w:r>
+              <w:t>tokenización</w:t>
+            </w:r>
+            <w:proofErr w:type="spellEnd"/>
+          </w:p>
+        </w:tc>
+        <w:tc>
+          <w:tcPr>
+            <w:tcW w:w="6147" w:type="dxa"/>
+          </w:tcPr>
+          <w:p>
+            <w:pPr>
+              <w:cnfStyle w:val="000000000000" w:firstRow="0" w:lastRow="0" w:firstColumn="0" w:lastColumn="0" w:oddVBand="0" w:evenVBand="0" w:oddHBand="0" w:evenHBand="0" w:firstRowFirstColumn="0" w:firstRowLastColumn="0" w:lastRowFirstColumn="0" w:lastRowLastColumn="0"/>
+            </w:pPr>
+            <w:r>
+              <w:t xml:space="preserve">Un token es cada unidad mínima (normalmente una palabra o signo) en la que se divide un texto; la </w:t>
+            </w:r>
+            <w:proofErr w:type="spellStart"/>
+            <w:r>
+              <w:t>tokenización</w:t>
+            </w:r>
+            <w:proofErr w:type="spellEnd"/>
+            <w:r>
+              <w:t xml:space="preserve"> es el primer paso de cualquier pipeline de spaCy.</w:t>
+            </w:r>
+          </w:p>
+        </w:tc>
+      </w:tr>
+      <w:tr>
+        <w:trPr>
+          <w:cnfStyle w:val="000000100000" w:firstRow="0" w:lastRow="0" w:firstColumn="0" w:lastColumn="0" w:oddVBand="0" w:evenVBand="0" w:oddHBand="1" w:evenHBand="0" w:firstRowFirstColumn="0" w:firstRowLastColumn="0" w:lastRowFirstColumn="0" w:lastRowLastColumn="0"/>
+        </w:trPr>
+        <w:tc>
+          <w:tcPr>
+            <w:cnfStyle w:val="001000000000" w:firstRow="0" w:lastRow="0" w:firstColumn="1" w:lastColumn="0" w:oddVBand="0" w:evenVBand="0" w:oddHBand="0" w:evenHBand="0" w:firstRowFirstColumn="0" w:firstRowLastColumn="0" w:lastRowFirstColumn="0" w:lastRowLastColumn="0"/>
+            <w:tcW w:w="2642" w:type="dxa"/>
+            <w:vAlign w:val="center"/>
+          </w:tcPr>
+          <w:p>
+            <w:pPr>
+              <w:jc w:val="center"/>
+            </w:pPr>
+            <w:r>
+              <w:t>Widget</w:t>
+            </w:r>
+          </w:p>
+        </w:tc>
+        <w:tc>
+          <w:tcPr>
+            <w:tcW w:w="6147" w:type="dxa"/>
+          </w:tcPr>
+          <w:p>
+            <w:pPr>
+              <w:cnfStyle w:val="000000100000" w:firstRow="0" w:lastRow="0" w:firstColumn="0" w:lastColumn="0" w:oddVBand="0" w:evenVBand="0" w:oddHBand="1" w:evenHBand="0" w:firstRowFirstColumn="0" w:firstRowLastColumn="0" w:lastRowFirstColumn="0" w:lastRowLastColumn="0"/>
+            </w:pPr>
+            <w:r>
+              <w:t>Componente de interfaz reutilizable y autocontenido -en este caso el chatbot- pensado para insertarse dentro de otra página web sin depender de su diseño.</w:t>
+            </w:r>
+          </w:p>
+        </w:tc>
+      </w:tr>
+      <w:tr>
+        <w:tc>
+          <w:tcPr>
+            <w:cnfStyle w:val="001000000000" w:firstRow="0" w:lastRow="0" w:firstColumn="1" w:lastColumn="0" w:oddVBand="0" w:evenVBand="0" w:oddHBand="0" w:evenHBand="0" w:firstRowFirstColumn="0" w:firstRowLastColumn="0" w:lastRowFirstColumn="0" w:lastRowLastColumn="0"/>
+            <w:tcW w:w="2642" w:type="dxa"/>
+            <w:vAlign w:val="center"/>
+          </w:tcPr>
+          <w:p>
+            <w:pPr>
+              <w:jc w:val="center"/>
+            </w:pPr>
+            <w:r>
+              <w:t>X-</w:t>
+            </w:r>
+            <w:proofErr w:type="spellStart"/>
+            <w:r>
+              <w:t>Frame</w:t>
+            </w:r>
+            <w:proofErr w:type="spellEnd"/>
+            <w:r>
+              <w:t>-</w:t>
+            </w:r>
+            <w:proofErr w:type="spellStart"/>
+            <w:r>
+              <w:t>Options</w:t>
+            </w:r>
+            <w:proofErr w:type="spellEnd"/>
+          </w:p>
+        </w:tc>
+        <w:tc>
+          <w:tcPr>
+            <w:tcW w:w="6147" w:type="dxa"/>
+          </w:tcPr>
+          <w:p>
+            <w:pPr>
+              <w:cnfStyle w:val="000000000000" w:firstRow="0" w:lastRow="0" w:firstColumn="0" w:lastColumn="0" w:oddVBand="0" w:evenVBand="0" w:oddHBand="0" w:evenHBand="0" w:firstRowFirstColumn="0" w:firstRowLastColumn="0" w:lastRowFirstColumn="0" w:lastRowLastColumn="0"/>
+            </w:pPr>
+            <w:r>
+              <w:t>Cabecera HTTP que controla si una página puede mostrarse dentro de un iframe de otro dominio; Django la activa por defecto y hay que exceptuarla en la vista del widget.</w:t>
+            </w:r>
+          </w:p>
+        </w:tc>
+      </w:tr>
+    </w:tbl>
+    <w:p/>
     <w:sectPr>
       <w:footerReference w:type="default" r:id="rId9"/>
       <w:pgSz w:w="11906" w:h="16838"/>
@@ -1481,6 +2557,7 @@
         <w:docPartUnique/>
       </w:docPartObj>
     </w:sdtPr>
+    <w:sdtEndPr/>
     <w:sdtContent>
       <w:p>
         <w:pPr>
@@ -1505,11 +2582,6 @@
       </w:p>
     </w:sdtContent>
   </w:sdt>
-  <w:p>
-    <w:pPr>
-      <w:pStyle w:val="Piedepgina"/>
-    </w:pPr>
-  </w:p>
 </w:ftr>
 </file>
 
@@ -1541,6 +2613,60 @@
 <file path=word/numbering.xml><?xml version="1.0" encoding="utf-8"?>
 <w:numbering xmlns:wpc="http://schemas.microsoft.com/office/word/2010/wordprocessingCanvas" xmlns:cx="http://schemas.microsoft.com/office/drawing/2014/chartex" xmlns:cx1="http://schemas.microsoft.com/office/drawing/2015/9/8/chartex" xmlns:cx2="http://schemas.microsoft.com/office/drawing/2015/10/21/chartex" xmlns:cx3="http://schemas.microsoft.com/office/drawing/2016/5/9/chartex" xmlns:cx4="http://schemas.microsoft.com/office/drawing/2016/5/10/chartex" xmlns:cx5="http://schemas.microsoft.com/office/drawing/2016/5/11/chartex" xmlns:cx6="http://schemas.microsoft.com/office/drawing/2016/5/12/chartex" xmlns:cx7="http://schemas.microsoft.com/office/drawing/2016/5/13/chartex" xmlns:cx8="http://schemas.microsoft.com/office/drawing/2016/5/14/chartex" xmlns:mc="http://schemas.openxmlformats.org/markup-compatibility/2006" xmlns:aink="http://schemas.microsoft.com/office/drawing/2016/ink" xmlns:am3d="http://schemas.microsoft.com/office/drawing/2017/model3d" xmlns:o="urn:schemas-microsoft-com:office:office" xmlns:r="http://schemas.openxmlformats.org/officeDocument/2006/relationships" xmlns:m="http://schemas.openxmlformats.org/officeDocument/2006/math" xmlns:v="urn:schemas-microsoft-com:vml" xmlns:wp14="http://schemas.microsoft.com/office/word/2010/wordprocessingDrawing" xmlns:wp="http://schemas.openxmlformats.org/drawingml/2006/wordprocessingDrawing" xmlns:w10="urn:schemas-microsoft-com:office:word" xmlns:w="http://schemas.openxmlformats.org/wordprocessingml/2006/main" xmlns:w14="http://schemas.microsoft.com/office/word/2010/wordml" xmlns:w15="http://schemas.microsoft.com/office/word/2012/wordml" xmlns:w16cex="http://schemas.microsoft.com/office/word/2018/wordml/cex" xmlns:w16cid="http://schemas.microsoft.com/office/word/2016/wordml/cid" xmlns:w16="http://schemas.microsoft.com/office/word/2018/wordml" xmlns:w16sdtdh="http://schemas.microsoft.com/office/word/2020/wordml/sdtdatahash" xmlns:w16se="http://schemas.microsoft.com/office/word/2015/wordml/symex" xmlns:wpg="http://schemas.microsoft.com/office/word/2010/wordprocessingGroup" xmlns:wpi="http://schemas.microsoft.com/office/word/2010/wordprocessingInk" xmlns:wne="http://schemas.microsoft.com/office/word/2006/wordml" xmlns:wps="http://schemas.microsoft.com/office/word/2010/wordprocessingShape" mc:Ignorable="w14 w15 w16se w16cid w16 w16cex w16sdtdh wp14">
   <w:abstractNum w:abstractNumId="0" w15:restartNumberingAfterBreak="0">
+    <w:nsid w:val="16CF4A52"/>
+    <w:multiLevelType w:val="hybridMultilevel"/>
+    <w:tmpl w:val="DC9E3B82"/>
+    <w:lvl w:ilvl="0" w:tplc="4E78BC9E">
+      <w:start w:val="1"/>
+      <w:numFmt w:val="bullet"/>
+      <w:lvlText w:val="•"/>
+      <w:lvlJc w:val="left"/>
+      <w:pPr>
+        <w:ind w:left="720" w:hanging="360"/>
+      </w:pPr>
+    </w:lvl>
+    <w:lvl w:ilvl="1" w:tplc="8B188A0C">
+      <w:numFmt w:val="decimal"/>
+      <w:lvlText w:val=""/>
+      <w:lvlJc w:val="left"/>
+    </w:lvl>
+    <w:lvl w:ilvl="2" w:tplc="6C7C60E2">
+      <w:numFmt w:val="decimal"/>
+      <w:lvlText w:val=""/>
+      <w:lvlJc w:val="left"/>
+    </w:lvl>
+    <w:lvl w:ilvl="3" w:tplc="259055E6">
+      <w:numFmt w:val="decimal"/>
+      <w:lvlText w:val=""/>
+      <w:lvlJc w:val="left"/>
+    </w:lvl>
+    <w:lvl w:ilvl="4" w:tplc="D5E422B0">
+      <w:numFmt w:val="decimal"/>
+      <w:lvlText w:val=""/>
+      <w:lvlJc w:val="left"/>
+    </w:lvl>
+    <w:lvl w:ilvl="5" w:tplc="07E42574">
+      <w:numFmt w:val="decimal"/>
+      <w:lvlText w:val=""/>
+      <w:lvlJc w:val="left"/>
+    </w:lvl>
+    <w:lvl w:ilvl="6" w:tplc="4AD68A68">
+      <w:numFmt w:val="decimal"/>
+      <w:lvlText w:val=""/>
+      <w:lvlJc w:val="left"/>
+    </w:lvl>
+    <w:lvl w:ilvl="7" w:tplc="263055B0">
+      <w:numFmt w:val="decimal"/>
+      <w:lvlText w:val=""/>
+      <w:lvlJc w:val="left"/>
+    </w:lvl>
+    <w:lvl w:ilvl="8" w:tplc="CE9836DC">
+      <w:numFmt w:val="decimal"/>
+      <w:lvlText w:val=""/>
+      <w:lvlJc w:val="left"/>
+    </w:lvl>
+  </w:abstractNum>
+  <w:abstractNum w:abstractNumId="1" w15:restartNumberingAfterBreak="0">
     <w:nsid w:val="37783362"/>
     <w:multiLevelType w:val="hybridMultilevel"/>
     <w:tmpl w:val="72C8C65A"/>
@@ -1653,7 +2779,7 @@
       </w:rPr>
     </w:lvl>
   </w:abstractNum>
-  <w:abstractNum w:abstractNumId="1" w15:restartNumberingAfterBreak="0">
+  <w:abstractNum w:abstractNumId="2" w15:restartNumberingAfterBreak="0">
     <w:nsid w:val="5C416C08"/>
     <w:multiLevelType w:val="hybridMultilevel"/>
     <w:tmpl w:val="8B467D6E"/>
@@ -1743,10 +2869,16 @@
     </w:lvl>
   </w:abstractNum>
   <w:num w:numId="1">
+    <w:abstractNumId w:val="2"/>
+  </w:num>
+  <w:num w:numId="2">
     <w:abstractNumId w:val="1"/>
   </w:num>
-  <w:num w:numId="2">
+  <w:num w:numId="3">
     <w:abstractNumId w:val="0"/>
+    <w:lvlOverride w:ilvl="0">
+      <w:startOverride w:val="1"/>
+    </w:lvlOverride>
   </w:num>
 </w:numbering>
 </file>
@@ -1756,15 +2888,13 @@
   <w:docDefaults>
     <w:rPrDefault>
       <w:rPr>
-        <w:rFonts w:asciiTheme="minorHAnsi" w:eastAsiaTheme="minorHAnsi" w:hAnsiTheme="minorHAnsi" w:cstheme="minorBidi"/>
-        <w:sz w:val="22"/>
-        <w:szCs w:val="22"/>
+        <w:rFonts w:asciiTheme="minorHAnsi" w:eastAsiaTheme="minorEastAsia" w:hAnsiTheme="minorHAnsi" w:cstheme="minorBidi"/>
         <w:lang w:val="es-ES" w:eastAsia="en-US" w:bidi="ar-SA"/>
       </w:rPr>
     </w:rPrDefault>
     <w:pPrDefault>
       <w:pPr>
-        <w:spacing w:after="160" w:line="259" w:lineRule="auto"/>
+        <w:spacing w:before="100" w:after="200" w:line="276" w:lineRule="auto"/>
       </w:pPr>
     </w:pPrDefault>
   </w:docDefaults>
@@ -2149,6 +3279,7 @@
   <w:style w:type="paragraph" w:default="1" w:styleId="Normal">
     <w:name w:val="Normal"/>
     <w:qFormat/>
+    <w:rsid w:val="004232B1"/>
   </w:style>
   <w:style w:type="paragraph" w:styleId="Ttulo1">
     <w:name w:val="heading 1"/>
@@ -2157,18 +3288,24 @@
     <w:link w:val="Ttulo1Car"/>
     <w:uiPriority w:val="9"/>
     <w:qFormat/>
-    <w:rsid w:val="00F57CE2"/>
+    <w:rsid w:val="004232B1"/>
     <w:pPr>
-      <w:keepNext/>
-      <w:keepLines/>
-      <w:spacing w:before="240" w:after="0"/>
+      <w:pBdr>
+        <w:top w:val="single" w:sz="24" w:space="0" w:color="4472C4" w:themeColor="accent1"/>
+        <w:left w:val="single" w:sz="24" w:space="0" w:color="4472C4" w:themeColor="accent1"/>
+        <w:bottom w:val="single" w:sz="24" w:space="0" w:color="4472C4" w:themeColor="accent1"/>
+        <w:right w:val="single" w:sz="24" w:space="0" w:color="4472C4" w:themeColor="accent1"/>
+      </w:pBdr>
+      <w:shd w:val="clear" w:color="auto" w:fill="4472C4" w:themeFill="accent1"/>
+      <w:spacing w:after="0"/>
       <w:outlineLvl w:val="0"/>
     </w:pPr>
     <w:rPr>
-      <w:rFonts w:asciiTheme="majorHAnsi" w:eastAsiaTheme="majorEastAsia" w:hAnsiTheme="majorHAnsi" w:cstheme="majorBidi"/>
-      <w:color w:val="2F5496" w:themeColor="accent1" w:themeShade="BF"/>
-      <w:sz w:val="32"/>
-      <w:szCs w:val="32"/>
+      <w:caps/>
+      <w:color w:val="FFFFFF" w:themeColor="background1"/>
+      <w:spacing w:val="15"/>
+      <w:sz w:val="22"/>
+      <w:szCs w:val="22"/>
     </w:rPr>
   </w:style>
   <w:style w:type="paragraph" w:styleId="Ttulo2">
@@ -2179,18 +3316,177 @@
     <w:uiPriority w:val="9"/>
     <w:unhideWhenUsed/>
     <w:qFormat/>
-    <w:rsid w:val="00F57CE2"/>
+    <w:rsid w:val="004232B1"/>
     <w:pPr>
-      <w:keepNext/>
-      <w:keepLines/>
-      <w:spacing w:before="40" w:after="0"/>
+      <w:pBdr>
+        <w:top w:val="single" w:sz="24" w:space="0" w:color="D9E2F3" w:themeColor="accent1" w:themeTint="33"/>
+        <w:left w:val="single" w:sz="24" w:space="0" w:color="D9E2F3" w:themeColor="accent1" w:themeTint="33"/>
+        <w:bottom w:val="single" w:sz="24" w:space="0" w:color="D9E2F3" w:themeColor="accent1" w:themeTint="33"/>
+        <w:right w:val="single" w:sz="24" w:space="0" w:color="D9E2F3" w:themeColor="accent1" w:themeTint="33"/>
+      </w:pBdr>
+      <w:shd w:val="clear" w:color="auto" w:fill="D9E2F3" w:themeFill="accent1" w:themeFillTint="33"/>
+      <w:spacing w:after="0"/>
       <w:outlineLvl w:val="1"/>
     </w:pPr>
     <w:rPr>
-      <w:rFonts w:asciiTheme="majorHAnsi" w:eastAsiaTheme="majorEastAsia" w:hAnsiTheme="majorHAnsi" w:cstheme="majorBidi"/>
+      <w:caps/>
+      <w:spacing w:val="15"/>
+    </w:rPr>
+  </w:style>
+  <w:style w:type="paragraph" w:styleId="Ttulo3">
+    <w:name w:val="heading 3"/>
+    <w:basedOn w:val="Normal"/>
+    <w:next w:val="Normal"/>
+    <w:link w:val="Ttulo3Car"/>
+    <w:uiPriority w:val="9"/>
+    <w:semiHidden/>
+    <w:unhideWhenUsed/>
+    <w:qFormat/>
+    <w:rsid w:val="004232B1"/>
+    <w:pPr>
+      <w:pBdr>
+        <w:top w:val="single" w:sz="6" w:space="2" w:color="4472C4" w:themeColor="accent1"/>
+      </w:pBdr>
+      <w:spacing w:before="300" w:after="0"/>
+      <w:outlineLvl w:val="2"/>
+    </w:pPr>
+    <w:rPr>
+      <w:caps/>
+      <w:color w:val="1F3763" w:themeColor="accent1" w:themeShade="7F"/>
+      <w:spacing w:val="15"/>
+    </w:rPr>
+  </w:style>
+  <w:style w:type="paragraph" w:styleId="Ttulo4">
+    <w:name w:val="heading 4"/>
+    <w:basedOn w:val="Normal"/>
+    <w:next w:val="Normal"/>
+    <w:link w:val="Ttulo4Car"/>
+    <w:uiPriority w:val="9"/>
+    <w:semiHidden/>
+    <w:unhideWhenUsed/>
+    <w:qFormat/>
+    <w:rsid w:val="004232B1"/>
+    <w:pPr>
+      <w:pBdr>
+        <w:top w:val="dotted" w:sz="6" w:space="2" w:color="4472C4" w:themeColor="accent1"/>
+      </w:pBdr>
+      <w:spacing w:before="200" w:after="0"/>
+      <w:outlineLvl w:val="3"/>
+    </w:pPr>
+    <w:rPr>
+      <w:caps/>
       <w:color w:val="2F5496" w:themeColor="accent1" w:themeShade="BF"/>
-      <w:sz w:val="26"/>
-      <w:szCs w:val="26"/>
+      <w:spacing w:val="10"/>
+    </w:rPr>
+  </w:style>
+  <w:style w:type="paragraph" w:styleId="Ttulo5">
+    <w:name w:val="heading 5"/>
+    <w:basedOn w:val="Normal"/>
+    <w:next w:val="Normal"/>
+    <w:link w:val="Ttulo5Car"/>
+    <w:uiPriority w:val="9"/>
+    <w:semiHidden/>
+    <w:unhideWhenUsed/>
+    <w:qFormat/>
+    <w:rsid w:val="004232B1"/>
+    <w:pPr>
+      <w:pBdr>
+        <w:bottom w:val="single" w:sz="6" w:space="1" w:color="4472C4" w:themeColor="accent1"/>
+      </w:pBdr>
+      <w:spacing w:before="200" w:after="0"/>
+      <w:outlineLvl w:val="4"/>
+    </w:pPr>
+    <w:rPr>
+      <w:caps/>
+      <w:color w:val="2F5496" w:themeColor="accent1" w:themeShade="BF"/>
+      <w:spacing w:val="10"/>
+    </w:rPr>
+  </w:style>
+  <w:style w:type="paragraph" w:styleId="Ttulo6">
+    <w:name w:val="heading 6"/>
+    <w:basedOn w:val="Normal"/>
+    <w:next w:val="Normal"/>
+    <w:link w:val="Ttulo6Car"/>
+    <w:uiPriority w:val="9"/>
+    <w:semiHidden/>
+    <w:unhideWhenUsed/>
+    <w:qFormat/>
+    <w:rsid w:val="004232B1"/>
+    <w:pPr>
+      <w:pBdr>
+        <w:bottom w:val="dotted" w:sz="6" w:space="1" w:color="4472C4" w:themeColor="accent1"/>
+      </w:pBdr>
+      <w:spacing w:before="200" w:after="0"/>
+      <w:outlineLvl w:val="5"/>
+    </w:pPr>
+    <w:rPr>
+      <w:caps/>
+      <w:color w:val="2F5496" w:themeColor="accent1" w:themeShade="BF"/>
+      <w:spacing w:val="10"/>
+    </w:rPr>
+  </w:style>
+  <w:style w:type="paragraph" w:styleId="Ttulo7">
+    <w:name w:val="heading 7"/>
+    <w:basedOn w:val="Normal"/>
+    <w:next w:val="Normal"/>
+    <w:link w:val="Ttulo7Car"/>
+    <w:uiPriority w:val="9"/>
+    <w:semiHidden/>
+    <w:unhideWhenUsed/>
+    <w:qFormat/>
+    <w:rsid w:val="004232B1"/>
+    <w:pPr>
+      <w:spacing w:before="200" w:after="0"/>
+      <w:outlineLvl w:val="6"/>
+    </w:pPr>
+    <w:rPr>
+      <w:caps/>
+      <w:color w:val="2F5496" w:themeColor="accent1" w:themeShade="BF"/>
+      <w:spacing w:val="10"/>
+    </w:rPr>
+  </w:style>
+  <w:style w:type="paragraph" w:styleId="Ttulo8">
+    <w:name w:val="heading 8"/>
+    <w:basedOn w:val="Normal"/>
+    <w:next w:val="Normal"/>
+    <w:link w:val="Ttulo8Car"/>
+    <w:uiPriority w:val="9"/>
+    <w:semiHidden/>
+    <w:unhideWhenUsed/>
+    <w:qFormat/>
+    <w:rsid w:val="004232B1"/>
+    <w:pPr>
+      <w:spacing w:before="200" w:after="0"/>
+      <w:outlineLvl w:val="7"/>
+    </w:pPr>
+    <w:rPr>
+      <w:caps/>
+      <w:spacing w:val="10"/>
+      <w:sz w:val="18"/>
+      <w:szCs w:val="18"/>
+    </w:rPr>
+  </w:style>
+  <w:style w:type="paragraph" w:styleId="Ttulo9">
+    <w:name w:val="heading 9"/>
+    <w:basedOn w:val="Normal"/>
+    <w:next w:val="Normal"/>
+    <w:link w:val="Ttulo9Car"/>
+    <w:uiPriority w:val="9"/>
+    <w:semiHidden/>
+    <w:unhideWhenUsed/>
+    <w:qFormat/>
+    <w:rsid w:val="004232B1"/>
+    <w:pPr>
+      <w:spacing w:before="200" w:after="0"/>
+      <w:outlineLvl w:val="8"/>
+    </w:pPr>
+    <w:rPr>
+      <w:i/>
+      <w:iCs/>
+      <w:caps/>
+      <w:spacing w:val="10"/>
+      <w:sz w:val="18"/>
+      <w:szCs w:val="18"/>
     </w:rPr>
   </w:style>
   <w:style w:type="character" w:default="1" w:styleId="Fuentedeprrafopredeter">
@@ -2227,17 +3523,17 @@
     <w:link w:val="TtuloCar"/>
     <w:uiPriority w:val="10"/>
     <w:qFormat/>
-    <w:rsid w:val="00F57CE2"/>
+    <w:rsid w:val="004232B1"/>
     <w:pPr>
-      <w:spacing w:after="0" w:line="240" w:lineRule="auto"/>
-      <w:contextualSpacing/>
+      <w:spacing w:before="0" w:after="0"/>
     </w:pPr>
     <w:rPr>
       <w:rFonts w:asciiTheme="majorHAnsi" w:eastAsiaTheme="majorEastAsia" w:hAnsiTheme="majorHAnsi" w:cstheme="majorBidi"/>
-      <w:spacing w:val="-10"/>
-      <w:kern w:val="28"/>
-      <w:sz w:val="56"/>
-      <w:szCs w:val="56"/>
+      <w:caps/>
+      <w:color w:val="4472C4" w:themeColor="accent1"/>
+      <w:spacing w:val="10"/>
+      <w:sz w:val="52"/>
+      <w:szCs w:val="52"/>
     </w:rPr>
   </w:style>
   <w:style w:type="character" w:customStyle="1" w:styleId="TtuloCar">
@@ -2245,13 +3541,14 @@
     <w:basedOn w:val="Fuentedeprrafopredeter"/>
     <w:link w:val="Ttulo"/>
     <w:uiPriority w:val="10"/>
-    <w:rsid w:val="00F57CE2"/>
+    <w:rsid w:val="004232B1"/>
     <w:rPr>
       <w:rFonts w:asciiTheme="majorHAnsi" w:eastAsiaTheme="majorEastAsia" w:hAnsiTheme="majorHAnsi" w:cstheme="majorBidi"/>
-      <w:spacing w:val="-10"/>
-      <w:kern w:val="28"/>
-      <w:sz w:val="56"/>
-      <w:szCs w:val="56"/>
+      <w:caps/>
+      <w:color w:val="4472C4" w:themeColor="accent1"/>
+      <w:spacing w:val="10"/>
+      <w:sz w:val="52"/>
+      <w:szCs w:val="52"/>
     </w:rPr>
   </w:style>
   <w:style w:type="paragraph" w:styleId="Subttulo">
@@ -2261,16 +3558,16 @@
     <w:link w:val="SubttuloCar"/>
     <w:uiPriority w:val="11"/>
     <w:qFormat/>
-    <w:rsid w:val="00F57CE2"/>
+    <w:rsid w:val="004232B1"/>
     <w:pPr>
-      <w:numPr>
-        <w:ilvl w:val="1"/>
-      </w:numPr>
+      <w:spacing w:before="0" w:after="500" w:line="240" w:lineRule="auto"/>
     </w:pPr>
     <w:rPr>
-      <w:rFonts w:eastAsiaTheme="minorEastAsia"/>
-      <w:color w:val="5A5A5A" w:themeColor="text1" w:themeTint="A5"/>
-      <w:spacing w:val="15"/>
+      <w:caps/>
+      <w:color w:val="595959" w:themeColor="text1" w:themeTint="A6"/>
+      <w:spacing w:val="10"/>
+      <w:sz w:val="21"/>
+      <w:szCs w:val="21"/>
     </w:rPr>
   </w:style>
   <w:style w:type="character" w:customStyle="1" w:styleId="SubttuloCar">
@@ -2278,11 +3575,13 @@
     <w:basedOn w:val="Fuentedeprrafopredeter"/>
     <w:link w:val="Subttulo"/>
     <w:uiPriority w:val="11"/>
-    <w:rsid w:val="00F57CE2"/>
+    <w:rsid w:val="004232B1"/>
     <w:rPr>
-      <w:rFonts w:eastAsiaTheme="minorEastAsia"/>
-      <w:color w:val="5A5A5A" w:themeColor="text1" w:themeTint="A5"/>
-      <w:spacing w:val="15"/>
+      <w:caps/>
+      <w:color w:val="595959" w:themeColor="text1" w:themeTint="A6"/>
+      <w:spacing w:val="10"/>
+      <w:sz w:val="21"/>
+      <w:szCs w:val="21"/>
     </w:rPr>
   </w:style>
   <w:style w:type="character" w:customStyle="1" w:styleId="Ttulo1Car">
@@ -2290,12 +3589,14 @@
     <w:basedOn w:val="Fuentedeprrafopredeter"/>
     <w:link w:val="Ttulo1"/>
     <w:uiPriority w:val="9"/>
-    <w:rsid w:val="00F57CE2"/>
+    <w:rsid w:val="004232B1"/>
     <w:rPr>
-      <w:rFonts w:asciiTheme="majorHAnsi" w:eastAsiaTheme="majorEastAsia" w:hAnsiTheme="majorHAnsi" w:cstheme="majorBidi"/>
-      <w:color w:val="2F5496" w:themeColor="accent1" w:themeShade="BF"/>
-      <w:sz w:val="32"/>
-      <w:szCs w:val="32"/>
+      <w:caps/>
+      <w:color w:val="FFFFFF" w:themeColor="background1"/>
+      <w:spacing w:val="15"/>
+      <w:sz w:val="22"/>
+      <w:szCs w:val="22"/>
+      <w:shd w:val="clear" w:color="auto" w:fill="4472C4" w:themeFill="accent1"/>
     </w:rPr>
   </w:style>
   <w:style w:type="paragraph" w:styleId="ndice1">
@@ -2317,12 +3618,11 @@
     <w:basedOn w:val="Fuentedeprrafopredeter"/>
     <w:link w:val="Ttulo2"/>
     <w:uiPriority w:val="9"/>
-    <w:rsid w:val="00F57CE2"/>
+    <w:rsid w:val="004232B1"/>
     <w:rPr>
-      <w:rFonts w:asciiTheme="majorHAnsi" w:eastAsiaTheme="majorEastAsia" w:hAnsiTheme="majorHAnsi" w:cstheme="majorBidi"/>
-      <w:color w:val="2F5496" w:themeColor="accent1" w:themeShade="BF"/>
-      <w:sz w:val="26"/>
-      <w:szCs w:val="26"/>
+      <w:caps/>
+      <w:spacing w:val="15"/>
+      <w:shd w:val="clear" w:color="auto" w:fill="D9E2F3" w:themeFill="accent1" w:themeFillTint="33"/>
     </w:rPr>
   </w:style>
   <w:style w:type="paragraph" w:styleId="TtuloTDC">
@@ -2332,13 +3632,10 @@
     <w:uiPriority w:val="39"/>
     <w:unhideWhenUsed/>
     <w:qFormat/>
-    <w:rsid w:val="00F57CE2"/>
+    <w:rsid w:val="004232B1"/>
     <w:pPr>
       <w:outlineLvl w:val="9"/>
     </w:pPr>
-    <w:rPr>
-      <w:lang w:eastAsia="es-ES"/>
-    </w:rPr>
   </w:style>
   <w:style w:type="paragraph" w:styleId="TDC1">
     <w:name w:val="toc 1"/>
@@ -2430,6 +3727,349 @@
     <w:link w:val="Piedepgina"/>
     <w:uiPriority w:val="99"/>
     <w:rsid w:val="00E3275F"/>
+  </w:style>
+  <w:style w:type="table" w:styleId="Tablanormal2">
+    <w:name w:val="Plain Table 2"/>
+    <w:basedOn w:val="Tablanormal"/>
+    <w:uiPriority w:val="42"/>
+    <w:rsid w:val="00257F93"/>
+    <w:pPr>
+      <w:spacing w:after="0" w:line="240" w:lineRule="auto"/>
+    </w:pPr>
+    <w:tblPr>
+      <w:tblStyleRowBandSize w:val="1"/>
+      <w:tblStyleColBandSize w:val="1"/>
+      <w:tblBorders>
+        <w:top w:val="single" w:sz="4" w:space="0" w:color="7F7F7F" w:themeColor="text1" w:themeTint="80"/>
+        <w:bottom w:val="single" w:sz="4" w:space="0" w:color="7F7F7F" w:themeColor="text1" w:themeTint="80"/>
+      </w:tblBorders>
+    </w:tblPr>
+    <w:tblStylePr w:type="firstRow">
+      <w:rPr>
+        <w:b/>
+        <w:bCs/>
+      </w:rPr>
+      <w:tblPr/>
+      <w:tcPr>
+        <w:tcBorders>
+          <w:bottom w:val="single" w:sz="4" w:space="0" w:color="7F7F7F" w:themeColor="text1" w:themeTint="80"/>
+        </w:tcBorders>
+      </w:tcPr>
+    </w:tblStylePr>
+    <w:tblStylePr w:type="lastRow">
+      <w:rPr>
+        <w:b/>
+        <w:bCs/>
+      </w:rPr>
+      <w:tblPr/>
+      <w:tcPr>
+        <w:tcBorders>
+          <w:top w:val="single" w:sz="4" w:space="0" w:color="7F7F7F" w:themeColor="text1" w:themeTint="80"/>
+        </w:tcBorders>
+      </w:tcPr>
+    </w:tblStylePr>
+    <w:tblStylePr w:type="firstCol">
+      <w:rPr>
+        <w:b/>
+        <w:bCs/>
+      </w:rPr>
+    </w:tblStylePr>
+    <w:tblStylePr w:type="lastCol">
+      <w:rPr>
+        <w:b/>
+        <w:bCs/>
+      </w:rPr>
+    </w:tblStylePr>
+    <w:tblStylePr w:type="band1Vert">
+      <w:tblPr/>
+      <w:tcPr>
+        <w:tcBorders>
+          <w:left w:val="single" w:sz="4" w:space="0" w:color="7F7F7F" w:themeColor="text1" w:themeTint="80"/>
+          <w:right w:val="single" w:sz="4" w:space="0" w:color="7F7F7F" w:themeColor="text1" w:themeTint="80"/>
+        </w:tcBorders>
+      </w:tcPr>
+    </w:tblStylePr>
+    <w:tblStylePr w:type="band2Vert">
+      <w:tblPr/>
+      <w:tcPr>
+        <w:tcBorders>
+          <w:left w:val="single" w:sz="4" w:space="0" w:color="7F7F7F" w:themeColor="text1" w:themeTint="80"/>
+          <w:right w:val="single" w:sz="4" w:space="0" w:color="7F7F7F" w:themeColor="text1" w:themeTint="80"/>
+        </w:tcBorders>
+      </w:tcPr>
+    </w:tblStylePr>
+    <w:tblStylePr w:type="band1Horz">
+      <w:tblPr/>
+      <w:tcPr>
+        <w:tcBorders>
+          <w:top w:val="single" w:sz="4" w:space="0" w:color="7F7F7F" w:themeColor="text1" w:themeTint="80"/>
+          <w:bottom w:val="single" w:sz="4" w:space="0" w:color="7F7F7F" w:themeColor="text1" w:themeTint="80"/>
+        </w:tcBorders>
+      </w:tcPr>
+    </w:tblStylePr>
+  </w:style>
+  <w:style w:type="character" w:customStyle="1" w:styleId="Ttulo3Car">
+    <w:name w:val="Título 3 Car"/>
+    <w:basedOn w:val="Fuentedeprrafopredeter"/>
+    <w:link w:val="Ttulo3"/>
+    <w:uiPriority w:val="9"/>
+    <w:semiHidden/>
+    <w:rsid w:val="004232B1"/>
+    <w:rPr>
+      <w:caps/>
+      <w:color w:val="1F3763" w:themeColor="accent1" w:themeShade="7F"/>
+      <w:spacing w:val="15"/>
+    </w:rPr>
+  </w:style>
+  <w:style w:type="character" w:customStyle="1" w:styleId="Ttulo4Car">
+    <w:name w:val="Título 4 Car"/>
+    <w:basedOn w:val="Fuentedeprrafopredeter"/>
+    <w:link w:val="Ttulo4"/>
+    <w:uiPriority w:val="9"/>
+    <w:semiHidden/>
+    <w:rsid w:val="004232B1"/>
+    <w:rPr>
+      <w:caps/>
+      <w:color w:val="2F5496" w:themeColor="accent1" w:themeShade="BF"/>
+      <w:spacing w:val="10"/>
+    </w:rPr>
+  </w:style>
+  <w:style w:type="character" w:customStyle="1" w:styleId="Ttulo5Car">
+    <w:name w:val="Título 5 Car"/>
+    <w:basedOn w:val="Fuentedeprrafopredeter"/>
+    <w:link w:val="Ttulo5"/>
+    <w:uiPriority w:val="9"/>
+    <w:semiHidden/>
+    <w:rsid w:val="004232B1"/>
+    <w:rPr>
+      <w:caps/>
+      <w:color w:val="2F5496" w:themeColor="accent1" w:themeShade="BF"/>
+      <w:spacing w:val="10"/>
+    </w:rPr>
+  </w:style>
+  <w:style w:type="character" w:customStyle="1" w:styleId="Ttulo6Car">
+    <w:name w:val="Título 6 Car"/>
+    <w:basedOn w:val="Fuentedeprrafopredeter"/>
+    <w:link w:val="Ttulo6"/>
+    <w:uiPriority w:val="9"/>
+    <w:semiHidden/>
+    <w:rsid w:val="004232B1"/>
+    <w:rPr>
+      <w:caps/>
+      <w:color w:val="2F5496" w:themeColor="accent1" w:themeShade="BF"/>
+      <w:spacing w:val="10"/>
+    </w:rPr>
+  </w:style>
+  <w:style w:type="character" w:customStyle="1" w:styleId="Ttulo7Car">
+    <w:name w:val="Título 7 Car"/>
+    <w:basedOn w:val="Fuentedeprrafopredeter"/>
+    <w:link w:val="Ttulo7"/>
+    <w:uiPriority w:val="9"/>
+    <w:semiHidden/>
+    <w:rsid w:val="004232B1"/>
+    <w:rPr>
+      <w:caps/>
+      <w:color w:val="2F5496" w:themeColor="accent1" w:themeShade="BF"/>
+      <w:spacing w:val="10"/>
+    </w:rPr>
+  </w:style>
+  <w:style w:type="character" w:customStyle="1" w:styleId="Ttulo8Car">
+    <w:name w:val="Título 8 Car"/>
+    <w:basedOn w:val="Fuentedeprrafopredeter"/>
+    <w:link w:val="Ttulo8"/>
+    <w:uiPriority w:val="9"/>
+    <w:semiHidden/>
+    <w:rsid w:val="004232B1"/>
+    <w:rPr>
+      <w:caps/>
+      <w:spacing w:val="10"/>
+      <w:sz w:val="18"/>
+      <w:szCs w:val="18"/>
+    </w:rPr>
+  </w:style>
+  <w:style w:type="character" w:customStyle="1" w:styleId="Ttulo9Car">
+    <w:name w:val="Título 9 Car"/>
+    <w:basedOn w:val="Fuentedeprrafopredeter"/>
+    <w:link w:val="Ttulo9"/>
+    <w:uiPriority w:val="9"/>
+    <w:semiHidden/>
+    <w:rsid w:val="004232B1"/>
+    <w:rPr>
+      <w:i/>
+      <w:iCs/>
+      <w:caps/>
+      <w:spacing w:val="10"/>
+      <w:sz w:val="18"/>
+      <w:szCs w:val="18"/>
+    </w:rPr>
+  </w:style>
+  <w:style w:type="paragraph" w:styleId="Descripcin">
+    <w:name w:val="caption"/>
+    <w:basedOn w:val="Normal"/>
+    <w:next w:val="Normal"/>
+    <w:uiPriority w:val="35"/>
+    <w:semiHidden/>
+    <w:unhideWhenUsed/>
+    <w:qFormat/>
+    <w:rsid w:val="004232B1"/>
+    <w:rPr>
+      <w:b/>
+      <w:bCs/>
+      <w:color w:val="2F5496" w:themeColor="accent1" w:themeShade="BF"/>
+      <w:sz w:val="16"/>
+      <w:szCs w:val="16"/>
+    </w:rPr>
+  </w:style>
+  <w:style w:type="character" w:styleId="Textoennegrita">
+    <w:name w:val="Strong"/>
+    <w:uiPriority w:val="22"/>
+    <w:qFormat/>
+    <w:rsid w:val="004232B1"/>
+    <w:rPr>
+      <w:b/>
+      <w:bCs/>
+    </w:rPr>
+  </w:style>
+  <w:style w:type="character" w:styleId="nfasis">
+    <w:name w:val="Emphasis"/>
+    <w:uiPriority w:val="20"/>
+    <w:qFormat/>
+    <w:rsid w:val="004232B1"/>
+    <w:rPr>
+      <w:caps/>
+      <w:color w:val="1F3763" w:themeColor="accent1" w:themeShade="7F"/>
+      <w:spacing w:val="5"/>
+    </w:rPr>
+  </w:style>
+  <w:style w:type="paragraph" w:styleId="Sinespaciado">
+    <w:name w:val="No Spacing"/>
+    <w:uiPriority w:val="1"/>
+    <w:qFormat/>
+    <w:rsid w:val="004232B1"/>
+    <w:pPr>
+      <w:spacing w:after="0" w:line="240" w:lineRule="auto"/>
+    </w:pPr>
+  </w:style>
+  <w:style w:type="paragraph" w:styleId="Cita">
+    <w:name w:val="Quote"/>
+    <w:basedOn w:val="Normal"/>
+    <w:next w:val="Normal"/>
+    <w:link w:val="CitaCar"/>
+    <w:uiPriority w:val="29"/>
+    <w:qFormat/>
+    <w:rsid w:val="004232B1"/>
+    <w:rPr>
+      <w:i/>
+      <w:iCs/>
+      <w:sz w:val="24"/>
+      <w:szCs w:val="24"/>
+    </w:rPr>
+  </w:style>
+  <w:style w:type="character" w:customStyle="1" w:styleId="CitaCar">
+    <w:name w:val="Cita Car"/>
+    <w:basedOn w:val="Fuentedeprrafopredeter"/>
+    <w:link w:val="Cita"/>
+    <w:uiPriority w:val="29"/>
+    <w:rsid w:val="004232B1"/>
+    <w:rPr>
+      <w:i/>
+      <w:iCs/>
+      <w:sz w:val="24"/>
+      <w:szCs w:val="24"/>
+    </w:rPr>
+  </w:style>
+  <w:style w:type="paragraph" w:styleId="Citadestacada">
+    <w:name w:val="Intense Quote"/>
+    <w:basedOn w:val="Normal"/>
+    <w:next w:val="Normal"/>
+    <w:link w:val="CitadestacadaCar"/>
+    <w:uiPriority w:val="30"/>
+    <w:qFormat/>
+    <w:rsid w:val="004232B1"/>
+    <w:pPr>
+      <w:spacing w:before="240" w:after="240" w:line="240" w:lineRule="auto"/>
+      <w:ind w:left="1080" w:right="1080"/>
+      <w:jc w:val="center"/>
+    </w:pPr>
+    <w:rPr>
+      <w:color w:val="4472C4" w:themeColor="accent1"/>
+      <w:sz w:val="24"/>
+      <w:szCs w:val="24"/>
+    </w:rPr>
+  </w:style>
+  <w:style w:type="character" w:customStyle="1" w:styleId="CitadestacadaCar">
+    <w:name w:val="Cita destacada Car"/>
+    <w:basedOn w:val="Fuentedeprrafopredeter"/>
+    <w:link w:val="Citadestacada"/>
+    <w:uiPriority w:val="30"/>
+    <w:rsid w:val="004232B1"/>
+    <w:rPr>
+      <w:color w:val="4472C4" w:themeColor="accent1"/>
+      <w:sz w:val="24"/>
+      <w:szCs w:val="24"/>
+    </w:rPr>
+  </w:style>
+  <w:style w:type="character" w:styleId="nfasissutil">
+    <w:name w:val="Subtle Emphasis"/>
+    <w:uiPriority w:val="19"/>
+    <w:qFormat/>
+    <w:rsid w:val="004232B1"/>
+    <w:rPr>
+      <w:i/>
+      <w:iCs/>
+      <w:color w:val="1F3763" w:themeColor="accent1" w:themeShade="7F"/>
+    </w:rPr>
+  </w:style>
+  <w:style w:type="character" w:styleId="nfasisintenso">
+    <w:name w:val="Intense Emphasis"/>
+    <w:uiPriority w:val="21"/>
+    <w:qFormat/>
+    <w:rsid w:val="004232B1"/>
+    <w:rPr>
+      <w:b/>
+      <w:bCs/>
+      <w:caps/>
+      <w:color w:val="1F3763" w:themeColor="accent1" w:themeShade="7F"/>
+      <w:spacing w:val="10"/>
+    </w:rPr>
+  </w:style>
+  <w:style w:type="character" w:styleId="Referenciasutil">
+    <w:name w:val="Subtle Reference"/>
+    <w:uiPriority w:val="31"/>
+    <w:qFormat/>
+    <w:rsid w:val="004232B1"/>
+    <w:rPr>
+      <w:b/>
+      <w:bCs/>
+      <w:color w:val="4472C4" w:themeColor="accent1"/>
+    </w:rPr>
+  </w:style>
+  <w:style w:type="character" w:styleId="Referenciaintensa">
+    <w:name w:val="Intense Reference"/>
+    <w:uiPriority w:val="32"/>
+    <w:qFormat/>
+    <w:rsid w:val="004232B1"/>
+    <w:rPr>
+      <w:b/>
+      <w:bCs/>
+      <w:i/>
+      <w:iCs/>
+      <w:caps/>
+      <w:color w:val="4472C4" w:themeColor="accent1"/>
+    </w:rPr>
+  </w:style>
+  <w:style w:type="character" w:styleId="Ttulodellibro">
+    <w:name w:val="Book Title"/>
+    <w:uiPriority w:val="33"/>
+    <w:qFormat/>
+    <w:rsid w:val="004232B1"/>
+    <w:rPr>
+      <w:b/>
+      <w:bCs/>
+      <w:i/>
+      <w:iCs/>
+      <w:spacing w:val="0"/>
+    </w:rPr>
   </w:style>
 </w:styles>
 </file>

</xml_diff>

<commit_message>
Actualización de la documentación
</commit_message>
<xml_diff>
--- a/docs/Chatbot para DianSistemas.docx
+++ b/docs/Chatbot para DianSistemas.docx
@@ -55,7 +55,11 @@
       <w:sdtPr>
         <w:rPr>
           <w:rFonts w:eastAsiaTheme="minorHAnsi"/>
+          <w:caps w:val="0"/>
           <w:color w:val="auto"/>
+          <w:spacing w:val="0"/>
+          <w:sz w:val="20"/>
+          <w:szCs w:val="20"/>
         </w:rPr>
         <w:id w:val="-127783546"/>
         <w:docPartObj>
@@ -68,10 +72,6 @@
           <w:rFonts w:eastAsiaTheme="minorEastAsia"/>
           <w:b/>
           <w:bCs/>
-          <w:caps w:val="0"/>
-          <w:spacing w:val="0"/>
-          <w:sz w:val="20"/>
-          <w:szCs w:val="20"/>
         </w:rPr>
       </w:sdtEndPr>
       <w:sdtContent>
@@ -105,7 +105,7 @@
           <w:r>
             <w:fldChar w:fldCharType="separate"/>
           </w:r>
-          <w:hyperlink w:anchor="_Toc239929622" w:history="1">
+          <w:hyperlink w:anchor="_Toc241222020" w:history="1">
             <w:r>
               <w:rPr>
                 <w:rStyle w:val="Hipervnculo"/>
@@ -132,7 +132,7 @@
                 <w:noProof/>
                 <w:webHidden/>
               </w:rPr>
-              <w:instrText xml:space="preserve"> PAGEREF _Toc239929622 \h </w:instrText>
+              <w:instrText xml:space="preserve"> PAGEREF _Toc241222020 \h </w:instrText>
             </w:r>
             <w:r>
               <w:rPr>
@@ -176,7 +176,7 @@
               <w:lang w:eastAsia="es-ES"/>
             </w:rPr>
           </w:pPr>
-          <w:hyperlink w:anchor="_Toc239929623" w:history="1">
+          <w:hyperlink w:anchor="_Toc241222021" w:history="1">
             <w:r>
               <w:rPr>
                 <w:rStyle w:val="Hipervnculo"/>
@@ -203,7 +203,7 @@
                 <w:noProof/>
                 <w:webHidden/>
               </w:rPr>
-              <w:instrText xml:space="preserve"> PAGEREF _Toc239929623 \h </w:instrText>
+              <w:instrText xml:space="preserve"> PAGEREF _Toc241222021 \h </w:instrText>
             </w:r>
             <w:r>
               <w:rPr>
@@ -247,7 +247,7 @@
               <w:lang w:eastAsia="es-ES"/>
             </w:rPr>
           </w:pPr>
-          <w:hyperlink w:anchor="_Toc239929624" w:history="1">
+          <w:hyperlink w:anchor="_Toc241222022" w:history="1">
             <w:r>
               <w:rPr>
                 <w:rStyle w:val="Hipervnculo"/>
@@ -274,7 +274,7 @@
                 <w:noProof/>
                 <w:webHidden/>
               </w:rPr>
-              <w:instrText xml:space="preserve"> PAGEREF _Toc239929624 \h </w:instrText>
+              <w:instrText xml:space="preserve"> PAGEREF _Toc241222022 \h </w:instrText>
             </w:r>
             <w:r>
               <w:rPr>
@@ -318,7 +318,7 @@
               <w:lang w:eastAsia="es-ES"/>
             </w:rPr>
           </w:pPr>
-          <w:hyperlink w:anchor="_Toc239929625" w:history="1">
+          <w:hyperlink w:anchor="_Toc241222023" w:history="1">
             <w:r>
               <w:rPr>
                 <w:rStyle w:val="Hipervnculo"/>
@@ -345,7 +345,7 @@
                 <w:noProof/>
                 <w:webHidden/>
               </w:rPr>
-              <w:instrText xml:space="preserve"> PAGEREF _Toc239929625 \h </w:instrText>
+              <w:instrText xml:space="preserve"> PAGEREF _Toc241222023 \h </w:instrText>
             </w:r>
             <w:r>
               <w:rPr>
@@ -389,7 +389,7 @@
               <w:lang w:eastAsia="es-ES"/>
             </w:rPr>
           </w:pPr>
-          <w:hyperlink w:anchor="_Toc239929626" w:history="1">
+          <w:hyperlink w:anchor="_Toc241222024" w:history="1">
             <w:r>
               <w:rPr>
                 <w:rStyle w:val="Hipervnculo"/>
@@ -416,7 +416,7 @@
                 <w:noProof/>
                 <w:webHidden/>
               </w:rPr>
-              <w:instrText xml:space="preserve"> PAGEREF _Toc239929626 \h </w:instrText>
+              <w:instrText xml:space="preserve"> PAGEREF _Toc241222024 \h </w:instrText>
             </w:r>
             <w:r>
               <w:rPr>
@@ -460,7 +460,7 @@
               <w:lang w:eastAsia="es-ES"/>
             </w:rPr>
           </w:pPr>
-          <w:hyperlink w:anchor="_Toc239929627" w:history="1">
+          <w:hyperlink w:anchor="_Toc241222025" w:history="1">
             <w:r>
               <w:rPr>
                 <w:rStyle w:val="Hipervnculo"/>
@@ -487,7 +487,7 @@
                 <w:noProof/>
                 <w:webHidden/>
               </w:rPr>
-              <w:instrText xml:space="preserve"> PAGEREF _Toc239929627 \h </w:instrText>
+              <w:instrText xml:space="preserve"> PAGEREF _Toc241222025 \h </w:instrText>
             </w:r>
             <w:r>
               <w:rPr>
@@ -531,7 +531,7 @@
               <w:lang w:eastAsia="es-ES"/>
             </w:rPr>
           </w:pPr>
-          <w:hyperlink w:anchor="_Toc239929628" w:history="1">
+          <w:hyperlink w:anchor="_Toc241222026" w:history="1">
             <w:r>
               <w:rPr>
                 <w:rStyle w:val="Hipervnculo"/>
@@ -558,7 +558,78 @@
                 <w:noProof/>
                 <w:webHidden/>
               </w:rPr>
-              <w:instrText xml:space="preserve"> PAGEREF _Toc239929628 \h </w:instrText>
+              <w:instrText xml:space="preserve"> PAGEREF _Toc241222026 \h </w:instrText>
+            </w:r>
+            <w:r>
+              <w:rPr>
+                <w:noProof/>
+                <w:webHidden/>
+              </w:rPr>
+            </w:r>
+            <w:r>
+              <w:rPr>
+                <w:noProof/>
+                <w:webHidden/>
+              </w:rPr>
+              <w:fldChar w:fldCharType="separate"/>
+            </w:r>
+            <w:r>
+              <w:rPr>
+                <w:noProof/>
+                <w:webHidden/>
+              </w:rPr>
+              <w:t>4</w:t>
+            </w:r>
+            <w:r>
+              <w:rPr>
+                <w:noProof/>
+                <w:webHidden/>
+              </w:rPr>
+              <w:fldChar w:fldCharType="end"/>
+            </w:r>
+          </w:hyperlink>
+        </w:p>
+        <w:p>
+          <w:pPr>
+            <w:pStyle w:val="TDC2"/>
+            <w:tabs>
+              <w:tab w:val="right" w:leader="dot" w:pos="8494"/>
+            </w:tabs>
+            <w:rPr>
+              <w:noProof/>
+              <w:sz w:val="22"/>
+              <w:szCs w:val="22"/>
+              <w:lang w:eastAsia="es-ES"/>
+            </w:rPr>
+          </w:pPr>
+          <w:hyperlink w:anchor="_Toc241222027" w:history="1">
+            <w:r>
+              <w:rPr>
+                <w:rStyle w:val="Hipervnculo"/>
+                <w:noProof/>
+              </w:rPr>
+              <w:t>Ollama y Llama3.2</w:t>
+            </w:r>
+            <w:r>
+              <w:rPr>
+                <w:noProof/>
+                <w:webHidden/>
+              </w:rPr>
+              <w:tab/>
+            </w:r>
+            <w:r>
+              <w:rPr>
+                <w:noProof/>
+                <w:webHidden/>
+              </w:rPr>
+              <w:fldChar w:fldCharType="begin"/>
+            </w:r>
+            <w:r>
+              <w:rPr>
+                <w:noProof/>
+                <w:webHidden/>
+              </w:rPr>
+              <w:instrText xml:space="preserve"> PAGEREF _Toc241222027 \h </w:instrText>
             </w:r>
             <w:r>
               <w:rPr>
@@ -602,7 +673,7 @@
               <w:lang w:eastAsia="es-ES"/>
             </w:rPr>
           </w:pPr>
-          <w:hyperlink w:anchor="_Toc239929629" w:history="1">
+          <w:hyperlink w:anchor="_Toc241222028" w:history="1">
             <w:r>
               <w:rPr>
                 <w:rStyle w:val="Hipervnculo"/>
@@ -629,7 +700,7 @@
                 <w:noProof/>
                 <w:webHidden/>
               </w:rPr>
-              <w:instrText xml:space="preserve"> PAGEREF _Toc239929629 \h </w:instrText>
+              <w:instrText xml:space="preserve"> PAGEREF _Toc241222028 \h </w:instrText>
             </w:r>
             <w:r>
               <w:rPr>
@@ -673,7 +744,7 @@
               <w:lang w:eastAsia="es-ES"/>
             </w:rPr>
           </w:pPr>
-          <w:hyperlink w:anchor="_Toc239929630" w:history="1">
+          <w:hyperlink w:anchor="_Toc241222029" w:history="1">
             <w:r>
               <w:rPr>
                 <w:rStyle w:val="Hipervnculo"/>
@@ -700,7 +771,7 @@
                 <w:noProof/>
                 <w:webHidden/>
               </w:rPr>
-              <w:instrText xml:space="preserve"> PAGEREF _Toc239929630 \h </w:instrText>
+              <w:instrText xml:space="preserve"> PAGEREF _Toc241222029 \h </w:instrText>
             </w:r>
             <w:r>
               <w:rPr>
@@ -744,7 +815,7 @@
               <w:lang w:eastAsia="es-ES"/>
             </w:rPr>
           </w:pPr>
-          <w:hyperlink w:anchor="_Toc239929631" w:history="1">
+          <w:hyperlink w:anchor="_Toc241222030" w:history="1">
             <w:r>
               <w:rPr>
                 <w:rStyle w:val="Hipervnculo"/>
@@ -771,7 +842,7 @@
                 <w:noProof/>
                 <w:webHidden/>
               </w:rPr>
-              <w:instrText xml:space="preserve"> PAGEREF _Toc239929631 \h </w:instrText>
+              <w:instrText xml:space="preserve"> PAGEREF _Toc241222030 \h </w:instrText>
             </w:r>
             <w:r>
               <w:rPr>
@@ -791,7 +862,7 @@
                 <w:noProof/>
                 <w:webHidden/>
               </w:rPr>
-              <w:t>5</w:t>
+              <w:t>6</w:t>
             </w:r>
             <w:r>
               <w:rPr>
@@ -815,7 +886,7 @@
               <w:lang w:eastAsia="es-ES"/>
             </w:rPr>
           </w:pPr>
-          <w:hyperlink w:anchor="_Toc239929632" w:history="1">
+          <w:hyperlink w:anchor="_Toc241222031" w:history="1">
             <w:r>
               <w:rPr>
                 <w:rStyle w:val="Hipervnculo"/>
@@ -842,7 +913,7 @@
                 <w:noProof/>
                 <w:webHidden/>
               </w:rPr>
-              <w:instrText xml:space="preserve"> PAGEREF _Toc239929632 \h </w:instrText>
+              <w:instrText xml:space="preserve"> PAGEREF _Toc241222031 \h </w:instrText>
             </w:r>
             <w:r>
               <w:rPr>
@@ -862,7 +933,7 @@
                 <w:noProof/>
                 <w:webHidden/>
               </w:rPr>
-              <w:t>5</w:t>
+              <w:t>6</w:t>
             </w:r>
             <w:r>
               <w:rPr>
@@ -886,7 +957,7 @@
               <w:lang w:eastAsia="es-ES"/>
             </w:rPr>
           </w:pPr>
-          <w:hyperlink w:anchor="_Toc239929633" w:history="1">
+          <w:hyperlink w:anchor="_Toc241222032" w:history="1">
             <w:r>
               <w:rPr>
                 <w:rStyle w:val="Hipervnculo"/>
@@ -913,7 +984,7 @@
                 <w:noProof/>
                 <w:webHidden/>
               </w:rPr>
-              <w:instrText xml:space="preserve"> PAGEREF _Toc239929633 \h </w:instrText>
+              <w:instrText xml:space="preserve"> PAGEREF _Toc241222032 \h </w:instrText>
             </w:r>
             <w:r>
               <w:rPr>
@@ -933,7 +1004,7 @@
                 <w:noProof/>
                 <w:webHidden/>
               </w:rPr>
-              <w:t>5</w:t>
+              <w:t>6</w:t>
             </w:r>
             <w:r>
               <w:rPr>
@@ -957,7 +1028,7 @@
               <w:lang w:eastAsia="es-ES"/>
             </w:rPr>
           </w:pPr>
-          <w:hyperlink w:anchor="_Toc239929634" w:history="1">
+          <w:hyperlink w:anchor="_Toc241222033" w:history="1">
             <w:r>
               <w:rPr>
                 <w:rStyle w:val="Hipervnculo"/>
@@ -984,7 +1055,7 @@
                 <w:noProof/>
                 <w:webHidden/>
               </w:rPr>
-              <w:instrText xml:space="preserve"> PAGEREF _Toc239929634 \h </w:instrText>
+              <w:instrText xml:space="preserve"> PAGEREF _Toc241222033 \h </w:instrText>
             </w:r>
             <w:r>
               <w:rPr>
@@ -1004,7 +1075,7 @@
                 <w:noProof/>
                 <w:webHidden/>
               </w:rPr>
-              <w:t>5</w:t>
+              <w:t>6</w:t>
             </w:r>
             <w:r>
               <w:rPr>
@@ -1028,7 +1099,7 @@
               <w:lang w:eastAsia="es-ES"/>
             </w:rPr>
           </w:pPr>
-          <w:hyperlink w:anchor="_Toc239929635" w:history="1">
+          <w:hyperlink w:anchor="_Toc241222034" w:history="1">
             <w:r>
               <w:rPr>
                 <w:rStyle w:val="Hipervnculo"/>
@@ -1055,7 +1126,7 @@
                 <w:noProof/>
                 <w:webHidden/>
               </w:rPr>
-              <w:instrText xml:space="preserve"> PAGEREF _Toc239929635 \h </w:instrText>
+              <w:instrText xml:space="preserve"> PAGEREF _Toc241222034 \h </w:instrText>
             </w:r>
             <w:r>
               <w:rPr>
@@ -1075,7 +1146,7 @@
                 <w:noProof/>
                 <w:webHidden/>
               </w:rPr>
-              <w:t>5</w:t>
+              <w:t>6</w:t>
             </w:r>
             <w:r>
               <w:rPr>
@@ -1099,7 +1170,7 @@
               <w:lang w:eastAsia="es-ES"/>
             </w:rPr>
           </w:pPr>
-          <w:hyperlink w:anchor="_Toc239929636" w:history="1">
+          <w:hyperlink w:anchor="_Toc241222035" w:history="1">
             <w:r>
               <w:rPr>
                 <w:rStyle w:val="Hipervnculo"/>
@@ -1126,7 +1197,7 @@
                 <w:noProof/>
                 <w:webHidden/>
               </w:rPr>
-              <w:instrText xml:space="preserve"> PAGEREF _Toc239929636 \h </w:instrText>
+              <w:instrText xml:space="preserve"> PAGEREF _Toc241222035 \h </w:instrText>
             </w:r>
             <w:r>
               <w:rPr>
@@ -1146,7 +1217,7 @@
                 <w:noProof/>
                 <w:webHidden/>
               </w:rPr>
-              <w:t>5</w:t>
+              <w:t>6</w:t>
             </w:r>
             <w:r>
               <w:rPr>
@@ -1170,13 +1241,13 @@
               <w:lang w:eastAsia="es-ES"/>
             </w:rPr>
           </w:pPr>
-          <w:hyperlink w:anchor="_Toc239929637" w:history="1">
+          <w:hyperlink w:anchor="_Toc241222036" w:history="1">
             <w:r>
               <w:rPr>
                 <w:rStyle w:val="Hipervnculo"/>
                 <w:noProof/>
               </w:rPr>
-              <w:t>Línea de tiempo</w:t>
+              <w:t>Seguridad</w:t>
             </w:r>
             <w:r>
               <w:rPr>
@@ -1197,7 +1268,7 @@
                 <w:noProof/>
                 <w:webHidden/>
               </w:rPr>
-              <w:instrText xml:space="preserve"> PAGEREF _Toc239929637 \h </w:instrText>
+              <w:instrText xml:space="preserve"> PAGEREF _Toc241222036 \h </w:instrText>
             </w:r>
             <w:r>
               <w:rPr>
@@ -1217,7 +1288,7 @@
                 <w:noProof/>
                 <w:webHidden/>
               </w:rPr>
-              <w:t>5</w:t>
+              <w:t>6</w:t>
             </w:r>
             <w:r>
               <w:rPr>
@@ -1241,13 +1312,13 @@
               <w:lang w:eastAsia="es-ES"/>
             </w:rPr>
           </w:pPr>
-          <w:hyperlink w:anchor="_Toc239929638" w:history="1">
+          <w:hyperlink w:anchor="_Toc241222037" w:history="1">
             <w:r>
               <w:rPr>
                 <w:rStyle w:val="Hipervnculo"/>
                 <w:noProof/>
               </w:rPr>
-              <w:t>Próximos pasos posibles</w:t>
+              <w:t>Línea de tiempo</w:t>
             </w:r>
             <w:r>
               <w:rPr>
@@ -1268,7 +1339,7 @@
                 <w:noProof/>
                 <w:webHidden/>
               </w:rPr>
-              <w:instrText xml:space="preserve"> PAGEREF _Toc239929638 \h </w:instrText>
+              <w:instrText xml:space="preserve"> PAGEREF _Toc241222037 \h </w:instrText>
             </w:r>
             <w:r>
               <w:rPr>
@@ -1288,7 +1359,7 @@
                 <w:noProof/>
                 <w:webHidden/>
               </w:rPr>
-              <w:t>6</w:t>
+              <w:t>7</w:t>
             </w:r>
             <w:r>
               <w:rPr>
@@ -1312,12 +1383,83 @@
               <w:lang w:eastAsia="es-ES"/>
             </w:rPr>
           </w:pPr>
-          <w:hyperlink w:anchor="_Toc239929639" w:history="1">
+          <w:hyperlink w:anchor="_Toc241222038" w:history="1">
             <w:r>
               <w:rPr>
                 <w:rStyle w:val="Hipervnculo"/>
                 <w:noProof/>
               </w:rPr>
+              <w:t>Próximos pasos posibles</w:t>
+            </w:r>
+            <w:r>
+              <w:rPr>
+                <w:noProof/>
+                <w:webHidden/>
+              </w:rPr>
+              <w:tab/>
+            </w:r>
+            <w:r>
+              <w:rPr>
+                <w:noProof/>
+                <w:webHidden/>
+              </w:rPr>
+              <w:fldChar w:fldCharType="begin"/>
+            </w:r>
+            <w:r>
+              <w:rPr>
+                <w:noProof/>
+                <w:webHidden/>
+              </w:rPr>
+              <w:instrText xml:space="preserve"> PAGEREF _Toc241222038 \h </w:instrText>
+            </w:r>
+            <w:r>
+              <w:rPr>
+                <w:noProof/>
+                <w:webHidden/>
+              </w:rPr>
+            </w:r>
+            <w:r>
+              <w:rPr>
+                <w:noProof/>
+                <w:webHidden/>
+              </w:rPr>
+              <w:fldChar w:fldCharType="separate"/>
+            </w:r>
+            <w:r>
+              <w:rPr>
+                <w:noProof/>
+                <w:webHidden/>
+              </w:rPr>
+              <w:t>7</w:t>
+            </w:r>
+            <w:r>
+              <w:rPr>
+                <w:noProof/>
+                <w:webHidden/>
+              </w:rPr>
+              <w:fldChar w:fldCharType="end"/>
+            </w:r>
+          </w:hyperlink>
+        </w:p>
+        <w:p>
+          <w:pPr>
+            <w:pStyle w:val="TDC1"/>
+            <w:tabs>
+              <w:tab w:val="right" w:leader="dot" w:pos="8494"/>
+            </w:tabs>
+            <w:rPr>
+              <w:noProof/>
+              <w:sz w:val="22"/>
+              <w:szCs w:val="22"/>
+              <w:lang w:eastAsia="es-ES"/>
+            </w:rPr>
+          </w:pPr>
+          <w:hyperlink w:anchor="_Toc241222039" w:history="1">
+            <w:r>
+              <w:rPr>
+                <w:rStyle w:val="Hipervnculo"/>
+                <w:noProof/>
+              </w:rPr>
               <w:t>Glosario</w:t>
             </w:r>
             <w:r>
@@ -1339,7 +1481,7 @@
                 <w:noProof/>
                 <w:webHidden/>
               </w:rPr>
-              <w:instrText xml:space="preserve"> PAGEREF _Toc239929639 \h </w:instrText>
+              <w:instrText xml:space="preserve"> PAGEREF _Toc241222039 \h </w:instrText>
             </w:r>
             <w:r>
               <w:rPr>
@@ -1359,7 +1501,7 @@
                 <w:noProof/>
                 <w:webHidden/>
               </w:rPr>
-              <w:t>6</w:t>
+              <w:t>8</w:t>
             </w:r>
             <w:r>
               <w:rPr>
@@ -1401,7 +1543,7 @@
       <w:pPr>
         <w:pStyle w:val="Ttulo1"/>
       </w:pPr>
-      <w:bookmarkStart w:id="0" w:name="_Toc239929622"/>
+      <w:bookmarkStart w:id="0" w:name="_Toc241222020"/>
       <w:r>
         <w:lastRenderedPageBreak/>
         <w:t>Descripción general</w:t>
@@ -1425,7 +1567,7 @@
       <w:pPr>
         <w:pStyle w:val="Ttulo1"/>
       </w:pPr>
-      <w:bookmarkStart w:id="1" w:name="_Toc239929623"/>
+      <w:bookmarkStart w:id="1" w:name="_Toc241222021"/>
       <w:r>
         <w:t>Objetivos básicos</w:t>
       </w:r>
@@ -1485,7 +1627,7 @@
       <w:pPr>
         <w:pStyle w:val="Ttulo1"/>
       </w:pPr>
-      <w:bookmarkStart w:id="2" w:name="_Toc239929624"/>
+      <w:bookmarkStart w:id="2" w:name="_Toc241222022"/>
       <w:r>
         <w:t>Tecnologías</w:t>
       </w:r>
@@ -1497,7 +1639,7 @@
         <w:spacing w:before="180" w:after="100"/>
       </w:pPr>
       <w:bookmarkStart w:id="3" w:name="_Toc239927601"/>
-      <w:bookmarkStart w:id="4" w:name="_Toc239929625"/>
+      <w:bookmarkStart w:id="4" w:name="_Toc241222023"/>
       <w:r>
         <w:t>Python</w:t>
       </w:r>
@@ -1524,7 +1666,7 @@
         <w:spacing w:before="180" w:after="100"/>
       </w:pPr>
       <w:bookmarkStart w:id="5" w:name="_Toc239927602"/>
-      <w:bookmarkStart w:id="6" w:name="_Toc239929626"/>
+      <w:bookmarkStart w:id="6" w:name="_Toc241222024"/>
       <w:r>
         <w:t>Django</w:t>
       </w:r>
@@ -1545,7 +1687,7 @@
         <w:spacing w:before="180" w:after="100"/>
       </w:pPr>
       <w:bookmarkStart w:id="7" w:name="_Toc239927603"/>
-      <w:bookmarkStart w:id="8" w:name="_Toc239929627"/>
+      <w:bookmarkStart w:id="8" w:name="_Toc241222025"/>
       <w:r>
         <w:t>Bootstrap5</w:t>
       </w:r>
@@ -1579,7 +1721,7 @@
         <w:spacing w:before="180" w:after="100"/>
       </w:pPr>
       <w:bookmarkStart w:id="9" w:name="_Toc239927604"/>
-      <w:bookmarkStart w:id="10" w:name="_Toc239929628"/>
+      <w:bookmarkStart w:id="10" w:name="_Toc241222026"/>
       <w:r>
         <w:lastRenderedPageBreak/>
         <w:t>spaCy</w:t>
@@ -1602,13 +1744,50 @@
     </w:p>
     <w:p>
       <w:pPr>
+        <w:pStyle w:val="Ttulo2"/>
+        <w:spacing w:before="180" w:after="100"/>
+      </w:pPr>
+      <w:bookmarkStart w:id="11" w:name="_Toc900000001"/>
+      <w:bookmarkStart w:id="12" w:name="_Toc241222027"/>
+      <w:r>
+        <w:t>Ollama y Llama3.2</w:t>
+      </w:r>
+      <w:bookmarkEnd w:id="11"/>
+      <w:bookmarkEnd w:id="12"/>
+    </w:p>
+    <w:p>
+      <w:pPr>
+        <w:spacing w:after="160"/>
+      </w:pPr>
+      <w:r>
+        <w:t>Ollama es la herramienta que se usa para ejecutar en local el modelo de lenguaje Llama3.2, exponiéndolo mediante una API que el backend Django consulta para generar las respuestas del chatbot en lenguaje natural.</w:t>
+      </w:r>
+    </w:p>
+    <w:p>
+      <w:pPr>
+        <w:spacing w:after="160"/>
+      </w:pPr>
+      <w:r>
+        <w:t xml:space="preserve">En vez de un único modelo genérico, el proyecto usa tres modelos separados, cada uno especializado en un tipo de respuesta; en función de la intención detectada por spaCy (consulta técnica, compra u otra), se selecciona el modelo de Ollama adecuado para generar la respuesta al usuario, lo que permite respuestas más ajustadas a cada caso que un único </w:t>
+      </w:r>
+      <w:proofErr w:type="spellStart"/>
+      <w:r>
+        <w:t>prompt</w:t>
+      </w:r>
+      <w:proofErr w:type="spellEnd"/>
+      <w:r>
+        <w:t xml:space="preserve"> genérico.</w:t>
+      </w:r>
+    </w:p>
+    <w:p>
+      <w:pPr>
         <w:pStyle w:val="Ttulo1"/>
       </w:pPr>
-      <w:bookmarkStart w:id="11" w:name="_Toc239929629"/>
+      <w:bookmarkStart w:id="13" w:name="_Toc241222028"/>
       <w:r>
         <w:t>Almacenaje de datos</w:t>
       </w:r>
-      <w:bookmarkEnd w:id="11"/>
+      <w:bookmarkEnd w:id="13"/>
     </w:p>
     <w:p>
       <w:pPr>
@@ -1619,24 +1798,24 @@
       </w:r>
     </w:p>
     <w:p>
-      <w:pPr>
-        <w:rPr>
-          <w:u w:val="single"/>
-        </w:rPr>
-      </w:pPr>
       <w:r>
         <w:t>SQLite tiene limitaciones de concurrencia que la hacen poco recomendable para un entorno de producción con varias conversaciones simultáneas, por lo que, como ya se recoge en el apartado de próximos pasos, está prevista una migración a un motor como PostgreSQL antes del despliegue definitivo, apoyándose en el sistema de migraciones de Django para no perder los datos ya almacenados.</w:t>
       </w:r>
     </w:p>
     <w:p>
+      <w:r>
+        <w:t>En la capeta de documentación del proyecto está el diagrama ER que hemos utilizado.</w:t>
+      </w:r>
+    </w:p>
+    <w:p>
       <w:pPr>
         <w:pStyle w:val="Ttulo1"/>
       </w:pPr>
-      <w:bookmarkStart w:id="12" w:name="_Toc239929630"/>
+      <w:bookmarkStart w:id="14" w:name="_Toc241222029"/>
       <w:r>
         <w:t>Arquitectura general</w:t>
       </w:r>
-      <w:bookmarkEnd w:id="12"/>
+      <w:bookmarkEnd w:id="14"/>
     </w:p>
     <w:p/>
     <w:p>
@@ -1689,11 +1868,12 @@
     </w:p>
     <w:p>
       <w:r>
-        <w:t>El diagrama resume el flujo de una conversación: el usuario interactúa con el widget incrustado mediante el iframe en la web de Dian Sistemas; las peticiones llegan al backend Django, donde la app Core gestiona la lógica del widget y delega en la app Entrenamiento el procesamiento del mensaje con spaCy; el resultado (intención detectada y respuesta) se guarda a través de la app Chat, y cuando corresponde, la app Notificaciones genera el resumen y lo envía al departamento adecuado.</w:t>
-      </w:r>
-    </w:p>
-    <w:p>
-      <w:r>
+        <w:t>El diagrama resume el flujo de una conversación: el usuario interactúa con el widget incrustado mediante el iframe en la web de Dian Sistemas; las peticiones llegan al backend Django, donde la app Core gestiona la lógica del widget y delega en la app Entrenamiento el procesamiento del mensaje con spaCy; según la intención detectada, se elige uno de los tres modelos de Llama3.2 servidos con Ollama para generar la respuesta; el resultado (intención detectada y respuesta) se guarda a través de la app Chat, y cuando corresponde, la app Notificaciones genera el resumen y lo envía al departamento adecuado.</w:t>
+      </w:r>
+    </w:p>
+    <w:p>
+      <w:r>
+        <w:lastRenderedPageBreak/>
         <w:br w:type="page"/>
       </w:r>
     </w:p>
@@ -1701,25 +1881,25 @@
       <w:pPr>
         <w:pStyle w:val="Ttulo1"/>
       </w:pPr>
-      <w:bookmarkStart w:id="13" w:name="_Toc239929631"/>
+      <w:bookmarkStart w:id="15" w:name="_Toc241222030"/>
       <w:r>
         <w:lastRenderedPageBreak/>
         <w:t>Aplicaciones del proyecto</w:t>
       </w:r>
-      <w:bookmarkEnd w:id="13"/>
+      <w:bookmarkEnd w:id="15"/>
     </w:p>
     <w:p>
       <w:pPr>
         <w:pStyle w:val="Ttulo2"/>
         <w:spacing w:before="180" w:after="100"/>
       </w:pPr>
-      <w:bookmarkStart w:id="14" w:name="_Toc239927608"/>
-      <w:bookmarkStart w:id="15" w:name="_Toc239929632"/>
+      <w:bookmarkStart w:id="16" w:name="_Toc239927608"/>
+      <w:bookmarkStart w:id="17" w:name="_Toc241222031"/>
       <w:r>
         <w:t>Core</w:t>
       </w:r>
-      <w:bookmarkEnd w:id="14"/>
-      <w:bookmarkEnd w:id="15"/>
+      <w:bookmarkEnd w:id="16"/>
+      <w:bookmarkEnd w:id="17"/>
     </w:p>
     <w:p>
       <w:pPr>
@@ -1734,13 +1914,13 @@
         <w:pStyle w:val="Ttulo2"/>
         <w:spacing w:before="180" w:after="100"/>
       </w:pPr>
-      <w:bookmarkStart w:id="16" w:name="_Toc239927609"/>
-      <w:bookmarkStart w:id="17" w:name="_Toc239929633"/>
+      <w:bookmarkStart w:id="18" w:name="_Toc239927609"/>
+      <w:bookmarkStart w:id="19" w:name="_Toc241222032"/>
       <w:r>
         <w:t>Chat</w:t>
       </w:r>
-      <w:bookmarkEnd w:id="16"/>
-      <w:bookmarkEnd w:id="17"/>
+      <w:bookmarkEnd w:id="18"/>
+      <w:bookmarkEnd w:id="19"/>
     </w:p>
     <w:p>
       <w:pPr>
@@ -1755,26 +1935,20 @@
         <w:pStyle w:val="Ttulo2"/>
         <w:spacing w:before="180" w:after="100"/>
       </w:pPr>
-      <w:bookmarkStart w:id="18" w:name="_Toc239927610"/>
-      <w:bookmarkStart w:id="19" w:name="_Toc239929634"/>
+      <w:bookmarkStart w:id="20" w:name="_Toc239927610"/>
+      <w:bookmarkStart w:id="21" w:name="_Toc241222033"/>
       <w:r>
         <w:t>Entrenamiento</w:t>
       </w:r>
-      <w:bookmarkEnd w:id="18"/>
-      <w:bookmarkEnd w:id="19"/>
+      <w:bookmarkEnd w:id="20"/>
+      <w:bookmarkEnd w:id="21"/>
     </w:p>
     <w:p>
       <w:pPr>
         <w:spacing w:after="160"/>
       </w:pPr>
       <w:r>
-        <w:t>Contiene los datos y la lógica de entrenamiento para el chatbot: el corpus de frases de ejemplo por intención, la configuración del pipeline de spaCy, los scripts para reentrenar el modelo</w:t>
-      </w:r>
-      <w:r>
-        <w:t xml:space="preserve"> </w:t>
-      </w:r>
-      <w:r>
-        <w:t>cuando se añaden nuevos datos, y el modelo entrenado que usan las demás apps en tiempo real.</w:t>
+        <w:t>Contiene los datos y la lógica de entrenamiento para el chatbot: el corpus de frases de ejemplo por intención, la configuración del pipeline de spaCy, los scripts para reentrenar el modelo cuando se añaden nuevos datos, y el modelo entrenado que usan las demás apps en tiempo real.</w:t>
       </w:r>
     </w:p>
     <w:p>
@@ -1782,13 +1956,13 @@
         <w:pStyle w:val="Ttulo2"/>
         <w:spacing w:before="180" w:after="100"/>
       </w:pPr>
-      <w:bookmarkStart w:id="20" w:name="_Toc239927611"/>
-      <w:bookmarkStart w:id="21" w:name="_Toc239929635"/>
+      <w:bookmarkStart w:id="22" w:name="_Toc239927611"/>
+      <w:bookmarkStart w:id="23" w:name="_Toc241222034"/>
       <w:r>
         <w:t>Notificaciones</w:t>
       </w:r>
-      <w:bookmarkEnd w:id="20"/>
-      <w:bookmarkEnd w:id="21"/>
+      <w:bookmarkEnd w:id="22"/>
+      <w:bookmarkEnd w:id="23"/>
     </w:p>
     <w:p>
       <w:r>
@@ -1799,11 +1973,11 @@
       <w:pPr>
         <w:pStyle w:val="Ttulo1"/>
       </w:pPr>
-      <w:bookmarkStart w:id="22" w:name="_Toc239929636"/>
+      <w:bookmarkStart w:id="24" w:name="_Toc241222035"/>
       <w:r>
         <w:t>Clasificación de mensajes con spaCy</w:t>
       </w:r>
-      <w:bookmarkEnd w:id="22"/>
+      <w:bookmarkEnd w:id="24"/>
     </w:p>
     <w:p>
       <w:pPr>
@@ -1850,11 +2024,67 @@
       <w:pPr>
         <w:pStyle w:val="Ttulo1"/>
       </w:pPr>
-      <w:bookmarkStart w:id="23" w:name="_Toc239929637"/>
-      <w:r>
+      <w:bookmarkStart w:id="25" w:name="_Toc900000002"/>
+      <w:bookmarkStart w:id="26" w:name="_Toc241222036"/>
+      <w:r>
+        <w:t>Seguridad</w:t>
+      </w:r>
+      <w:bookmarkEnd w:id="25"/>
+      <w:bookmarkEnd w:id="26"/>
+    </w:p>
+    <w:p>
+      <w:pPr>
+        <w:spacing w:after="160"/>
+      </w:pPr>
+      <w:r>
+        <w:t xml:space="preserve">Para controlar qué páginas externas pueden incrustar el widget, la app Core implementa un </w:t>
+      </w:r>
+      <w:proofErr w:type="spellStart"/>
+      <w:r>
+        <w:t>mixin</w:t>
+      </w:r>
+      <w:proofErr w:type="spellEnd"/>
+      <w:r>
+        <w:t xml:space="preserve"> de Django que se aplica a la vista servida dentro del iframe. Antes de devolver la respuesta, el </w:t>
+      </w:r>
+      <w:proofErr w:type="spellStart"/>
+      <w:r>
+        <w:t>mixin</w:t>
+      </w:r>
+      <w:proofErr w:type="spellEnd"/>
+      <w:r>
+        <w:t xml:space="preserve"> comprueba el dominio de origen de la petición contra la lista configurada en settings.py mediante la variable DOMINIOS_</w:t>
+      </w:r>
+      <w:r>
+        <w:t>PERMITIDOS</w:t>
+      </w:r>
+      <w:r>
+        <w:t xml:space="preserve"> (cargada a su vez desde el .</w:t>
+      </w:r>
+      <w:proofErr w:type="spellStart"/>
+      <w:r>
+        <w:t>env</w:t>
+      </w:r>
+      <w:proofErr w:type="spellEnd"/>
+      <w:r>
+        <w:t>), y rechaza la petición si el dominio no está autorizado.</w:t>
+      </w:r>
+    </w:p>
+    <w:p>
+      <w:r>
+        <w:br w:type="page"/>
+      </w:r>
+    </w:p>
+    <w:p>
+      <w:pPr>
+        <w:pStyle w:val="Ttulo1"/>
+      </w:pPr>
+      <w:bookmarkStart w:id="27" w:name="_Toc241222037"/>
+      <w:r>
+        <w:lastRenderedPageBreak/>
         <w:t>Línea de tiempo</w:t>
       </w:r>
-      <w:bookmarkEnd w:id="23"/>
+      <w:bookmarkEnd w:id="27"/>
     </w:p>
     <w:p>
       <w:pPr>
@@ -1867,15 +2097,7 @@
         <w:contextualSpacing w:val="0"/>
       </w:pPr>
       <w:r>
-        <w:t xml:space="preserve">Iframe y configuración básica del proyecto: estructura del proyecto Django, primera versión del botón flotante y la vista </w:t>
-      </w:r>
-      <w:proofErr w:type="spellStart"/>
-      <w:r>
-        <w:t>incrustable</w:t>
-      </w:r>
-      <w:proofErr w:type="spellEnd"/>
-      <w:r>
-        <w:t>.</w:t>
+        <w:t>Iframe y configuración básica del proyecto: estructura del proyecto Django, primera versión del botón flotante y la vista incrustable.</w:t>
       </w:r>
     </w:p>
     <w:p>
@@ -1938,12 +2160,11 @@
       <w:pPr>
         <w:pStyle w:val="Ttulo1"/>
       </w:pPr>
-      <w:bookmarkStart w:id="24" w:name="_Toc239929638"/>
-      <w:r>
-        <w:lastRenderedPageBreak/>
+      <w:bookmarkStart w:id="28" w:name="_Toc241222038"/>
+      <w:r>
         <w:t>Próximos pasos posibles</w:t>
       </w:r>
-      <w:bookmarkEnd w:id="24"/>
+      <w:bookmarkEnd w:id="28"/>
     </w:p>
     <w:p>
       <w:pPr>
@@ -1956,7 +2177,13 @@
         <w:contextualSpacing w:val="0"/>
       </w:pPr>
       <w:r>
-        <w:t>Migración a otro tipo de base de datos, sustituyendo SQLite por un motor apto para producción como PostgreSQL.</w:t>
+        <w:t xml:space="preserve">Migración a otro tipo de base de datos, sustituyendo SQLite por un motor apto para producción como </w:t>
+      </w:r>
+      <w:r>
+        <w:t>MySQL</w:t>
+      </w:r>
+      <w:r>
+        <w:t>.</w:t>
       </w:r>
     </w:p>
     <w:p>
@@ -2016,34 +2243,41 @@
       </w:r>
     </w:p>
     <w:p>
+      <w:r>
+        <w:br w:type="page"/>
+      </w:r>
+    </w:p>
+    <w:p>
       <w:pPr>
         <w:pStyle w:val="Ttulo1"/>
       </w:pPr>
-      <w:bookmarkStart w:id="25" w:name="_Toc239929639"/>
-      <w:r>
+      <w:bookmarkStart w:id="29" w:name="_Toc241222039"/>
+      <w:r>
+        <w:lastRenderedPageBreak/>
         <w:t>Glosario</w:t>
       </w:r>
-      <w:bookmarkEnd w:id="25"/>
+      <w:bookmarkEnd w:id="29"/>
     </w:p>
     <w:tbl>
       <w:tblPr>
         <w:tblStyle w:val="Tablanormal2"/>
-        <w:tblW w:w="8789" w:type="dxa"/>
+        <w:tblW w:w="8803" w:type="dxa"/>
         <w:tblInd w:w="-142" w:type="dxa"/>
         <w:tblLook w:val="04A0" w:firstRow="1" w:lastRow="0" w:firstColumn="1" w:lastColumn="0" w:noHBand="0" w:noVBand="1"/>
       </w:tblPr>
       <w:tblGrid>
-        <w:gridCol w:w="2642"/>
-        <w:gridCol w:w="6147"/>
+        <w:gridCol w:w="2646"/>
+        <w:gridCol w:w="6157"/>
       </w:tblGrid>
       <w:tr>
         <w:trPr>
           <w:cnfStyle w:val="100000000000" w:firstRow="1" w:lastRow="0" w:firstColumn="0" w:lastColumn="0" w:oddVBand="0" w:evenVBand="0" w:oddHBand="0" w:evenHBand="0" w:firstRowFirstColumn="0" w:firstRowLastColumn="0" w:lastRowFirstColumn="0" w:lastRowLastColumn="0"/>
+          <w:trHeight w:val="341"/>
         </w:trPr>
         <w:tc>
           <w:tcPr>
             <w:cnfStyle w:val="001000000000" w:firstRow="0" w:lastRow="0" w:firstColumn="1" w:lastColumn="0" w:oddVBand="0" w:evenVBand="0" w:oddHBand="0" w:evenHBand="0" w:firstRowFirstColumn="0" w:firstRowLastColumn="0" w:lastRowFirstColumn="0" w:lastRowLastColumn="0"/>
-            <w:tcW w:w="2642" w:type="dxa"/>
+            <w:tcW w:w="2646" w:type="dxa"/>
             <w:vAlign w:val="center"/>
           </w:tcPr>
           <w:p>
@@ -2057,7 +2291,7 @@
         </w:tc>
         <w:tc>
           <w:tcPr>
-            <w:tcW w:w="6147" w:type="dxa"/>
+            <w:tcW w:w="6157" w:type="dxa"/>
             <w:vAlign w:val="center"/>
           </w:tcPr>
           <w:p>
@@ -2074,11 +2308,12 @@
       <w:tr>
         <w:trPr>
           <w:cnfStyle w:val="000000100000" w:firstRow="0" w:lastRow="0" w:firstColumn="0" w:lastColumn="0" w:oddVBand="0" w:evenVBand="0" w:oddHBand="1" w:evenHBand="0" w:firstRowFirstColumn="0" w:firstRowLastColumn="0" w:lastRowFirstColumn="0" w:lastRowLastColumn="0"/>
+          <w:trHeight w:val="893"/>
         </w:trPr>
         <w:tc>
           <w:tcPr>
             <w:cnfStyle w:val="001000000000" w:firstRow="0" w:lastRow="0" w:firstColumn="1" w:lastColumn="0" w:oddVBand="0" w:evenVBand="0" w:oddHBand="0" w:evenHBand="0" w:firstRowFirstColumn="0" w:firstRowLastColumn="0" w:lastRowFirstColumn="0" w:lastRowLastColumn="0"/>
-            <w:tcW w:w="2642" w:type="dxa"/>
+            <w:tcW w:w="2646" w:type="dxa"/>
             <w:vAlign w:val="center"/>
           </w:tcPr>
           <w:p>
@@ -2086,29 +2321,41 @@
               <w:jc w:val="center"/>
             </w:pPr>
             <w:r>
-              <w:t>Chatbot</w:t>
+              <w:t>AJAX</w:t>
             </w:r>
           </w:p>
         </w:tc>
         <w:tc>
           <w:tcPr>
-            <w:tcW w:w="6147" w:type="dxa"/>
+            <w:tcW w:w="6157" w:type="dxa"/>
+            <w:vAlign w:val="center"/>
           </w:tcPr>
           <w:p>
             <w:pPr>
               <w:cnfStyle w:val="000000100000" w:firstRow="0" w:lastRow="0" w:firstColumn="0" w:lastColumn="0" w:oddVBand="0" w:evenVBand="0" w:oddHBand="1" w:evenHBand="0" w:firstRowFirstColumn="0" w:firstRowLastColumn="0" w:lastRowFirstColumn="0" w:lastRowLastColumn="0"/>
             </w:pPr>
             <w:r>
-              <w:t>Programa capaz de mantener una conversación con una persona simulando lenguaje natural, en este caso mediante reglas y modelos entrenados con spaCy.</w:t>
+              <w:t>Técnica de JavaScript (</w:t>
+            </w:r>
+            <w:proofErr w:type="spellStart"/>
+            <w:r>
+              <w:t>Asynchronous</w:t>
+            </w:r>
+            <w:proofErr w:type="spellEnd"/>
+            <w:r>
+              <w:t xml:space="preserve"> JavaScript And XML) que permite enviar y recibir datos del servidor sin recargar la página; se usa en el widget para enviar cada mensaje del usuario y mostrar la respuesta del chatbot en tiempo real.</w:t>
             </w:r>
           </w:p>
         </w:tc>
       </w:tr>
       <w:tr>
+        <w:trPr>
+          <w:trHeight w:val="579"/>
+        </w:trPr>
         <w:tc>
           <w:tcPr>
             <w:cnfStyle w:val="001000000000" w:firstRow="0" w:lastRow="0" w:firstColumn="1" w:lastColumn="0" w:oddVBand="0" w:evenVBand="0" w:oddHBand="0" w:evenHBand="0" w:firstRowFirstColumn="0" w:firstRowLastColumn="0" w:lastRowFirstColumn="0" w:lastRowLastColumn="0"/>
-            <w:tcW w:w="2642" w:type="dxa"/>
+            <w:tcW w:w="2646" w:type="dxa"/>
             <w:vAlign w:val="center"/>
           </w:tcPr>
           <w:p>
@@ -2116,20 +2363,21 @@
               <w:jc w:val="center"/>
             </w:pPr>
             <w:r>
-              <w:t>Corpus</w:t>
+              <w:t>Llama3.2</w:t>
             </w:r>
           </w:p>
         </w:tc>
         <w:tc>
           <w:tcPr>
-            <w:tcW w:w="6147" w:type="dxa"/>
+            <w:tcW w:w="6157" w:type="dxa"/>
+            <w:vAlign w:val="center"/>
           </w:tcPr>
           <w:p>
             <w:pPr>
               <w:cnfStyle w:val="000000000000" w:firstRow="0" w:lastRow="0" w:firstColumn="0" w:lastColumn="0" w:oddVBand="0" w:evenVBand="0" w:oddHBand="0" w:evenHBand="0" w:firstRowFirstColumn="0" w:firstRowLastColumn="0" w:lastRowFirstColumn="0" w:lastRowLastColumn="0"/>
             </w:pPr>
             <w:r>
-              <w:t>Conjunto de textos de ejemplo (frases de clientes, preguntas frecuentes, etc.) que se usa para entrenar o evaluar el modelo de spaCy.</w:t>
+              <w:t>Modelo de lenguaje (LLM) de Meta, servido en local mediante Ollama, que el chatbot usa para generar las respuestas en lenguaje natural.</w:t>
             </w:r>
           </w:p>
         </w:tc>
@@ -2137,161 +2385,12 @@
       <w:tr>
         <w:trPr>
           <w:cnfStyle w:val="000000100000" w:firstRow="0" w:lastRow="0" w:firstColumn="0" w:lastColumn="0" w:oddVBand="0" w:evenVBand="0" w:oddHBand="1" w:evenHBand="0" w:firstRowFirstColumn="0" w:firstRowLastColumn="0" w:lastRowFirstColumn="0" w:lastRowLastColumn="0"/>
+          <w:trHeight w:val="1054"/>
         </w:trPr>
         <w:tc>
           <w:tcPr>
             <w:cnfStyle w:val="001000000000" w:firstRow="0" w:lastRow="0" w:firstColumn="1" w:lastColumn="0" w:oddVBand="0" w:evenVBand="0" w:oddHBand="0" w:evenHBand="0" w:firstRowFirstColumn="0" w:firstRowLastColumn="0" w:lastRowFirstColumn="0" w:lastRowLastColumn="0"/>
-            <w:tcW w:w="2642" w:type="dxa"/>
-            <w:vAlign w:val="center"/>
-          </w:tcPr>
-          <w:p>
-            <w:pPr>
-              <w:jc w:val="center"/>
-            </w:pPr>
-            <w:r>
-              <w:t>Entidad (NER)</w:t>
-            </w:r>
-          </w:p>
-        </w:tc>
-        <w:tc>
-          <w:tcPr>
-            <w:tcW w:w="6147" w:type="dxa"/>
-          </w:tcPr>
-          <w:p>
-            <w:pPr>
-              <w:cnfStyle w:val="000000100000" w:firstRow="0" w:lastRow="0" w:firstColumn="0" w:lastColumn="0" w:oddVBand="0" w:evenVBand="0" w:oddHBand="1" w:evenHBand="0" w:firstRowFirstColumn="0" w:firstRowLastColumn="0" w:lastRowFirstColumn="0" w:lastRowLastColumn="0"/>
-            </w:pPr>
-            <w:r>
-              <w:t>Elemento concreto que se extrae de un texto (un servicio, una fecha, un nombre de producto). El reconocimiento de entidades nombradas (</w:t>
-            </w:r>
-            <w:proofErr w:type="spellStart"/>
-            <w:r>
-              <w:t>Named</w:t>
-            </w:r>
-            <w:proofErr w:type="spellEnd"/>
-            <w:r>
-              <w:t xml:space="preserve"> </w:t>
-            </w:r>
-            <w:proofErr w:type="spellStart"/>
-            <w:r>
-              <w:t>Entity</w:t>
-            </w:r>
-            <w:proofErr w:type="spellEnd"/>
-            <w:r>
-              <w:t xml:space="preserve"> </w:t>
-            </w:r>
-            <w:proofErr w:type="spellStart"/>
-            <w:r>
-              <w:t>Recognition</w:t>
-            </w:r>
-            <w:proofErr w:type="spellEnd"/>
-            <w:r>
-              <w:t>) es la tarea de spaCy que las identifica.</w:t>
-            </w:r>
-          </w:p>
-        </w:tc>
-      </w:tr>
-      <w:tr>
-        <w:tc>
-          <w:tcPr>
-            <w:cnfStyle w:val="001000000000" w:firstRow="0" w:lastRow="0" w:firstColumn="1" w:lastColumn="0" w:oddVBand="0" w:evenVBand="0" w:oddHBand="0" w:evenHBand="0" w:firstRowFirstColumn="0" w:firstRowLastColumn="0" w:lastRowFirstColumn="0" w:lastRowLastColumn="0"/>
-            <w:tcW w:w="2642" w:type="dxa"/>
-            <w:vAlign w:val="center"/>
-          </w:tcPr>
-          <w:p>
-            <w:pPr>
-              <w:jc w:val="center"/>
-            </w:pPr>
-            <w:r>
-              <w:t>Iframe</w:t>
-            </w:r>
-          </w:p>
-        </w:tc>
-        <w:tc>
-          <w:tcPr>
-            <w:tcW w:w="6147" w:type="dxa"/>
-          </w:tcPr>
-          <w:p>
-            <w:pPr>
-              <w:cnfStyle w:val="000000000000" w:firstRow="0" w:lastRow="0" w:firstColumn="0" w:lastColumn="0" w:oddVBand="0" w:evenVBand="0" w:oddHBand="0" w:evenHBand="0" w:firstRowFirstColumn="0" w:firstRowLastColumn="0" w:lastRowFirstColumn="0" w:lastRowLastColumn="0"/>
-            </w:pPr>
-            <w:r>
-              <w:t>Elemento HTML que permite incrustar una página (en este caso, el chat de Django) dentro de otra página web, la del cliente, manteniendo el contenido aislado.</w:t>
-            </w:r>
-          </w:p>
-        </w:tc>
-      </w:tr>
-      <w:tr>
-        <w:trPr>
-          <w:cnfStyle w:val="000000100000" w:firstRow="0" w:lastRow="0" w:firstColumn="0" w:lastColumn="0" w:oddVBand="0" w:evenVBand="0" w:oddHBand="1" w:evenHBand="0" w:firstRowFirstColumn="0" w:firstRowLastColumn="0" w:lastRowFirstColumn="0" w:lastRowLastColumn="0"/>
-        </w:trPr>
-        <w:tc>
-          <w:tcPr>
-            <w:cnfStyle w:val="001000000000" w:firstRow="0" w:lastRow="0" w:firstColumn="1" w:lastColumn="0" w:oddVBand="0" w:evenVBand="0" w:oddHBand="0" w:evenHBand="0" w:firstRowFirstColumn="0" w:firstRowLastColumn="0" w:lastRowFirstColumn="0" w:lastRowLastColumn="0"/>
-            <w:tcW w:w="2642" w:type="dxa"/>
-            <w:vAlign w:val="center"/>
-          </w:tcPr>
-          <w:p>
-            <w:pPr>
-              <w:jc w:val="center"/>
-            </w:pPr>
-            <w:r>
-              <w:t>NLP (Procesamiento del Lenguaje Natural)</w:t>
-            </w:r>
-          </w:p>
-        </w:tc>
-        <w:tc>
-          <w:tcPr>
-            <w:tcW w:w="6147" w:type="dxa"/>
-          </w:tcPr>
-          <w:p>
-            <w:pPr>
-              <w:cnfStyle w:val="000000100000" w:firstRow="0" w:lastRow="0" w:firstColumn="0" w:lastColumn="0" w:oddVBand="0" w:evenVBand="0" w:oddHBand="1" w:evenHBand="0" w:firstRowFirstColumn="0" w:firstRowLastColumn="0" w:lastRowFirstColumn="0" w:lastRowLastColumn="0"/>
-            </w:pPr>
-            <w:r>
-              <w:t>Campo de la inteligencia artificial dedicado a que los ordenadores comprendan, interpreten y generen lenguaje humano.</w:t>
-            </w:r>
-          </w:p>
-        </w:tc>
-      </w:tr>
-      <w:tr>
-        <w:tc>
-          <w:tcPr>
-            <w:cnfStyle w:val="001000000000" w:firstRow="0" w:lastRow="0" w:firstColumn="1" w:lastColumn="0" w:oddVBand="0" w:evenVBand="0" w:oddHBand="0" w:evenHBand="0" w:firstRowFirstColumn="0" w:firstRowLastColumn="0" w:lastRowFirstColumn="0" w:lastRowLastColumn="0"/>
-            <w:tcW w:w="2642" w:type="dxa"/>
-            <w:vAlign w:val="center"/>
-          </w:tcPr>
-          <w:p>
-            <w:pPr>
-              <w:jc w:val="center"/>
-            </w:pPr>
-            <w:r>
-              <w:t>Pipeline (spaCy)</w:t>
-            </w:r>
-          </w:p>
-        </w:tc>
-        <w:tc>
-          <w:tcPr>
-            <w:tcW w:w="6147" w:type="dxa"/>
-          </w:tcPr>
-          <w:p>
-            <w:pPr>
-              <w:cnfStyle w:val="000000000000" w:firstRow="0" w:lastRow="0" w:firstColumn="0" w:lastColumn="0" w:oddVBand="0" w:evenVBand="0" w:oddHBand="0" w:evenHBand="0" w:firstRowFirstColumn="0" w:firstRowLastColumn="0" w:lastRowFirstColumn="0" w:lastRowLastColumn="0"/>
-            </w:pPr>
-            <w:r>
-              <w:t>Secuencia de componentes (tokenizador, etiquetador, NER, clasificador de texto...) por los que pasa un texto al ser procesado por spaCy.</w:t>
-            </w:r>
-          </w:p>
-        </w:tc>
-      </w:tr>
-      <w:tr>
-        <w:trPr>
-          <w:cnfStyle w:val="000000100000" w:firstRow="0" w:lastRow="0" w:firstColumn="0" w:lastColumn="0" w:oddVBand="0" w:evenVBand="0" w:oddHBand="1" w:evenHBand="0" w:firstRowFirstColumn="0" w:firstRowLastColumn="0" w:lastRowFirstColumn="0" w:lastRowLastColumn="0"/>
-        </w:trPr>
-        <w:tc>
-          <w:tcPr>
-            <w:cnfStyle w:val="001000000000" w:firstRow="0" w:lastRow="0" w:firstColumn="1" w:lastColumn="0" w:oddVBand="0" w:evenVBand="0" w:oddHBand="0" w:evenHBand="0" w:firstRowFirstColumn="0" w:firstRowLastColumn="0" w:lastRowFirstColumn="0" w:lastRowLastColumn="0"/>
-            <w:tcW w:w="2642" w:type="dxa"/>
+            <w:tcW w:w="2646" w:type="dxa"/>
             <w:vAlign w:val="center"/>
           </w:tcPr>
           <w:p>
@@ -2300,38 +2399,34 @@
             </w:pPr>
             <w:proofErr w:type="spellStart"/>
             <w:r>
-              <w:t>postMessage</w:t>
+              <w:t>Mixin</w:t>
             </w:r>
             <w:proofErr w:type="spellEnd"/>
           </w:p>
         </w:tc>
         <w:tc>
           <w:tcPr>
-            <w:tcW w:w="6147" w:type="dxa"/>
+            <w:tcW w:w="6157" w:type="dxa"/>
+            <w:vAlign w:val="center"/>
           </w:tcPr>
           <w:p>
             <w:pPr>
               <w:cnfStyle w:val="000000100000" w:firstRow="0" w:lastRow="0" w:firstColumn="0" w:lastColumn="0" w:oddVBand="0" w:evenVBand="0" w:oddHBand="1" w:evenHBand="0" w:firstRowFirstColumn="0" w:firstRowLastColumn="0" w:lastRowFirstColumn="0" w:lastRowLastColumn="0"/>
             </w:pPr>
             <w:r>
-              <w:t xml:space="preserve">API de JavaScript que permite que la página del cliente y el contenido del iframe se envíen mensajes entre sí de forma segura, por </w:t>
-            </w:r>
-            <w:proofErr w:type="gramStart"/>
-            <w:r>
-              <w:t>ejemplo</w:t>
-            </w:r>
-            <w:proofErr w:type="gramEnd"/>
-            <w:r>
-              <w:t xml:space="preserve"> para avisar de que el chat se ha abierto o cerrado.</w:t>
+              <w:t>Clase reutilizable de Django que añade una comprobación común a varias vistas sin duplicar código; en este proyecto se usa para verificar que el dominio que solicita el iframe está en DOMINIOS_PERMITIDOS antes de servir la vista.</w:t>
             </w:r>
           </w:p>
         </w:tc>
       </w:tr>
       <w:tr>
+        <w:trPr>
+          <w:trHeight w:val="831"/>
+        </w:trPr>
         <w:tc>
           <w:tcPr>
             <w:cnfStyle w:val="001000000000" w:firstRow="0" w:lastRow="0" w:firstColumn="1" w:lastColumn="0" w:oddVBand="0" w:evenVBand="0" w:oddHBand="0" w:evenHBand="0" w:firstRowFirstColumn="0" w:firstRowLastColumn="0" w:lastRowFirstColumn="0" w:lastRowLastColumn="0"/>
-            <w:tcW w:w="2642" w:type="dxa"/>
+            <w:tcW w:w="2646" w:type="dxa"/>
             <w:vAlign w:val="center"/>
           </w:tcPr>
           <w:p>
@@ -2339,20 +2434,45 @@
               <w:jc w:val="center"/>
             </w:pPr>
             <w:r>
-              <w:t>SQLite</w:t>
+              <w:t>LLM</w:t>
             </w:r>
           </w:p>
         </w:tc>
         <w:tc>
           <w:tcPr>
-            <w:tcW w:w="6147" w:type="dxa"/>
+            <w:tcW w:w="6157" w:type="dxa"/>
+            <w:vAlign w:val="center"/>
           </w:tcPr>
           <w:p>
             <w:pPr>
               <w:cnfStyle w:val="000000000000" w:firstRow="0" w:lastRow="0" w:firstColumn="0" w:lastColumn="0" w:oddVBand="0" w:evenVBand="0" w:oddHBand="0" w:evenHBand="0" w:firstRowFirstColumn="0" w:firstRowLastColumn="0" w:lastRowFirstColumn="0" w:lastRowLastColumn="0"/>
             </w:pPr>
             <w:r>
-              <w:t>Sistema de base de datos ligero basado en un único fichero, usado por defecto en Django durante el desarrollo por no requerir un servidor de base de datos independiente.</w:t>
+              <w:t>Modelo de Lenguaje Grande (</w:t>
+            </w:r>
+            <w:proofErr w:type="spellStart"/>
+            <w:r>
+              <w:t>Large</w:t>
+            </w:r>
+            <w:proofErr w:type="spellEnd"/>
+            <w:r>
+              <w:t xml:space="preserve"> </w:t>
+            </w:r>
+            <w:proofErr w:type="spellStart"/>
+            <w:r>
+              <w:t>Language</w:t>
+            </w:r>
+            <w:proofErr w:type="spellEnd"/>
+            <w:r>
+              <w:t xml:space="preserve"> </w:t>
+            </w:r>
+            <w:proofErr w:type="spellStart"/>
+            <w:r>
+              <w:t>Model</w:t>
+            </w:r>
+            <w:proofErr w:type="spellEnd"/>
+            <w:r>
+              <w:t>), un tipo de modelo de inteligencia artificial entrenado con grandes cantidades de texto para comprender y generar lenguaje natural</w:t>
             </w:r>
           </w:p>
         </w:tc>
@@ -2360,11 +2480,12 @@
       <w:tr>
         <w:trPr>
           <w:cnfStyle w:val="000000100000" w:firstRow="0" w:lastRow="0" w:firstColumn="0" w:lastColumn="0" w:oddVBand="0" w:evenVBand="0" w:oddHBand="1" w:evenHBand="0" w:firstRowFirstColumn="0" w:firstRowLastColumn="0" w:lastRowFirstColumn="0" w:lastRowLastColumn="0"/>
+          <w:trHeight w:val="816"/>
         </w:trPr>
         <w:tc>
           <w:tcPr>
             <w:cnfStyle w:val="001000000000" w:firstRow="0" w:lastRow="0" w:firstColumn="1" w:lastColumn="0" w:oddVBand="0" w:evenVBand="0" w:oddHBand="0" w:evenHBand="0" w:firstRowFirstColumn="0" w:firstRowLastColumn="0" w:lastRowFirstColumn="0" w:lastRowLastColumn="0"/>
-            <w:tcW w:w="2642" w:type="dxa"/>
+            <w:tcW w:w="2646" w:type="dxa"/>
             <w:vAlign w:val="center"/>
           </w:tcPr>
           <w:p>
@@ -2372,29 +2493,33 @@
               <w:jc w:val="center"/>
             </w:pPr>
             <w:r>
-              <w:t>Textcat (clasificador de texto)</w:t>
+              <w:t>Chatbot</w:t>
             </w:r>
           </w:p>
         </w:tc>
         <w:tc>
           <w:tcPr>
-            <w:tcW w:w="6147" w:type="dxa"/>
+            <w:tcW w:w="6157" w:type="dxa"/>
+            <w:vAlign w:val="center"/>
           </w:tcPr>
           <w:p>
             <w:pPr>
               <w:cnfStyle w:val="000000100000" w:firstRow="0" w:lastRow="0" w:firstColumn="0" w:lastColumn="0" w:oddVBand="0" w:evenVBand="0" w:oddHBand="1" w:evenHBand="0" w:firstRowFirstColumn="0" w:firstRowLastColumn="0" w:lastRowFirstColumn="0" w:lastRowLastColumn="0"/>
             </w:pPr>
             <w:r>
-              <w:t>Componente de spaCy que asigna una o varias categorías predefinidas a un texto; en este proyecto se usa para distinguir entre consulta técnica y compra.</w:t>
+              <w:t>Programa capaz de mantener una conversación con una persona simulando lenguaje natural, en este caso mediante reglas y modelos entrenados con spaCy.</w:t>
             </w:r>
           </w:p>
         </w:tc>
       </w:tr>
       <w:tr>
+        <w:trPr>
+          <w:trHeight w:val="579"/>
+        </w:trPr>
         <w:tc>
           <w:tcPr>
             <w:cnfStyle w:val="001000000000" w:firstRow="0" w:lastRow="0" w:firstColumn="1" w:lastColumn="0" w:oddVBand="0" w:evenVBand="0" w:oddHBand="0" w:evenHBand="0" w:firstRowFirstColumn="0" w:firstRowLastColumn="0" w:lastRowFirstColumn="0" w:lastRowLastColumn="0"/>
-            <w:tcW w:w="2642" w:type="dxa"/>
+            <w:tcW w:w="2646" w:type="dxa"/>
             <w:vAlign w:val="center"/>
           </w:tcPr>
           <w:p>
@@ -2402,33 +2527,21 @@
               <w:jc w:val="center"/>
             </w:pPr>
             <w:r>
-              <w:t xml:space="preserve">Token / </w:t>
-            </w:r>
-            <w:proofErr w:type="spellStart"/>
-            <w:r>
-              <w:t>tokenización</w:t>
-            </w:r>
-            <w:proofErr w:type="spellEnd"/>
+              <w:t>Corpus</w:t>
+            </w:r>
           </w:p>
         </w:tc>
         <w:tc>
           <w:tcPr>
-            <w:tcW w:w="6147" w:type="dxa"/>
+            <w:tcW w:w="6157" w:type="dxa"/>
+            <w:vAlign w:val="center"/>
           </w:tcPr>
           <w:p>
             <w:pPr>
               <w:cnfStyle w:val="000000000000" w:firstRow="0" w:lastRow="0" w:firstColumn="0" w:lastColumn="0" w:oddVBand="0" w:evenVBand="0" w:oddHBand="0" w:evenHBand="0" w:firstRowFirstColumn="0" w:firstRowLastColumn="0" w:lastRowFirstColumn="0" w:lastRowLastColumn="0"/>
             </w:pPr>
             <w:r>
-              <w:t xml:space="preserve">Un token es cada unidad mínima (normalmente una palabra o signo) en la que se divide un texto; la </w:t>
-            </w:r>
-            <w:proofErr w:type="spellStart"/>
-            <w:r>
-              <w:t>tokenización</w:t>
-            </w:r>
-            <w:proofErr w:type="spellEnd"/>
-            <w:r>
-              <w:t xml:space="preserve"> es el primer paso de cualquier pipeline de spaCy.</w:t>
+              <w:t>Conjunto de textos de ejemplo (frases de clientes, preguntas frecuentes, etc.) que se usa para entrenar o evaluar el modelo de spaCy.</w:t>
             </w:r>
           </w:p>
         </w:tc>
@@ -2436,11 +2549,12 @@
       <w:tr>
         <w:trPr>
           <w:cnfStyle w:val="000000100000" w:firstRow="0" w:lastRow="0" w:firstColumn="0" w:lastColumn="0" w:oddVBand="0" w:evenVBand="0" w:oddHBand="1" w:evenHBand="0" w:firstRowFirstColumn="0" w:firstRowLastColumn="0" w:lastRowFirstColumn="0" w:lastRowLastColumn="0"/>
+          <w:trHeight w:val="816"/>
         </w:trPr>
         <w:tc>
           <w:tcPr>
             <w:cnfStyle w:val="001000000000" w:firstRow="0" w:lastRow="0" w:firstColumn="1" w:lastColumn="0" w:oddVBand="0" w:evenVBand="0" w:oddHBand="0" w:evenHBand="0" w:firstRowFirstColumn="0" w:firstRowLastColumn="0" w:lastRowFirstColumn="0" w:lastRowLastColumn="0"/>
-            <w:tcW w:w="2642" w:type="dxa"/>
+            <w:tcW w:w="2646" w:type="dxa"/>
             <w:vAlign w:val="center"/>
           </w:tcPr>
           <w:p>
@@ -2448,29 +2562,57 @@
               <w:jc w:val="center"/>
             </w:pPr>
             <w:r>
-              <w:t>Widget</w:t>
+              <w:t>Entidad (NER)</w:t>
             </w:r>
           </w:p>
         </w:tc>
         <w:tc>
           <w:tcPr>
-            <w:tcW w:w="6147" w:type="dxa"/>
+            <w:tcW w:w="6157" w:type="dxa"/>
+            <w:vAlign w:val="center"/>
           </w:tcPr>
           <w:p>
             <w:pPr>
               <w:cnfStyle w:val="000000100000" w:firstRow="0" w:lastRow="0" w:firstColumn="0" w:lastColumn="0" w:oddVBand="0" w:evenVBand="0" w:oddHBand="1" w:evenHBand="0" w:firstRowFirstColumn="0" w:firstRowLastColumn="0" w:lastRowFirstColumn="0" w:lastRowLastColumn="0"/>
             </w:pPr>
             <w:r>
-              <w:t>Componente de interfaz reutilizable y autocontenido -en este caso el chatbot- pensado para insertarse dentro de otra página web sin depender de su diseño.</w:t>
+              <w:t>Elemento concreto que se extrae de un texto (un servicio, una fecha, un nombre de producto). El reconocimiento de entidades nombradas (</w:t>
+            </w:r>
+            <w:proofErr w:type="spellStart"/>
+            <w:r>
+              <w:t>Named</w:t>
+            </w:r>
+            <w:proofErr w:type="spellEnd"/>
+            <w:r>
+              <w:t xml:space="preserve"> </w:t>
+            </w:r>
+            <w:proofErr w:type="spellStart"/>
+            <w:r>
+              <w:t>Entity</w:t>
+            </w:r>
+            <w:proofErr w:type="spellEnd"/>
+            <w:r>
+              <w:t xml:space="preserve"> </w:t>
+            </w:r>
+            <w:proofErr w:type="spellStart"/>
+            <w:r>
+              <w:t>Recognition</w:t>
+            </w:r>
+            <w:proofErr w:type="spellEnd"/>
+            <w:r>
+              <w:t>) es la tarea de spaCy que las identifica.</w:t>
             </w:r>
           </w:p>
         </w:tc>
       </w:tr>
       <w:tr>
+        <w:trPr>
+          <w:trHeight w:val="668"/>
+        </w:trPr>
         <w:tc>
           <w:tcPr>
             <w:cnfStyle w:val="001000000000" w:firstRow="0" w:lastRow="0" w:firstColumn="1" w:lastColumn="0" w:oddVBand="0" w:evenVBand="0" w:oddHBand="0" w:evenHBand="0" w:firstRowFirstColumn="0" w:firstRowLastColumn="0" w:lastRowFirstColumn="0" w:lastRowLastColumn="0"/>
-            <w:tcW w:w="2642" w:type="dxa"/>
+            <w:tcW w:w="2646" w:type="dxa"/>
             <w:vAlign w:val="center"/>
           </w:tcPr>
           <w:p>
@@ -2478,39 +2620,346 @@
               <w:jc w:val="center"/>
             </w:pPr>
             <w:r>
-              <w:t>X-</w:t>
-            </w:r>
+              <w:t>Iframe</w:t>
+            </w:r>
+          </w:p>
+        </w:tc>
+        <w:tc>
+          <w:tcPr>
+            <w:tcW w:w="6157" w:type="dxa"/>
+            <w:vAlign w:val="center"/>
+          </w:tcPr>
+          <w:p>
+            <w:pPr>
+              <w:cnfStyle w:val="000000000000" w:firstRow="0" w:lastRow="0" w:firstColumn="0" w:lastColumn="0" w:oddVBand="0" w:evenVBand="0" w:oddHBand="0" w:evenHBand="0" w:firstRowFirstColumn="0" w:firstRowLastColumn="0" w:lastRowFirstColumn="0" w:lastRowLastColumn="0"/>
+            </w:pPr>
+            <w:r>
+              <w:t>Elemento HTML que permite incrustar una página (en este caso, el chat de Django) dentro de otra página web, la del cliente, manteniendo el contenido aislado.</w:t>
+            </w:r>
+          </w:p>
+        </w:tc>
+      </w:tr>
+      <w:tr>
+        <w:trPr>
+          <w:cnfStyle w:val="000000100000" w:firstRow="0" w:lastRow="0" w:firstColumn="0" w:lastColumn="0" w:oddVBand="0" w:evenVBand="0" w:oddHBand="1" w:evenHBand="0" w:firstRowFirstColumn="0" w:firstRowLastColumn="0" w:lastRowFirstColumn="0" w:lastRowLastColumn="0"/>
+          <w:trHeight w:val="579"/>
+        </w:trPr>
+        <w:tc>
+          <w:tcPr>
+            <w:cnfStyle w:val="001000000000" w:firstRow="0" w:lastRow="0" w:firstColumn="1" w:lastColumn="0" w:oddVBand="0" w:evenVBand="0" w:oddHBand="0" w:evenHBand="0" w:firstRowFirstColumn="0" w:firstRowLastColumn="0" w:lastRowFirstColumn="0" w:lastRowLastColumn="0"/>
+            <w:tcW w:w="2646" w:type="dxa"/>
+            <w:vAlign w:val="center"/>
+          </w:tcPr>
+          <w:p>
+            <w:pPr>
+              <w:jc w:val="center"/>
+            </w:pPr>
+            <w:r>
+              <w:t>NLP (Procesamiento del Lenguaje Natural)</w:t>
+            </w:r>
+          </w:p>
+        </w:tc>
+        <w:tc>
+          <w:tcPr>
+            <w:tcW w:w="6157" w:type="dxa"/>
+            <w:vAlign w:val="center"/>
+          </w:tcPr>
+          <w:p>
+            <w:pPr>
+              <w:cnfStyle w:val="000000100000" w:firstRow="0" w:lastRow="0" w:firstColumn="0" w:lastColumn="0" w:oddVBand="0" w:evenVBand="0" w:oddHBand="1" w:evenHBand="0" w:firstRowFirstColumn="0" w:firstRowLastColumn="0" w:lastRowFirstColumn="0" w:lastRowLastColumn="0"/>
+            </w:pPr>
+            <w:r>
+              <w:t>Campo de la inteligencia artificial dedicado a que los ordenadores comprendan, interpreten y generen lenguaje humano.</w:t>
+            </w:r>
+          </w:p>
+        </w:tc>
+      </w:tr>
+      <w:tr>
+        <w:trPr>
+          <w:trHeight w:val="579"/>
+        </w:trPr>
+        <w:tc>
+          <w:tcPr>
+            <w:cnfStyle w:val="001000000000" w:firstRow="0" w:lastRow="0" w:firstColumn="1" w:lastColumn="0" w:oddVBand="0" w:evenVBand="0" w:oddHBand="0" w:evenHBand="0" w:firstRowFirstColumn="0" w:firstRowLastColumn="0" w:lastRowFirstColumn="0" w:lastRowLastColumn="0"/>
+            <w:tcW w:w="2646" w:type="dxa"/>
+            <w:vAlign w:val="center"/>
+          </w:tcPr>
+          <w:p>
+            <w:pPr>
+              <w:jc w:val="center"/>
+            </w:pPr>
+            <w:r>
+              <w:t>Pipeline (spaCy)</w:t>
+            </w:r>
+          </w:p>
+        </w:tc>
+        <w:tc>
+          <w:tcPr>
+            <w:tcW w:w="6157" w:type="dxa"/>
+            <w:vAlign w:val="center"/>
+          </w:tcPr>
+          <w:p>
+            <w:pPr>
+              <w:cnfStyle w:val="000000000000" w:firstRow="0" w:lastRow="0" w:firstColumn="0" w:lastColumn="0" w:oddVBand="0" w:evenVBand="0" w:oddHBand="0" w:evenHBand="0" w:firstRowFirstColumn="0" w:firstRowLastColumn="0" w:lastRowFirstColumn="0" w:lastRowLastColumn="0"/>
+            </w:pPr>
+            <w:r>
+              <w:t>Secuencia de componentes (tokenizador, etiquetador, NER, clasificador de texto...) por los que pasa un texto al ser procesado por spaCy.</w:t>
+            </w:r>
+          </w:p>
+        </w:tc>
+      </w:tr>
+      <w:tr>
+        <w:trPr>
+          <w:cnfStyle w:val="000000100000" w:firstRow="0" w:lastRow="0" w:firstColumn="0" w:lastColumn="0" w:oddVBand="0" w:evenVBand="0" w:oddHBand="1" w:evenHBand="0" w:firstRowFirstColumn="0" w:firstRowLastColumn="0" w:lastRowFirstColumn="0" w:lastRowLastColumn="0"/>
+          <w:trHeight w:val="816"/>
+        </w:trPr>
+        <w:tc>
+          <w:tcPr>
+            <w:cnfStyle w:val="001000000000" w:firstRow="0" w:lastRow="0" w:firstColumn="1" w:lastColumn="0" w:oddVBand="0" w:evenVBand="0" w:oddHBand="0" w:evenHBand="0" w:firstRowFirstColumn="0" w:firstRowLastColumn="0" w:lastRowFirstColumn="0" w:lastRowLastColumn="0"/>
+            <w:tcW w:w="2646" w:type="dxa"/>
+            <w:vAlign w:val="center"/>
+          </w:tcPr>
+          <w:p>
+            <w:pPr>
+              <w:jc w:val="center"/>
+            </w:pPr>
             <w:proofErr w:type="spellStart"/>
             <w:r>
-              <w:t>Frame</w:t>
-            </w:r>
-            <w:proofErr w:type="spellEnd"/>
-            <w:r>
-              <w:t>-</w:t>
-            </w:r>
-            <w:proofErr w:type="spellStart"/>
-            <w:r>
-              <w:t>Options</w:t>
+              <w:t>postMessage</w:t>
             </w:r>
             <w:proofErr w:type="spellEnd"/>
           </w:p>
         </w:tc>
         <w:tc>
           <w:tcPr>
-            <w:tcW w:w="6147" w:type="dxa"/>
+            <w:tcW w:w="6157" w:type="dxa"/>
+            <w:vAlign w:val="center"/>
+          </w:tcPr>
+          <w:p>
+            <w:pPr>
+              <w:cnfStyle w:val="000000100000" w:firstRow="0" w:lastRow="0" w:firstColumn="0" w:lastColumn="0" w:oddVBand="0" w:evenVBand="0" w:oddHBand="1" w:evenHBand="0" w:firstRowFirstColumn="0" w:firstRowLastColumn="0" w:lastRowFirstColumn="0" w:lastRowLastColumn="0"/>
+            </w:pPr>
+            <w:r>
+              <w:t xml:space="preserve">API de JavaScript que permite que la página del cliente y el contenido del iframe se envíen mensajes entre sí de forma segura, por </w:t>
+            </w:r>
+            <w:proofErr w:type="gramStart"/>
+            <w:r>
+              <w:t>ejemplo</w:t>
+            </w:r>
+            <w:proofErr w:type="gramEnd"/>
+            <w:r>
+              <w:t xml:space="preserve"> para avisar de que el chat se ha abierto o cerrado.</w:t>
+            </w:r>
+          </w:p>
+        </w:tc>
+      </w:tr>
+      <w:tr>
+        <w:trPr>
+          <w:trHeight w:val="816"/>
+        </w:trPr>
+        <w:tc>
+          <w:tcPr>
+            <w:cnfStyle w:val="001000000000" w:firstRow="0" w:lastRow="0" w:firstColumn="1" w:lastColumn="0" w:oddVBand="0" w:evenVBand="0" w:oddHBand="0" w:evenHBand="0" w:firstRowFirstColumn="0" w:firstRowLastColumn="0" w:lastRowFirstColumn="0" w:lastRowLastColumn="0"/>
+            <w:tcW w:w="2646" w:type="dxa"/>
+            <w:vAlign w:val="center"/>
+          </w:tcPr>
+          <w:p>
+            <w:pPr>
+              <w:jc w:val="center"/>
+            </w:pPr>
+            <w:r>
+              <w:t>SQLite</w:t>
+            </w:r>
+          </w:p>
+        </w:tc>
+        <w:tc>
+          <w:tcPr>
+            <w:tcW w:w="6157" w:type="dxa"/>
+            <w:vAlign w:val="center"/>
           </w:tcPr>
           <w:p>
             <w:pPr>
               <w:cnfStyle w:val="000000000000" w:firstRow="0" w:lastRow="0" w:firstColumn="0" w:lastColumn="0" w:oddVBand="0" w:evenVBand="0" w:oddHBand="0" w:evenHBand="0" w:firstRowFirstColumn="0" w:firstRowLastColumn="0" w:lastRowFirstColumn="0" w:lastRowLastColumn="0"/>
             </w:pPr>
             <w:r>
+              <w:t>Sistema de base de datos ligero basado en un único fichero, usado por defecto en Django durante el desarrollo por no requerir un servidor de base de datos independiente.</w:t>
+            </w:r>
+          </w:p>
+        </w:tc>
+      </w:tr>
+      <w:tr>
+        <w:trPr>
+          <w:cnfStyle w:val="000000100000" w:firstRow="0" w:lastRow="0" w:firstColumn="0" w:lastColumn="0" w:oddVBand="0" w:evenVBand="0" w:oddHBand="1" w:evenHBand="0" w:firstRowFirstColumn="0" w:firstRowLastColumn="0" w:lastRowFirstColumn="0" w:lastRowLastColumn="0"/>
+          <w:trHeight w:val="816"/>
+        </w:trPr>
+        <w:tc>
+          <w:tcPr>
+            <w:cnfStyle w:val="001000000000" w:firstRow="0" w:lastRow="0" w:firstColumn="1" w:lastColumn="0" w:oddVBand="0" w:evenVBand="0" w:oddHBand="0" w:evenHBand="0" w:firstRowFirstColumn="0" w:firstRowLastColumn="0" w:lastRowFirstColumn="0" w:lastRowLastColumn="0"/>
+            <w:tcW w:w="2646" w:type="dxa"/>
+            <w:vAlign w:val="center"/>
+          </w:tcPr>
+          <w:p>
+            <w:pPr>
+              <w:jc w:val="center"/>
+            </w:pPr>
+            <w:r>
+              <w:t>Textcat (clasificador de texto)</w:t>
+            </w:r>
+          </w:p>
+        </w:tc>
+        <w:tc>
+          <w:tcPr>
+            <w:tcW w:w="6157" w:type="dxa"/>
+            <w:vAlign w:val="center"/>
+          </w:tcPr>
+          <w:p>
+            <w:pPr>
+              <w:cnfStyle w:val="000000100000" w:firstRow="0" w:lastRow="0" w:firstColumn="0" w:lastColumn="0" w:oddVBand="0" w:evenVBand="0" w:oddHBand="1" w:evenHBand="0" w:firstRowFirstColumn="0" w:firstRowLastColumn="0" w:lastRowFirstColumn="0" w:lastRowLastColumn="0"/>
+            </w:pPr>
+            <w:r>
+              <w:t>Componente de spaCy que asigna una o varias categorías predefinidas a un texto; en este proyecto se usa para distinguir entre consulta técnica y compra.</w:t>
+            </w:r>
+          </w:p>
+        </w:tc>
+      </w:tr>
+      <w:tr>
+        <w:trPr>
+          <w:trHeight w:val="816"/>
+        </w:trPr>
+        <w:tc>
+          <w:tcPr>
+            <w:cnfStyle w:val="001000000000" w:firstRow="0" w:lastRow="0" w:firstColumn="1" w:lastColumn="0" w:oddVBand="0" w:evenVBand="0" w:oddHBand="0" w:evenHBand="0" w:firstRowFirstColumn="0" w:firstRowLastColumn="0" w:lastRowFirstColumn="0" w:lastRowLastColumn="0"/>
+            <w:tcW w:w="2646" w:type="dxa"/>
+            <w:vAlign w:val="center"/>
+          </w:tcPr>
+          <w:p>
+            <w:pPr>
+              <w:jc w:val="center"/>
+            </w:pPr>
+            <w:r>
+              <w:t xml:space="preserve">Token / </w:t>
+            </w:r>
+            <w:proofErr w:type="spellStart"/>
+            <w:r>
+              <w:t>tokenización</w:t>
+            </w:r>
+            <w:proofErr w:type="spellEnd"/>
+          </w:p>
+        </w:tc>
+        <w:tc>
+          <w:tcPr>
+            <w:tcW w:w="6157" w:type="dxa"/>
+            <w:vAlign w:val="center"/>
+          </w:tcPr>
+          <w:p>
+            <w:pPr>
+              <w:cnfStyle w:val="000000000000" w:firstRow="0" w:lastRow="0" w:firstColumn="0" w:lastColumn="0" w:oddVBand="0" w:evenVBand="0" w:oddHBand="0" w:evenHBand="0" w:firstRowFirstColumn="0" w:firstRowLastColumn="0" w:lastRowFirstColumn="0" w:lastRowLastColumn="0"/>
+            </w:pPr>
+            <w:r>
+              <w:t xml:space="preserve">Un token es cada unidad mínima (normalmente una palabra o signo) en la que se divide un texto; la </w:t>
+            </w:r>
+            <w:proofErr w:type="spellStart"/>
+            <w:r>
+              <w:t>tokenización</w:t>
+            </w:r>
+            <w:proofErr w:type="spellEnd"/>
+            <w:r>
+              <w:t xml:space="preserve"> es el primer paso de cualquier pipeline de spaCy.</w:t>
+            </w:r>
+          </w:p>
+        </w:tc>
+      </w:tr>
+      <w:tr>
+        <w:trPr>
+          <w:cnfStyle w:val="000000100000" w:firstRow="0" w:lastRow="0" w:firstColumn="0" w:lastColumn="0" w:oddVBand="0" w:evenVBand="0" w:oddHBand="1" w:evenHBand="0" w:firstRowFirstColumn="0" w:firstRowLastColumn="0" w:lastRowFirstColumn="0" w:lastRowLastColumn="0"/>
+          <w:trHeight w:val="816"/>
+        </w:trPr>
+        <w:tc>
+          <w:tcPr>
+            <w:cnfStyle w:val="001000000000" w:firstRow="0" w:lastRow="0" w:firstColumn="1" w:lastColumn="0" w:oddVBand="0" w:evenVBand="0" w:oddHBand="0" w:evenHBand="0" w:firstRowFirstColumn="0" w:firstRowLastColumn="0" w:lastRowFirstColumn="0" w:lastRowLastColumn="0"/>
+            <w:tcW w:w="2646" w:type="dxa"/>
+            <w:vAlign w:val="center"/>
+          </w:tcPr>
+          <w:p>
+            <w:pPr>
+              <w:jc w:val="center"/>
+            </w:pPr>
+            <w:r>
+              <w:t>Widget</w:t>
+            </w:r>
+          </w:p>
+        </w:tc>
+        <w:tc>
+          <w:tcPr>
+            <w:tcW w:w="6157" w:type="dxa"/>
+            <w:vAlign w:val="center"/>
+          </w:tcPr>
+          <w:p>
+            <w:pPr>
+              <w:cnfStyle w:val="000000100000" w:firstRow="0" w:lastRow="0" w:firstColumn="0" w:lastColumn="0" w:oddVBand="0" w:evenVBand="0" w:oddHBand="1" w:evenHBand="0" w:firstRowFirstColumn="0" w:firstRowLastColumn="0" w:lastRowFirstColumn="0" w:lastRowLastColumn="0"/>
+            </w:pPr>
+            <w:r>
+              <w:t>Componente de interfaz reutilizable y autocontenido -en este caso el chatbot- pensado para insertarse dentro de otra página web sin depender de su diseño.</w:t>
+            </w:r>
+          </w:p>
+        </w:tc>
+      </w:tr>
+      <w:tr>
+        <w:trPr>
+          <w:trHeight w:val="816"/>
+        </w:trPr>
+        <w:tc>
+          <w:tcPr>
+            <w:cnfStyle w:val="001000000000" w:firstRow="0" w:lastRow="0" w:firstColumn="1" w:lastColumn="0" w:oddVBand="0" w:evenVBand="0" w:oddHBand="0" w:evenHBand="0" w:firstRowFirstColumn="0" w:firstRowLastColumn="0" w:lastRowFirstColumn="0" w:lastRowLastColumn="0"/>
+            <w:tcW w:w="2646" w:type="dxa"/>
+            <w:vAlign w:val="center"/>
+          </w:tcPr>
+          <w:p>
+            <w:pPr>
+              <w:jc w:val="center"/>
+            </w:pPr>
+            <w:r>
+              <w:t>X-</w:t>
+            </w:r>
+            <w:proofErr w:type="spellStart"/>
+            <w:r>
+              <w:t>Frame</w:t>
+            </w:r>
+            <w:proofErr w:type="spellEnd"/>
+            <w:r>
+              <w:t>-</w:t>
+            </w:r>
+            <w:proofErr w:type="spellStart"/>
+            <w:r>
+              <w:t>Options</w:t>
+            </w:r>
+            <w:proofErr w:type="spellEnd"/>
+          </w:p>
+        </w:tc>
+        <w:tc>
+          <w:tcPr>
+            <w:tcW w:w="6157" w:type="dxa"/>
+            <w:vAlign w:val="center"/>
+          </w:tcPr>
+          <w:p>
+            <w:pPr>
+              <w:cnfStyle w:val="000000000000" w:firstRow="0" w:lastRow="0" w:firstColumn="0" w:lastColumn="0" w:oddVBand="0" w:evenVBand="0" w:oddHBand="0" w:evenHBand="0" w:firstRowFirstColumn="0" w:firstRowLastColumn="0" w:lastRowFirstColumn="0" w:lastRowLastColumn="0"/>
+            </w:pPr>
+            <w:r>
               <w:t>Cabecera HTTP que controla si una página puede mostrarse dentro de un iframe de otro dominio; Django la activa por defecto y hay que exceptuarla en la vista del widget.</w:t>
             </w:r>
           </w:p>
         </w:tc>
       </w:tr>
     </w:tbl>
-    <w:p/>
+    <w:p>
+      <w:pPr>
+        <w:rPr>
+          <w:sz w:val="2"/>
+          <w:szCs w:val="2"/>
+        </w:rPr>
+      </w:pPr>
+    </w:p>
     <w:sectPr>
       <w:footerReference w:type="default" r:id="rId9"/>
       <w:pgSz w:w="11906" w:h="16838"/>

</xml_diff>